<commit_message>
Updated my name on cover page
</commit_message>
<xml_diff>
--- a/DOCUMENTS/Assessment_2_report.docx
+++ b/DOCUMENTS/Assessment_2_report.docx
@@ -1,6 +1,6 @@
 
 <file path=word/document.xml><?xml version="1.0" encoding="utf-8"?>
-<w:document xmlns:wpc="http://schemas.microsoft.com/office/word/2010/wordprocessingCanvas" xmlns:cx="http://schemas.microsoft.com/office/drawing/2014/chartex" xmlns:cx1="http://schemas.microsoft.com/office/drawing/2015/9/8/chartex" xmlns:cx2="http://schemas.microsoft.com/office/drawing/2015/10/21/chartex" xmlns:cx3="http://schemas.microsoft.com/office/drawing/2016/5/9/chartex" xmlns:cx4="http://schemas.microsoft.com/office/drawing/2016/5/10/chartex" xmlns:cx5="http://schemas.microsoft.com/office/drawing/2016/5/11/chartex" xmlns:cx6="http://schemas.microsoft.com/office/drawing/2016/5/12/chartex" xmlns:cx7="http://schemas.microsoft.com/office/drawing/2016/5/13/chartex" xmlns:cx8="http://schemas.microsoft.com/office/drawing/2016/5/14/chartex" xmlns:mc="http://schemas.openxmlformats.org/markup-compatibility/2006" xmlns:m="http://schemas.openxmlformats.org/officeDocument/2006/math" xmlns:aink="http://schemas.microsoft.com/office/drawing/2016/ink" xmlns:am3d="http://schemas.microsoft.com/office/drawing/2017/model3d" xmlns:oel="http://schemas.microsoft.com/office/2019/extlst" xmlns:r="http://schemas.openxmlformats.org/officeDocument/2006/relationships" xmlns:wp14="http://schemas.microsoft.com/office/word/2010/wordprocessingDrawing" xmlns:wp="http://schemas.openxmlformats.org/drawingml/2006/wordprocessingDrawing" xmlns:wpg="http://schemas.microsoft.com/office/word/2010/wordprocessingGroup" xmlns:wpi="http://schemas.microsoft.com/office/word/2010/wordprocessingInk" xmlns:wps="http://schemas.microsoft.com/office/word/2010/wordprocessingShape" xmlns:o="urn:schemas-microsoft-com:office:office" xmlns:v="urn:schemas-microsoft-com:vml" xmlns:w10="urn:schemas-microsoft-com:office:word" xmlns:w="http://schemas.openxmlformats.org/wordprocessingml/2006/main" xmlns:w14="http://schemas.microsoft.com/office/word/2010/wordml" xmlns:w15="http://schemas.microsoft.com/office/word/2012/wordml" xmlns:w16cex="http://schemas.microsoft.com/office/word/2018/wordml/cex" xmlns:w16cid="http://schemas.microsoft.com/office/word/2016/wordml/cid" xmlns:w16="http://schemas.microsoft.com/office/word/2018/wordml" xmlns:w16sdtdh="http://schemas.microsoft.com/office/word/2020/wordml/sdtdatahash" xmlns:w16sdtfl="http://schemas.microsoft.com/office/word/2024/wordml/sdtformatlock" xmlns:w16se="http://schemas.microsoft.com/office/word/2015/wordml/symex" xmlns:w16du="http://schemas.microsoft.com/office/word/2023/wordml/word16du" xmlns:wne="http://schemas.microsoft.com/office/word/2006/wordml" mc:Ignorable="w14 w15 w16se w16cid w16 w16cex w16sdtdh w16sdtfl w16du wp14">
+<w:document xmlns:wpc="http://schemas.microsoft.com/office/word/2010/wordprocessingCanvas" xmlns:cx="http://schemas.microsoft.com/office/drawing/2014/chartex" xmlns:cx1="http://schemas.microsoft.com/office/drawing/2015/9/8/chartex" xmlns:cx2="http://schemas.microsoft.com/office/drawing/2015/10/21/chartex" xmlns:cx3="http://schemas.microsoft.com/office/drawing/2016/5/9/chartex" xmlns:cx4="http://schemas.microsoft.com/office/drawing/2016/5/10/chartex" xmlns:cx5="http://schemas.microsoft.com/office/drawing/2016/5/11/chartex" xmlns:cx6="http://schemas.microsoft.com/office/drawing/2016/5/12/chartex" xmlns:cx7="http://schemas.microsoft.com/office/drawing/2016/5/13/chartex" xmlns:cx8="http://schemas.microsoft.com/office/drawing/2016/5/14/chartex" xmlns:mc="http://schemas.openxmlformats.org/markup-compatibility/2006" xmlns:aink="http://schemas.microsoft.com/office/drawing/2016/ink" xmlns:am3d="http://schemas.microsoft.com/office/drawing/2017/model3d" xmlns:o="urn:schemas-microsoft-com:office:office" xmlns:oel="http://schemas.microsoft.com/office/2019/extlst" xmlns:r="http://schemas.openxmlformats.org/officeDocument/2006/relationships" xmlns:m="http://schemas.openxmlformats.org/officeDocument/2006/math" xmlns:v="urn:schemas-microsoft-com:vml" xmlns:wp14="http://schemas.microsoft.com/office/word/2010/wordprocessingDrawing" xmlns:wp="http://schemas.openxmlformats.org/drawingml/2006/wordprocessingDrawing" xmlns:w10="urn:schemas-microsoft-com:office:word" xmlns:w="http://schemas.openxmlformats.org/wordprocessingml/2006/main" xmlns:w14="http://schemas.microsoft.com/office/word/2010/wordml" xmlns:w15="http://schemas.microsoft.com/office/word/2012/wordml" xmlns:w16cex="http://schemas.microsoft.com/office/word/2018/wordml/cex" xmlns:w16cid="http://schemas.microsoft.com/office/word/2016/wordml/cid" xmlns:w16="http://schemas.microsoft.com/office/word/2018/wordml" xmlns:w16du="http://schemas.microsoft.com/office/word/2023/wordml/word16du" xmlns:w16sdtdh="http://schemas.microsoft.com/office/word/2020/wordml/sdtdatahash" xmlns:w16sdtfl="http://schemas.microsoft.com/office/word/2024/wordml/sdtformatlock" xmlns:w16se="http://schemas.microsoft.com/office/word/2015/wordml/symex" xmlns:wpg="http://schemas.microsoft.com/office/word/2010/wordprocessingGroup" xmlns:wpi="http://schemas.microsoft.com/office/word/2010/wordprocessingInk" xmlns:wne="http://schemas.microsoft.com/office/word/2006/wordml" xmlns:wps="http://schemas.microsoft.com/office/word/2010/wordprocessingShape" mc:Ignorable="w14 w15 w16se w16cid w16 w16cex w16sdtdh w16sdtfl w16du wp14">
   <w:body>
     <w:p>
       <w:pPr>
@@ -264,21 +264,7 @@
               <w:rPr>
                 <w:lang w:val="en-US"/>
               </w:rPr>
-              <w:t xml:space="preserve"> Sonam </w:t>
-            </w:r>
-            <w:proofErr w:type="spellStart"/>
-            <w:r>
-              <w:rPr>
-                <w:lang w:val="en-US"/>
-              </w:rPr>
-              <w:t>Pelden</w:t>
-            </w:r>
-            <w:proofErr w:type="spellEnd"/>
-            <w:r>
-              <w:rPr>
-                <w:lang w:val="en-US"/>
-              </w:rPr>
-              <w:t xml:space="preserve">, </w:t>
+              <w:t xml:space="preserve"> Sonam Pelden, </w:t>
             </w:r>
             <w:r>
               <w:rPr>
@@ -928,12 +914,6 @@
                 <w:lang w:val="en-NZ" w:eastAsia="en-NZ"/>
               </w:rPr>
             </w:pPr>
-            <w:r>
-              <w:rPr>
-                <w:lang w:val="en-NZ" w:eastAsia="en-NZ"/>
-              </w:rPr>
-              <w:t>Solution Design/Tech Justification/security design/ threat model/cost estimation.</w:t>
-            </w:r>
           </w:p>
         </w:tc>
       </w:tr>
@@ -1236,9 +1216,7 @@
       </w:sdtPr>
       <w:sdtEndPr>
         <w:rPr>
-          <w:rFonts w:ascii="Times New Roman" w:hAnsi="Times New Roman"/>
           <w:noProof/>
-          <w:sz w:val="24"/>
         </w:rPr>
       </w:sdtEndPr>
       <w:sdtContent>
@@ -1259,6 +1237,7 @@
             <w:rPr>
               <w:rFonts w:eastAsiaTheme="minorEastAsia"/>
               <w:noProof/>
+              <w:sz w:val="24"/>
               <w:szCs w:val="34"/>
               <w:lang w:val="en-US" w:bidi="dz-BT"/>
             </w:rPr>
@@ -1339,6 +1318,7 @@
             <w:rPr>
               <w:rFonts w:eastAsiaTheme="minorEastAsia"/>
               <w:noProof/>
+              <w:sz w:val="24"/>
               <w:szCs w:val="34"/>
               <w:lang w:val="en-US" w:bidi="dz-BT"/>
             </w:rPr>
@@ -1410,6 +1390,7 @@
             <w:rPr>
               <w:rFonts w:eastAsiaTheme="minorEastAsia"/>
               <w:noProof/>
+              <w:sz w:val="24"/>
               <w:szCs w:val="34"/>
               <w:lang w:val="en-US" w:bidi="dz-BT"/>
             </w:rPr>
@@ -1481,6 +1462,7 @@
             <w:rPr>
               <w:rFonts w:eastAsiaTheme="minorEastAsia"/>
               <w:noProof/>
+              <w:sz w:val="24"/>
               <w:szCs w:val="34"/>
               <w:lang w:val="en-US" w:bidi="dz-BT"/>
             </w:rPr>
@@ -1552,6 +1534,7 @@
             <w:rPr>
               <w:rFonts w:eastAsiaTheme="minorEastAsia"/>
               <w:noProof/>
+              <w:sz w:val="24"/>
               <w:szCs w:val="34"/>
               <w:lang w:val="en-US" w:bidi="dz-BT"/>
             </w:rPr>
@@ -1623,6 +1606,7 @@
             <w:rPr>
               <w:rFonts w:eastAsiaTheme="minorEastAsia"/>
               <w:noProof/>
+              <w:sz w:val="24"/>
               <w:szCs w:val="34"/>
               <w:lang w:val="en-US" w:bidi="dz-BT"/>
             </w:rPr>
@@ -1694,6 +1678,7 @@
             <w:rPr>
               <w:rFonts w:eastAsiaTheme="minorEastAsia"/>
               <w:noProof/>
+              <w:sz w:val="24"/>
               <w:szCs w:val="34"/>
               <w:lang w:val="en-US" w:bidi="dz-BT"/>
             </w:rPr>
@@ -1765,6 +1750,7 @@
             <w:rPr>
               <w:rFonts w:eastAsiaTheme="minorEastAsia"/>
               <w:noProof/>
+              <w:sz w:val="24"/>
               <w:szCs w:val="34"/>
               <w:lang w:val="en-US" w:bidi="dz-BT"/>
             </w:rPr>
@@ -1836,6 +1822,7 @@
             <w:rPr>
               <w:rFonts w:eastAsiaTheme="minorEastAsia"/>
               <w:noProof/>
+              <w:sz w:val="24"/>
               <w:szCs w:val="34"/>
               <w:lang w:val="en-US" w:bidi="dz-BT"/>
             </w:rPr>
@@ -1907,6 +1894,7 @@
             <w:rPr>
               <w:rFonts w:eastAsiaTheme="minorEastAsia"/>
               <w:noProof/>
+              <w:sz w:val="24"/>
               <w:szCs w:val="34"/>
               <w:lang w:val="en-US" w:bidi="dz-BT"/>
             </w:rPr>
@@ -1978,6 +1966,7 @@
             <w:rPr>
               <w:rFonts w:eastAsiaTheme="minorEastAsia"/>
               <w:noProof/>
+              <w:sz w:val="24"/>
               <w:szCs w:val="34"/>
               <w:lang w:val="en-US" w:bidi="dz-BT"/>
             </w:rPr>
@@ -2049,6 +2038,7 @@
             <w:rPr>
               <w:rFonts w:eastAsiaTheme="minorEastAsia"/>
               <w:noProof/>
+              <w:sz w:val="24"/>
               <w:szCs w:val="34"/>
               <w:lang w:val="en-US" w:bidi="dz-BT"/>
             </w:rPr>
@@ -2120,6 +2110,7 @@
             <w:rPr>
               <w:rFonts w:eastAsiaTheme="minorEastAsia"/>
               <w:noProof/>
+              <w:sz w:val="24"/>
               <w:szCs w:val="34"/>
               <w:lang w:val="en-US" w:bidi="dz-BT"/>
             </w:rPr>
@@ -2191,6 +2182,7 @@
             <w:rPr>
               <w:rFonts w:eastAsiaTheme="minorEastAsia"/>
               <w:noProof/>
+              <w:sz w:val="24"/>
               <w:szCs w:val="34"/>
               <w:lang w:val="en-US" w:bidi="dz-BT"/>
             </w:rPr>
@@ -2262,6 +2254,7 @@
             <w:rPr>
               <w:rFonts w:eastAsiaTheme="minorEastAsia"/>
               <w:noProof/>
+              <w:sz w:val="24"/>
               <w:szCs w:val="34"/>
               <w:lang w:val="en-US" w:bidi="dz-BT"/>
             </w:rPr>
@@ -2333,6 +2326,7 @@
             <w:rPr>
               <w:rFonts w:eastAsiaTheme="minorEastAsia"/>
               <w:noProof/>
+              <w:sz w:val="24"/>
               <w:szCs w:val="34"/>
               <w:lang w:val="en-US" w:bidi="dz-BT"/>
             </w:rPr>
@@ -2404,6 +2398,7 @@
             <w:rPr>
               <w:rFonts w:eastAsiaTheme="minorEastAsia"/>
               <w:noProof/>
+              <w:sz w:val="24"/>
               <w:szCs w:val="34"/>
               <w:lang w:val="en-US" w:bidi="dz-BT"/>
             </w:rPr>
@@ -2475,6 +2470,7 @@
             <w:rPr>
               <w:rFonts w:eastAsiaTheme="minorEastAsia"/>
               <w:noProof/>
+              <w:sz w:val="24"/>
               <w:szCs w:val="34"/>
               <w:lang w:val="en-US" w:bidi="dz-BT"/>
             </w:rPr>
@@ -2546,6 +2542,7 @@
             <w:rPr>
               <w:rFonts w:eastAsiaTheme="minorEastAsia"/>
               <w:noProof/>
+              <w:sz w:val="24"/>
               <w:szCs w:val="34"/>
               <w:lang w:val="en-US" w:bidi="dz-BT"/>
             </w:rPr>
@@ -2617,6 +2614,7 @@
             <w:rPr>
               <w:rFonts w:eastAsiaTheme="minorEastAsia"/>
               <w:noProof/>
+              <w:sz w:val="24"/>
               <w:szCs w:val="34"/>
               <w:lang w:val="en-US" w:bidi="dz-BT"/>
             </w:rPr>
@@ -2688,6 +2686,7 @@
             <w:rPr>
               <w:rFonts w:eastAsiaTheme="minorEastAsia"/>
               <w:noProof/>
+              <w:sz w:val="24"/>
               <w:szCs w:val="34"/>
               <w:lang w:val="en-US" w:bidi="dz-BT"/>
             </w:rPr>
@@ -2759,6 +2758,7 @@
             <w:rPr>
               <w:rFonts w:eastAsiaTheme="minorEastAsia"/>
               <w:noProof/>
+              <w:sz w:val="24"/>
               <w:szCs w:val="34"/>
               <w:lang w:val="en-US" w:bidi="dz-BT"/>
             </w:rPr>
@@ -2830,6 +2830,7 @@
             <w:rPr>
               <w:rFonts w:eastAsiaTheme="minorEastAsia"/>
               <w:noProof/>
+              <w:sz w:val="24"/>
               <w:szCs w:val="34"/>
               <w:lang w:val="en-US" w:bidi="dz-BT"/>
             </w:rPr>
@@ -2901,6 +2902,7 @@
             <w:rPr>
               <w:rFonts w:eastAsiaTheme="minorEastAsia"/>
               <w:noProof/>
+              <w:sz w:val="24"/>
               <w:szCs w:val="34"/>
               <w:lang w:val="en-US" w:bidi="dz-BT"/>
             </w:rPr>
@@ -2972,6 +2974,7 @@
             <w:rPr>
               <w:rFonts w:eastAsiaTheme="minorEastAsia"/>
               <w:noProof/>
+              <w:sz w:val="24"/>
               <w:szCs w:val="34"/>
               <w:lang w:val="en-US" w:bidi="dz-BT"/>
             </w:rPr>
@@ -3043,6 +3046,7 @@
             <w:rPr>
               <w:rFonts w:eastAsiaTheme="minorEastAsia"/>
               <w:noProof/>
+              <w:sz w:val="24"/>
               <w:szCs w:val="34"/>
               <w:lang w:val="en-US" w:bidi="dz-BT"/>
             </w:rPr>
@@ -3114,6 +3118,7 @@
             <w:rPr>
               <w:rFonts w:eastAsiaTheme="minorEastAsia"/>
               <w:noProof/>
+              <w:sz w:val="24"/>
               <w:szCs w:val="34"/>
               <w:lang w:val="en-US" w:bidi="dz-BT"/>
             </w:rPr>
@@ -3185,6 +3190,7 @@
             <w:rPr>
               <w:rFonts w:eastAsiaTheme="minorEastAsia"/>
               <w:noProof/>
+              <w:sz w:val="24"/>
               <w:szCs w:val="34"/>
               <w:lang w:val="en-US" w:bidi="dz-BT"/>
             </w:rPr>
@@ -3256,6 +3262,7 @@
             <w:rPr>
               <w:rFonts w:eastAsiaTheme="minorEastAsia"/>
               <w:noProof/>
+              <w:sz w:val="24"/>
               <w:szCs w:val="34"/>
               <w:lang w:val="en-US" w:bidi="dz-BT"/>
             </w:rPr>
@@ -3334,7 +3341,6 @@
     <w:p/>
     <w:p>
       <w:r>
-        <w:lastRenderedPageBreak/>
         <w:br w:type="page"/>
       </w:r>
     </w:p>
@@ -3694,7 +3700,6 @@
         </w:numPr>
       </w:pPr>
       <w:r>
-        <w:lastRenderedPageBreak/>
         <w:t xml:space="preserve">A synthetic test-data plan </w:t>
       </w:r>
       <w:r>
@@ -3719,6 +3724,7 @@
         </w:numPr>
       </w:pPr>
       <w:r>
+        <w:lastRenderedPageBreak/>
         <w:t>A written, connector-weighted test plan covering happy-path, error-handling and degradation scenarios for all three connectors.</w:t>
       </w:r>
     </w:p>
@@ -4004,7 +4010,6 @@
       </w:pPr>
       <w:bookmarkStart w:id="5" w:name="_Toc238803235"/>
       <w:r>
-        <w:lastRenderedPageBreak/>
         <w:t>1.4 Stakeholders and User Requirements</w:t>
       </w:r>
       <w:bookmarkEnd w:id="5"/>
@@ -4123,6 +4128,7 @@
           </w:tcPr>
           <w:p>
             <w:r>
+              <w:lastRenderedPageBreak/>
               <w:t>Md Ashraf Uddin</w:t>
             </w:r>
           </w:p>
@@ -4709,7 +4715,6 @@
           </w:tcPr>
           <w:p>
             <w:r>
-              <w:lastRenderedPageBreak/>
               <w:t>Solution Design &amp; PoC Planning</w:t>
             </w:r>
           </w:p>
@@ -4742,6 +4747,7 @@
           </w:tcPr>
           <w:p>
             <w:r>
+              <w:lastRenderedPageBreak/>
               <w:t>Finalisation &amp; Submission</w:t>
             </w:r>
           </w:p>
@@ -4798,11 +4804,11 @@
         <w:tblLook w:val="0000" w:firstRow="0" w:lastRow="0" w:firstColumn="0" w:lastColumn="0" w:noHBand="0" w:noVBand="0"/>
       </w:tblPr>
       <w:tblGrid>
-        <w:gridCol w:w="2811"/>
-        <w:gridCol w:w="1541"/>
-        <w:gridCol w:w="1513"/>
-        <w:gridCol w:w="1538"/>
-        <w:gridCol w:w="1623"/>
+        <w:gridCol w:w="2856"/>
+        <w:gridCol w:w="1542"/>
+        <w:gridCol w:w="1529"/>
+        <w:gridCol w:w="1542"/>
+        <w:gridCol w:w="1557"/>
       </w:tblGrid>
       <w:tr>
         <w:tc>
@@ -5576,7 +5582,6 @@
       </w:pPr>
       <w:bookmarkStart w:id="10" w:name="_Toc238803240"/>
       <w:r>
-        <w:lastRenderedPageBreak/>
         <w:t>2.4 Risk Register</w:t>
       </w:r>
       <w:bookmarkEnd w:id="10"/>
@@ -5603,13 +5608,13 @@
       </w:tblPr>
       <w:tblGrid>
         <w:gridCol w:w="499"/>
-        <w:gridCol w:w="2234"/>
-        <w:gridCol w:w="985"/>
+        <w:gridCol w:w="2196"/>
+        <w:gridCol w:w="1004"/>
         <w:gridCol w:w="846"/>
-        <w:gridCol w:w="603"/>
-        <w:gridCol w:w="799"/>
-        <w:gridCol w:w="2333"/>
-        <w:gridCol w:w="701"/>
+        <w:gridCol w:w="650"/>
+        <w:gridCol w:w="800"/>
+        <w:gridCol w:w="2293"/>
+        <w:gridCol w:w="712"/>
       </w:tblGrid>
       <w:tr>
         <w:tc>
@@ -5822,6 +5827,7 @@
                 <w:sz w:val="17"/>
                 <w:szCs w:val="17"/>
               </w:rPr>
+              <w:lastRenderedPageBreak/>
               <w:t>R1</w:t>
             </w:r>
           </w:p>
@@ -6991,26 +6997,26 @@
     </w:p>
     <w:p>
       <w:r>
+        <w:t xml:space="preserve">Economic </w:t>
+      </w:r>
+      <w:r>
+        <w:t>feasibility is high</w:t>
+      </w:r>
+      <w:r>
+        <w:t xml:space="preserve">: estimated overall cost is around $150 AUD, both using </w:t>
+      </w:r>
+      <w:proofErr w:type="gramStart"/>
+      <w:r>
+        <w:t>open source</w:t>
+      </w:r>
+      <w:proofErr w:type="gramEnd"/>
+      <w:r>
+        <w:t xml:space="preserve"> tools and free tier hosting under the WIL arrangement, and the expected value for FAZ Australia is great, as defect escape rate will be reduced and onboarding of connectors will be accelerated.</w:t>
+      </w:r>
+    </w:p>
+    <w:p>
+      <w:r>
         <w:lastRenderedPageBreak/>
-        <w:t xml:space="preserve">Economic </w:t>
-      </w:r>
-      <w:r>
-        <w:t>feasibility is high</w:t>
-      </w:r>
-      <w:r>
-        <w:t xml:space="preserve">: estimated overall cost is around $150 AUD, both using </w:t>
-      </w:r>
-      <w:proofErr w:type="gramStart"/>
-      <w:r>
-        <w:t>open source</w:t>
-      </w:r>
-      <w:proofErr w:type="gramEnd"/>
-      <w:r>
-        <w:t xml:space="preserve"> tools and free tier hosting under the WIL arrangement, and the expected value for FAZ Australia is great, as defect escape rate will be reduced and onboarding of connectors will be accelerated.</w:t>
-      </w:r>
-    </w:p>
-    <w:p>
-      <w:r>
         <w:t xml:space="preserve">Legal feasibility is </w:t>
       </w:r>
       <w:r>
@@ -7244,62 +7250,62 @@
         <w:rPr>
           <w:color w:val="000000"/>
         </w:rPr>
-        <w:t xml:space="preserve">). One of the developing platforms that MedTalk uses is Epic.  Epic sandbox provides platform for developers to test integration first using mock patient data before EHR (Electronic Health Records) exchange. </w:t>
+        <w:t xml:space="preserve">). One of the developing platforms that MedTalk uses is Epic.  Epic sandbox provides platform for developers to test integration first using mock patient data before EHR (Electronic Health Records) exchange. According to </w:t>
       </w:r>
       <w:r>
         <w:rPr>
           <w:color w:val="000000"/>
         </w:rPr>
+        <w:t>Choudhary</w:t>
+      </w:r>
+      <w:r>
+        <w:rPr>
+          <w:color w:val="000000"/>
+        </w:rPr>
+        <w:t xml:space="preserve"> (2026), for a company to upload their application on Epic is split into three main categories for charging fees. There is Connection Hub listing fee approximately USD$500, vendor services membership charging up to USD$1 900 and build Labour ranging from USD$40000 for read only FHIR and USD$350000 for full bidirectional (</w:t>
+      </w:r>
+      <w:r>
+        <w:rPr>
+          <w:color w:val="000000"/>
+        </w:rPr>
+        <w:t>Choudhary</w:t>
+      </w:r>
+      <w:r>
+        <w:rPr>
+          <w:color w:val="000000"/>
+        </w:rPr>
+        <w:t>, 2026). MedTalk and MediBetter partnership tech-tech API prices are not publicly available but according to MarkiTech.AI</w:t>
+      </w:r>
+      <w:r>
+        <w:rPr>
+          <w:color w:val="000000"/>
+        </w:rPr>
+        <w:t xml:space="preserve"> (2025</w:t>
+      </w:r>
+      <w:r>
+        <w:rPr>
+          <w:color w:val="000000"/>
+        </w:rPr>
+        <w:t>)</w:t>
+      </w:r>
+      <w:r>
+        <w:rPr>
+          <w:color w:val="000000"/>
+        </w:rPr>
+        <w:t>,</w:t>
+      </w:r>
+      <w:r>
+        <w:rPr>
+          <w:color w:val="000000"/>
+        </w:rPr>
+        <w:t xml:space="preserve"> a flat fee ranges </w:t>
+      </w:r>
+      <w:r>
+        <w:rPr>
+          <w:color w:val="000000"/>
+        </w:rPr>
         <w:lastRenderedPageBreak/>
-        <w:t xml:space="preserve">According to </w:t>
-      </w:r>
-      <w:r>
-        <w:rPr>
-          <w:color w:val="000000"/>
-        </w:rPr>
-        <w:t>Choudhary</w:t>
-      </w:r>
-      <w:r>
-        <w:rPr>
-          <w:color w:val="000000"/>
-        </w:rPr>
-        <w:t xml:space="preserve"> (2026), for a company to upload their application on Epic is split into three main categories for charging fees. There is Connection Hub listing fee approximately USD$500, vendor services membership charging up to USD$1 900 and build Labour ranging from USD$40000 for read only FHIR and USD$350000 for full bidirectional (</w:t>
-      </w:r>
-      <w:r>
-        <w:rPr>
-          <w:color w:val="000000"/>
-        </w:rPr>
-        <w:t>Choudhary</w:t>
-      </w:r>
-      <w:r>
-        <w:rPr>
-          <w:color w:val="000000"/>
-        </w:rPr>
-        <w:t>, 2026). MedTalk and MediBetter partnership tech-tech API prices are not publicly available but according to MarkiTech.AI</w:t>
-      </w:r>
-      <w:r>
-        <w:rPr>
-          <w:color w:val="000000"/>
-        </w:rPr>
-        <w:t xml:space="preserve"> (2025</w:t>
-      </w:r>
-      <w:r>
-        <w:rPr>
-          <w:color w:val="000000"/>
-        </w:rPr>
-        <w:t>)</w:t>
-      </w:r>
-      <w:r>
-        <w:rPr>
-          <w:color w:val="000000"/>
-        </w:rPr>
-        <w:t>,</w:t>
-      </w:r>
-      <w:r>
-        <w:rPr>
-          <w:color w:val="000000"/>
-        </w:rPr>
-        <w:t xml:space="preserve"> a flat fee ranges from $100 to $500. This excludes the subscription of the MediBetter professional suite which </w:t>
+        <w:t xml:space="preserve">from $100 to $500. This excludes the subscription of the MediBetter professional suite which </w:t>
       </w:r>
       <w:r>
         <w:rPr>
@@ -7422,269 +7428,266 @@
         <w:rPr>
           <w:lang w:val="en-US"/>
         </w:rPr>
-        <w:t xml:space="preserve">MedTalk is part of the Australian health interoperability market. The main technical challenge in this market is not only generating accurate clinical notes but safe exchange of the clinical </w:t>
-      </w:r>
+        <w:t xml:space="preserve">MedTalk is part of the Australian health interoperability market. The main technical challenge in this market is not only generating accurate clinical notes but safe exchange of the clinical notes and correct translation of the data to the receiving system.  The most relevant technologies for the test harness are HL7 FHIR, SMART, vendor integration layers and Australian clinical terminology. These are all essential for the project as it </w:t>
+      </w:r>
+      <w:proofErr w:type="gramStart"/>
       <w:r>
         <w:rPr>
           <w:lang w:val="en-US"/>
         </w:rPr>
+        <w:t>has to</w:t>
+      </w:r>
+      <w:proofErr w:type="gramEnd"/>
+      <w:r>
+        <w:rPr>
+          <w:lang w:val="en-US"/>
+        </w:rPr>
+        <w:t xml:space="preserve"> reflect the same standards as production systems.</w:t>
+      </w:r>
+    </w:p>
+    <w:p>
+      <w:pPr>
+        <w:textAlignment w:val="baseline"/>
+        <w:rPr>
+          <w:lang w:val="en-US"/>
+        </w:rPr>
+      </w:pPr>
+    </w:p>
+    <w:p>
+      <w:pPr>
+        <w:textAlignment w:val="baseline"/>
+        <w:rPr>
+          <w:lang w:val="en-US"/>
+        </w:rPr>
+      </w:pPr>
+      <w:r>
+        <w:rPr>
+          <w:lang w:val="en-US"/>
+        </w:rPr>
         <w:lastRenderedPageBreak/>
-        <w:t xml:space="preserve">notes and correct translation of the data to the receiving system.  The most relevant technologies for the test harness are HL7 FHIR, SMART, vendor integration layers and Australian clinical terminology. These are all essential for the project as it </w:t>
+        <w:t>FHIR (</w:t>
+      </w:r>
+      <w:r>
+        <w:rPr>
+          <w:color w:val="000000"/>
+        </w:rPr>
+        <w:t>Fast Healthcare Interoperability Resources</w:t>
+      </w:r>
+      <w:r>
+        <w:rPr>
+          <w:lang w:val="en-US"/>
+        </w:rPr>
+        <w:t>) is the central exchange standard that defines resources meaning patient data, appointments, clinical notes and related information structure and transferred between systems (</w:t>
+      </w:r>
+      <w:proofErr w:type="spellStart"/>
+      <w:r>
+        <w:rPr>
+          <w:color w:val="000000"/>
+        </w:rPr>
+        <w:t>eCQI</w:t>
+      </w:r>
+      <w:proofErr w:type="spellEnd"/>
+      <w:r>
+        <w:rPr>
+          <w:color w:val="000000"/>
+        </w:rPr>
+        <w:t xml:space="preserve">, </w:t>
+      </w:r>
+      <w:r>
+        <w:rPr>
+          <w:color w:val="000000"/>
+        </w:rPr>
+        <w:t>2025)</w:t>
+      </w:r>
+      <w:r>
+        <w:rPr>
+          <w:lang w:val="en-US"/>
+        </w:rPr>
+        <w:t>. It also depicts interaction patterns including real time representation state Transfer (RESTful) application programming interfaces (APIs), document based and messaging. The RESTful APIS use HTTP operations to create, read, update and search for FHIR resources to enable real time data exchange. FHIR framework is free to build commercial and open-source tools while HL7 is registered trademark that cannot be used without permission. FHIR is a necessity for the project to mimic structured clinical document exchange and be able to test it.</w:t>
+      </w:r>
+    </w:p>
+    <w:p>
+      <w:pPr>
+        <w:textAlignment w:val="baseline"/>
+        <w:rPr>
+          <w:lang w:val="en-US"/>
+        </w:rPr>
+      </w:pPr>
+      <w:r>
+        <w:rPr>
+          <w:lang w:val="en-US"/>
+        </w:rPr>
+        <w:t xml:space="preserve">Australian clinical terminology and classification is vital which include SNOMED CT-AU and ICD-10-AM. SNOMED CT-AU is the preferred clinical terminology in Australia which is an extension of the global </w:t>
+      </w:r>
+      <w:r>
+        <w:t xml:space="preserve">SNOMED </w:t>
+      </w:r>
+      <w:r>
+        <w:t>CT standard.</w:t>
+      </w:r>
+      <w:r>
+        <w:t xml:space="preserve"> It combines international core clinical data with Australian-specific terms, spellings, local reference set</w:t>
+      </w:r>
+      <w:r>
+        <w:t>s</w:t>
+      </w:r>
+      <w:r>
+        <w:t xml:space="preserve"> and the Australian Medicines Terminology (AMT</w:t>
+      </w:r>
+      <w:r>
+        <w:t xml:space="preserve">). </w:t>
+      </w:r>
+      <w:r>
+        <w:rPr>
+          <w:lang w:val="en-US"/>
+        </w:rPr>
+        <w:t xml:space="preserve">SNOMED CT-AU </w:t>
+      </w:r>
+      <w:r>
+        <w:t>c</w:t>
+      </w:r>
+      <w:r>
+        <w:t xml:space="preserve">ontains </w:t>
+      </w:r>
+      <w:r>
+        <w:t xml:space="preserve">numerous </w:t>
+      </w:r>
+      <w:r>
+        <w:t xml:space="preserve">clinical concepts organized into hierarchies </w:t>
+      </w:r>
+      <w:r>
+        <w:t>like body structures, procedures and clinical findings</w:t>
+      </w:r>
+      <w:r>
+        <w:t>.</w:t>
+      </w:r>
+      <w:r>
+        <w:t xml:space="preserve"> </w:t>
+      </w:r>
+      <w:r>
+        <w:rPr>
+          <w:lang w:val="en-US"/>
+        </w:rPr>
+        <w:t>SNOMED CT-AU is then mapped to ICD-10-AM which is classification of diseases and diagnosis</w:t>
+      </w:r>
+      <w:r>
+        <w:t xml:space="preserve"> t</w:t>
+      </w:r>
+      <w:r>
+        <w:t>ailored to match Australian clinical terminology, practice and health-tracking need</w:t>
+      </w:r>
+      <w:r>
+        <w:t xml:space="preserve">. The </w:t>
+      </w:r>
+      <w:r>
+        <w:rPr>
+          <w:lang w:val="en-US"/>
+        </w:rPr>
+        <w:t>ICD-10-AM is mapped to MBS for billing in Australia. These terms need to be coded in the synthetic patient record correctly as the test harness will validate them. These terminologies are free access to code in synthetic data.</w:t>
+      </w:r>
+    </w:p>
+    <w:p>
+      <w:pPr>
+        <w:textAlignment w:val="baseline"/>
+        <w:rPr>
+          <w:lang w:val="en-US"/>
+        </w:rPr>
+      </w:pPr>
+    </w:p>
+    <w:p>
+      <w:pPr>
+        <w:textAlignment w:val="baseline"/>
+        <w:rPr>
+          <w:lang w:val="en-US"/>
+        </w:rPr>
+      </w:pPr>
+      <w:r>
+        <w:rPr>
+          <w:lang w:val="en-US"/>
+        </w:rPr>
+        <w:t xml:space="preserve">Synthea is currently one of the most credited synthetic patient </w:t>
       </w:r>
       <w:proofErr w:type="gramStart"/>
       <w:r>
         <w:rPr>
           <w:lang w:val="en-US"/>
         </w:rPr>
-        <w:t>has to</w:t>
+        <w:t>generator</w:t>
       </w:r>
       <w:proofErr w:type="gramEnd"/>
       <w:r>
         <w:rPr>
           <w:lang w:val="en-US"/>
         </w:rPr>
-        <w:t xml:space="preserve"> reflect the same standards as production systems.</w:t>
+        <w:t xml:space="preserve"> as it creates realistic </w:t>
+      </w:r>
+      <w:r>
+        <w:t>realistic mock medical histories and electronic health records</w:t>
+      </w:r>
+      <w:r>
+        <w:t xml:space="preserve"> lifespan</w:t>
+      </w:r>
+      <w:r>
+        <w:t xml:space="preserve"> from birth to death.</w:t>
+      </w:r>
+      <w:r>
+        <w:t xml:space="preserve"> Synthea is an open source but produces mock patients based on Unites States of America demographics. CSIRO have created Australian mock data using Australian demographics, but the synthea tool is not available for public. The mock data is available which would be used for this project to ensure compliance and mimics real clinical system. SMART on FHIR is the authentication and authorising </w:t>
+      </w:r>
+      <w:r>
+        <w:t>secure system that lets third-party health apps log users in</w:t>
+      </w:r>
+      <w:r>
+        <w:t xml:space="preserve">, </w:t>
+      </w:r>
+      <w:r>
+        <w:t>access electronic health record (EHR) data using standard OAuth 2.0 protocols</w:t>
+      </w:r>
+      <w:r>
+        <w:t>. This security is necessary to ensure that there is no authorised access to the Test harness</w:t>
+      </w:r>
+      <w:r>
+        <w:t>.</w:t>
       </w:r>
     </w:p>
     <w:p>
       <w:pPr>
         <w:textAlignment w:val="baseline"/>
+      </w:pPr>
+      <w:r>
         <w:rPr>
           <w:lang w:val="en-US"/>
         </w:rPr>
-      </w:pPr>
+        <w:t>Vendor integration layers include Halo connect to be implemented in the project. Halo connect is an Australian healthcare platform that safely links local medical practice systems to cloud-based software. It has two main components Halo Link and Halo Cloud. Halo Link is used to link the database to Halo cloud and Halo Cloud would be required for sharing data using standard formats like SQL and FHIR with approved external software. This integration is necessary as when the integration (another system) requires data from the server’s database, it sends this enquiry to the</w:t>
+      </w:r>
+      <w:r>
+        <w:t xml:space="preserve"> Halo Cloud</w:t>
+      </w:r>
+      <w:r>
+        <w:t xml:space="preserve"> then forwards it</w:t>
+      </w:r>
+      <w:r>
+        <w:t xml:space="preserve"> to the Halo Link agent</w:t>
+      </w:r>
+      <w:r>
+        <w:t>. The agent sends the enquiry to the local system database and run the query and send back results.</w:t>
+      </w:r>
     </w:p>
     <w:p>
       <w:pPr>
         <w:textAlignment w:val="baseline"/>
-        <w:rPr>
-          <w:lang w:val="en-US"/>
-        </w:rPr>
-      </w:pPr>
-      <w:r>
-        <w:rPr>
-          <w:lang w:val="en-US"/>
-        </w:rPr>
-        <w:t>FHIR (</w:t>
-      </w:r>
-      <w:r>
-        <w:rPr>
-          <w:color w:val="000000"/>
-        </w:rPr>
-        <w:t>Fast Healthcare Interoperability Resources</w:t>
-      </w:r>
-      <w:r>
-        <w:rPr>
-          <w:lang w:val="en-US"/>
-        </w:rPr>
-        <w:t>) is the central exchange standard that defines resources meaning patient data, appointments, clinical notes and related information structure and transferred between systems (</w:t>
-      </w:r>
-      <w:proofErr w:type="spellStart"/>
-      <w:r>
-        <w:rPr>
-          <w:color w:val="000000"/>
-        </w:rPr>
-        <w:t>eCQI</w:t>
-      </w:r>
-      <w:proofErr w:type="spellEnd"/>
-      <w:r>
-        <w:rPr>
-          <w:color w:val="000000"/>
-        </w:rPr>
-        <w:t xml:space="preserve">, </w:t>
-      </w:r>
-      <w:r>
-        <w:rPr>
-          <w:color w:val="000000"/>
-        </w:rPr>
-        <w:t>2025)</w:t>
-      </w:r>
-      <w:r>
-        <w:rPr>
-          <w:lang w:val="en-US"/>
-        </w:rPr>
-        <w:t>. It also depicts interaction patterns including real time representation state Transfer (RESTful) application programming interfaces (APIs), document based and messaging. The RESTful APIS use HTTP operations to create, read, update and search for FHIR resources to enable real time data exchange. FHIR framework is free to build commercial and open-source tools while HL7 is registered trademark that cannot be used without permission. FHIR is a necessity for the project to mimic structured clinical document exchange and be able to test it.</w:t>
-      </w:r>
-    </w:p>
-    <w:p>
-      <w:pPr>
-        <w:textAlignment w:val="baseline"/>
-        <w:rPr>
-          <w:lang w:val="en-US"/>
-        </w:rPr>
-      </w:pPr>
-      <w:r>
-        <w:rPr>
-          <w:lang w:val="en-US"/>
-        </w:rPr>
-        <w:t xml:space="preserve">Australian clinical terminology and classification is vital which include SNOMED CT-AU and ICD-10-AM. SNOMED CT-AU is the preferred clinical terminology in Australia which is an extension of the global </w:t>
-      </w:r>
-      <w:r>
-        <w:t xml:space="preserve">SNOMED </w:t>
-      </w:r>
-      <w:r>
-        <w:t>CT standard.</w:t>
-      </w:r>
-      <w:r>
-        <w:t xml:space="preserve"> It combines international core clinical data with Australian-specific terms, spellings, local reference set</w:t>
-      </w:r>
-      <w:r>
-        <w:t>s</w:t>
-      </w:r>
-      <w:r>
-        <w:t xml:space="preserve"> and the Australian Medicines Terminology (AMT</w:t>
-      </w:r>
-      <w:r>
-        <w:t xml:space="preserve">). </w:t>
-      </w:r>
-      <w:r>
-        <w:rPr>
-          <w:lang w:val="en-US"/>
-        </w:rPr>
-        <w:t xml:space="preserve">SNOMED CT-AU </w:t>
-      </w:r>
-      <w:r>
-        <w:t>c</w:t>
-      </w:r>
-      <w:r>
-        <w:t xml:space="preserve">ontains </w:t>
-      </w:r>
-      <w:r>
-        <w:t xml:space="preserve">numerous </w:t>
-      </w:r>
-      <w:r>
-        <w:t xml:space="preserve">clinical concepts organized into hierarchies </w:t>
-      </w:r>
-      <w:r>
-        <w:t>like body structures, procedures and clinical findings</w:t>
-      </w:r>
-      <w:r>
-        <w:t>.</w:t>
-      </w:r>
-      <w:r>
-        <w:t xml:space="preserve"> </w:t>
-      </w:r>
-      <w:r>
-        <w:rPr>
-          <w:lang w:val="en-US"/>
-        </w:rPr>
-        <w:t>SNOMED CT-AU is then mapped to ICD-10-AM which is classification of diseases and diagnosis</w:t>
-      </w:r>
-      <w:r>
-        <w:t xml:space="preserve"> t</w:t>
-      </w:r>
-      <w:r>
-        <w:t>ailored to match Australian clinical terminology, practice and health-tracking need</w:t>
-      </w:r>
-      <w:r>
-        <w:t xml:space="preserve">. The </w:t>
-      </w:r>
-      <w:r>
-        <w:rPr>
-          <w:lang w:val="en-US"/>
-        </w:rPr>
-        <w:t>ICD-10-AM is mapped to MBS for billing in Australia. These terms need to be coded in the synthetic patient record correctly as the test harness will validate them. These terminologies are free access to code in synthetic data.</w:t>
-      </w:r>
-    </w:p>
-    <w:p>
-      <w:pPr>
-        <w:textAlignment w:val="baseline"/>
-        <w:rPr>
-          <w:lang w:val="en-US"/>
-        </w:rPr>
-      </w:pPr>
-    </w:p>
-    <w:p>
-      <w:pPr>
-        <w:textAlignment w:val="baseline"/>
-        <w:rPr>
-          <w:lang w:val="en-US"/>
-        </w:rPr>
-      </w:pPr>
-      <w:r>
-        <w:rPr>
-          <w:lang w:val="en-US"/>
-        </w:rPr>
-        <w:t xml:space="preserve">Synthea is currently one of the most credited synthetic patient </w:t>
-      </w:r>
-      <w:proofErr w:type="gramStart"/>
-      <w:r>
-        <w:rPr>
-          <w:lang w:val="en-US"/>
-        </w:rPr>
-        <w:t>generator</w:t>
-      </w:r>
-      <w:proofErr w:type="gramEnd"/>
-      <w:r>
-        <w:rPr>
-          <w:lang w:val="en-US"/>
-        </w:rPr>
-        <w:t xml:space="preserve"> as it creates realistic </w:t>
-      </w:r>
-      <w:r>
-        <w:t>realistic mock medical histories and electronic health records</w:t>
-      </w:r>
-      <w:r>
-        <w:t xml:space="preserve"> lifespan</w:t>
-      </w:r>
-      <w:r>
-        <w:t xml:space="preserve"> from birth to death.</w:t>
-      </w:r>
-      <w:r>
-        <w:t xml:space="preserve"> Synthea is an open source but produces mock patients based on Unites States of America demographics. CSIRO have created Australian mock data using Australian demographics, but the synthea tool is not available for public. The mock data is available which would be used for this project to ensure compliance and mimics real clinical system. SMART on FHIR is the authentication and authorising </w:t>
-      </w:r>
-      <w:r>
-        <w:t>secure system that lets third-party health apps log users in</w:t>
-      </w:r>
-      <w:r>
-        <w:t xml:space="preserve">, </w:t>
-      </w:r>
-      <w:r>
-        <w:t>access electronic health record (EHR) data using standard OAuth 2.0 protocols</w:t>
-      </w:r>
-      <w:r>
-        <w:t>. This security is necessary to ensure that there is no authorised access to the Test harness.</w:t>
-      </w:r>
-    </w:p>
-    <w:p>
-      <w:pPr>
-        <w:textAlignment w:val="baseline"/>
-      </w:pPr>
-      <w:r>
-        <w:rPr>
-          <w:lang w:val="en-US"/>
-        </w:rPr>
-        <w:t>Vendor integration layers include Halo connect to be implemented in the project. Halo connect is an Australian healthcare platform that safely links local medical practice systems to cloud-based software. It has two main components Halo Link and Halo Cloud. Halo Link is used to link the database to Halo cloud and Halo Cloud would be required for sharing data using standard formats like SQL and FHIR with approved external software. This integration is necessary as when the integration (another system) requires data from the server’s database, it sends this enquiry to the</w:t>
-      </w:r>
-      <w:r>
-        <w:t xml:space="preserve"> Halo Cloud</w:t>
-      </w:r>
-      <w:r>
-        <w:t xml:space="preserve"> then forwards it</w:t>
-      </w:r>
-      <w:r>
-        <w:t xml:space="preserve"> to the Halo Link agent</w:t>
-      </w:r>
-      <w:r>
-        <w:t>. The agent sends the enquiry to the local system database and run the query and send back results.</w:t>
-      </w:r>
-    </w:p>
-    <w:p>
-      <w:pPr>
-        <w:textAlignment w:val="baseline"/>
-      </w:pPr>
+      </w:pPr>
+      <w:r>
+        <w:t xml:space="preserve">The main gap in the current market is that existing standards and vendors solve only part of the problem. Standards define how data should be exchanged, vendor products expose endpoints and terminology systems define how meaning should be coded. This still then requires a synthetic test harness that utilises all these tools, standards and frameworks to form a repeatable automation testing, failure simulation and validation of edge cases. </w:t>
+      </w:r>
+    </w:p>
+    <w:p/>
+    <w:p>
+      <w:pPr>
+        <w:pStyle w:val="Heading2"/>
+      </w:pPr>
+      <w:bookmarkStart w:id="15" w:name="_Toc238803245"/>
       <w:r>
         <w:lastRenderedPageBreak/>
-        <w:t xml:space="preserve">The main gap in the current market is that existing standards and vendors solve only part of the problem. Standards define how data should be exchanged, vendor products expose endpoints and terminology systems define how meaning should be coded. This still then requires a synthetic test harness that utilises all these tools, standards and frameworks to form a repeatable automation testing, failure simulation and validation of edge cases. </w:t>
-      </w:r>
-    </w:p>
-    <w:p/>
-    <w:p>
-      <w:pPr>
-        <w:pStyle w:val="Heading2"/>
-      </w:pPr>
-      <w:bookmarkStart w:id="15" w:name="_Toc238803245"/>
-      <w:r>
         <w:t>3.3 Comparative Analysis of Existing Solutions</w:t>
       </w:r>
       <w:bookmarkEnd w:id="15"/>
@@ -7714,11 +7717,11 @@
         <w:tblLook w:val="04A0" w:firstRow="1" w:lastRow="0" w:firstColumn="1" w:lastColumn="0" w:noHBand="0" w:noVBand="1"/>
       </w:tblPr>
       <w:tblGrid>
-        <w:gridCol w:w="1510"/>
-        <w:gridCol w:w="2044"/>
-        <w:gridCol w:w="1430"/>
-        <w:gridCol w:w="2050"/>
-        <w:gridCol w:w="2884"/>
+        <w:gridCol w:w="1469"/>
+        <w:gridCol w:w="2065"/>
+        <w:gridCol w:w="1414"/>
+        <w:gridCol w:w="2053"/>
+        <w:gridCol w:w="2917"/>
       </w:tblGrid>
       <w:tr>
         <w:tc>
@@ -8047,14 +8050,14 @@
             </w:pPr>
             <w:r>
               <w:rPr>
-                <w:rFonts w:cs="Times New Roman"/>
+                <w:rFonts w:ascii="Times New Roman" w:hAnsi="Times New Roman" w:cs="Times New Roman"/>
               </w:rPr>
               <w:t>Integration can involve </w:t>
             </w:r>
             <w:r>
               <w:rPr>
                 <w:rStyle w:val="Strong"/>
-                <w:rFonts w:cs="Times New Roman"/>
+                <w:rFonts w:ascii="Times New Roman" w:hAnsi="Times New Roman" w:cs="Times New Roman"/>
                 <w:b w:val="0"/>
                 <w:bCs w:val="0"/>
               </w:rPr>
@@ -8062,7 +8065,7 @@
             </w:r>
             <w:r>
               <w:rPr>
-                <w:rFonts w:cs="Times New Roman"/>
+                <w:rFonts w:ascii="Times New Roman" w:hAnsi="Times New Roman" w:cs="Times New Roman"/>
                 <w:b/>
                 <w:bCs/>
               </w:rPr>
@@ -8072,7 +8075,7 @@
           <w:p>
             <w:pPr>
               <w:rPr>
-                <w:rFonts w:cs="Times New Roman"/>
+                <w:rFonts w:ascii="Times New Roman" w:hAnsi="Times New Roman" w:cs="Times New Roman"/>
                 <w:lang w:eastAsia="en-AU"/>
               </w:rPr>
             </w:pPr>
@@ -8242,14 +8245,13 @@
               <w:rPr>
                 <w:color w:val="000000"/>
               </w:rPr>
-              <w:t xml:space="preserve">Synapxe HealthX </w:t>
+              <w:t xml:space="preserve">Synapxe HealthX innovation </w:t>
             </w:r>
             <w:r>
               <w:rPr>
                 <w:color w:val="000000"/>
               </w:rPr>
-              <w:lastRenderedPageBreak/>
-              <w:t>innovation sandbox</w:t>
+              <w:t>sandbox</w:t>
             </w:r>
           </w:p>
         </w:tc>
@@ -8268,15 +8270,7 @@
               <w:rPr>
                 <w:color w:val="000000"/>
               </w:rPr>
-              <w:lastRenderedPageBreak/>
-              <w:t xml:space="preserve">Provides an innovation and experimentation </w:t>
-            </w:r>
-            <w:r>
-              <w:rPr>
-                <w:color w:val="000000"/>
-              </w:rPr>
-              <w:lastRenderedPageBreak/>
-              <w:t>environment for healthcare technologies, supporting testing, prototyping and validation of digital health solutions and interoperability concepts within a healthcare ecosystem</w:t>
+              <w:t>Provides an innovation and experimentation environment for healthcare technologies, supporting testing, prototyping and validation of digital health solutions and interoperability concepts within a healthcare ecosystem</w:t>
             </w:r>
             <w:r>
               <w:rPr>
@@ -8313,15 +8307,7 @@
               <w:rPr>
                 <w:color w:val="000000"/>
               </w:rPr>
-              <w:lastRenderedPageBreak/>
-              <w:t xml:space="preserve">Innovation sandbox/ </w:t>
-            </w:r>
-            <w:r>
-              <w:rPr>
-                <w:color w:val="000000"/>
-              </w:rPr>
-              <w:lastRenderedPageBreak/>
-              <w:t>testing environment</w:t>
+              <w:t>Innovation sandbox/ testing environment</w:t>
             </w:r>
           </w:p>
         </w:tc>
@@ -8340,15 +8326,7 @@
               <w:rPr>
                 <w:color w:val="000000"/>
               </w:rPr>
-              <w:lastRenderedPageBreak/>
-              <w:t xml:space="preserve">Primarily focused on Singapore’s healthcare </w:t>
-            </w:r>
-            <w:r>
-              <w:rPr>
-                <w:color w:val="000000"/>
-              </w:rPr>
-              <w:lastRenderedPageBreak/>
-              <w:t>ecosystem different from Australian.</w:t>
+              <w:t>Primarily focused on Singapore’s healthcare ecosystem different from Australian.</w:t>
             </w:r>
           </w:p>
         </w:tc>
@@ -8367,7 +8345,6 @@
               <w:rPr>
                 <w:color w:val="000000"/>
               </w:rPr>
-              <w:lastRenderedPageBreak/>
               <w:t>Moderately relevant as a reference model for testing healthcare technologies</w:t>
             </w:r>
           </w:p>
@@ -8379,6 +8356,7 @@
         <w:textAlignment w:val="baseline"/>
       </w:pPr>
       <w:r>
+        <w:lastRenderedPageBreak/>
         <w:t xml:space="preserve">The comparison of existing healthcare sandbox platforms demonstrates that solutions such as </w:t>
       </w:r>
       <w:r>
@@ -8490,14 +8468,76 @@
         <w:rPr>
           <w:lang w:val="en-US"/>
         </w:rPr>
-        <w:t xml:space="preserve">The third gap is clinical text generation as to code clinical meaning. MedTalk does not only document doctor patient conversation, but it must also support structured output that can be coded using SNOMED CT-AU and translated where necessary into ICD-10-AM for MBS. </w:t>
+        <w:t xml:space="preserve">The third gap is clinical text generation as to code clinical meaning. MedTalk does not only document doctor patient conversation, but it must also support structured output that can be coded using SNOMED CT-AU and translated where necessary into ICD-10-AM for MBS. The existing integration approach does not provide an </w:t>
       </w:r>
       <w:r>
         <w:rPr>
           <w:lang w:val="en-US"/>
         </w:rPr>
+        <w:t>independent</w:t>
+      </w:r>
+      <w:r>
+        <w:rPr>
+          <w:lang w:val="en-US"/>
+        </w:rPr>
+        <w:t xml:space="preserve"> verification mechanism for consistently detecting semantics that are mismatches or dropped between the layers. The proposed dataset will close this gap by using synthetic records with known terminology mapping and checking the translation outcomes.</w:t>
+      </w:r>
+    </w:p>
+    <w:p>
+      <w:pPr>
+        <w:textAlignment w:val="baseline"/>
+        <w:rPr>
+          <w:lang w:val="en-US"/>
+        </w:rPr>
+      </w:pPr>
+      <w:r>
+        <w:rPr>
+          <w:lang w:val="en-US"/>
+        </w:rPr>
+        <w:t xml:space="preserve">The fourth gap is happy path testing as to resilience testing. In real world healthcare integrations fail because of delays, malformed payloads, dropped connections and incomplete data. If failure conditions are not tested before deployment, MedTalk may behave unpredictably when connected to external systems like failed transactions. This requires a testing environment that does repeatable error simulations. The test harness will test robustness by simulating slow systems, bad data and connection loss. </w:t>
+      </w:r>
+    </w:p>
+    <w:p>
+      <w:pPr>
+        <w:textAlignment w:val="baseline"/>
+        <w:rPr>
+          <w:lang w:val="en-US"/>
+        </w:rPr>
+      </w:pPr>
+    </w:p>
+    <w:p>
+      <w:pPr>
+        <w:textAlignment w:val="baseline"/>
+        <w:rPr>
+          <w:lang w:val="en-US"/>
+        </w:rPr>
+      </w:pPr>
+      <w:r>
+        <w:rPr>
+          <w:lang w:val="en-US"/>
+        </w:rPr>
+        <w:t xml:space="preserve">The fifth gap is manual validation as to reusable automation testing. When there is no automation, each release requires human checks which </w:t>
+      </w:r>
+      <w:proofErr w:type="gramStart"/>
+      <w:r>
+        <w:rPr>
+          <w:lang w:val="en-US"/>
+        </w:rPr>
+        <w:t>is</w:t>
+      </w:r>
+      <w:proofErr w:type="gramEnd"/>
+      <w:r>
+        <w:rPr>
+          <w:lang w:val="en-US"/>
+        </w:rPr>
+        <w:t xml:space="preserve"> slow and prone to errors. The </w:t>
+      </w:r>
+      <w:r>
+        <w:rPr>
+          <w:lang w:val="en-US"/>
+        </w:rPr>
         <w:lastRenderedPageBreak/>
-        <w:t>The existing integration approach does not provide an independent verification mechanism for consistently detecting semantics that are mismatches or dropped between the layers. The proposed dataset will close this gap by using synthetic records with known terminology mapping and checking the translation outcomes.</w:t>
+        <w:t>proposed solution introduces automatic test suite, making it easy to repeat scenarios, compare results and identify regression. This boosts engineering efficiency and release confidence.</w:t>
       </w:r>
     </w:p>
     <w:p>
@@ -8511,43 +8551,19 @@
         <w:rPr>
           <w:lang w:val="en-US"/>
         </w:rPr>
-        <w:t xml:space="preserve">The fourth gap is happy path testing as to resilience testing. In real world healthcare integrations fail because of delays, malformed payloads, dropped connections and incomplete data. If failure conditions are not tested before deployment, MedTalk may behave unpredictably when connected to external systems like failed transactions. This requires a testing environment that does repeatable error simulations. The test harness will test robustness by simulating slow systems, bad data and connection loss. </w:t>
-      </w:r>
-    </w:p>
-    <w:p>
-      <w:pPr>
-        <w:textAlignment w:val="baseline"/>
+        <w:t xml:space="preserve">The final gap is fragmented tooling as to a single validation workflow. Existing standards, terminology mapping and vendor interfaces each solve a separate problem, while MedTalk requires a unified controlled environment that brings them all together. Fragmented testing increases complexity and makes it difficult to establish consistent validation </w:t>
+      </w:r>
+      <w:r>
         <w:rPr>
           <w:lang w:val="en-US"/>
         </w:rPr>
-      </w:pPr>
-    </w:p>
-    <w:p>
-      <w:pPr>
-        <w:textAlignment w:val="baseline"/>
+        <w:t>processes</w:t>
+      </w:r>
+      <w:r>
         <w:rPr>
           <w:lang w:val="en-US"/>
         </w:rPr>
-      </w:pPr>
-      <w:r>
-        <w:rPr>
-          <w:lang w:val="en-US"/>
-        </w:rPr>
-        <w:t>The fifth gap is manual validation as to reusable automation testing. When there is no automation, each release requires human checks which is slow and prone to errors. The proposed solution introduces automatic test suite, making it easy to repeat scenarios, compare results and identify regression. This boosts engineering efficiency and release confidence.</w:t>
-      </w:r>
-    </w:p>
-    <w:p>
-      <w:pPr>
-        <w:textAlignment w:val="baseline"/>
-        <w:rPr>
-          <w:lang w:val="en-US"/>
-        </w:rPr>
-      </w:pPr>
-      <w:r>
-        <w:rPr>
-          <w:lang w:val="en-US"/>
-        </w:rPr>
-        <w:t>The final gap is fragmented tooling as to a single validation workflow. Existing standards, terminology mapping and vendor interfaces each solve a separate problem, while MedTalk requires a unified controlled environment that brings them all together. Fragmented testing increases complexity and makes it difficult to establish consistent validation processes. The proposed test harness closes this gap by merging standards-based messaging, terminology validation and performing automated testing.</w:t>
+        <w:t>. The proposed test harness closes this gap by merging standards-based messaging, terminology validation and performing automated testing.</w:t>
       </w:r>
     </w:p>
     <w:p>
@@ -8731,18 +8747,33 @@
     </w:p>
     <w:p>
       <w:pPr>
-        <w:rPr>
+        <w:pStyle w:val="Heading2"/>
+        <w:jc w:val="both"/>
+        <w:rPr>
+          <w:rFonts w:ascii="Times New Roman" w:eastAsia="Times New Roman" w:hAnsi="Times New Roman" w:cs="Times New Roman"/>
+          <w:color w:val="auto"/>
+          <w:sz w:val="24"/>
+          <w:szCs w:val="24"/>
           <w:lang w:val="en-GB" w:eastAsia="en-GB"/>
         </w:rPr>
       </w:pPr>
       <w:r>
         <w:rPr>
+          <w:rFonts w:ascii="Times New Roman" w:eastAsia="Times New Roman" w:hAnsi="Times New Roman" w:cs="Times New Roman"/>
+          <w:color w:val="auto"/>
+          <w:sz w:val="24"/>
+          <w:szCs w:val="24"/>
           <w:lang w:val="en-GB" w:eastAsia="en-GB"/>
         </w:rPr>
+        <w:lastRenderedPageBreak/>
         <w:t>Validated data is represented using FHIR R4 objects and passed to the interoperability testing layer</w:t>
       </w:r>
       <w:r>
         <w:rPr>
+          <w:rFonts w:ascii="Times New Roman" w:eastAsia="Times New Roman" w:hAnsi="Times New Roman" w:cs="Times New Roman"/>
+          <w:color w:val="auto"/>
+          <w:sz w:val="24"/>
+          <w:szCs w:val="24"/>
           <w:lang w:val="en-GB" w:eastAsia="en-GB"/>
         </w:rPr>
         <w:t xml:space="preserve"> (</w:t>
@@ -8750,6 +8781,10 @@
       <w:proofErr w:type="spellStart"/>
       <w:r>
         <w:rPr>
+          <w:rFonts w:ascii="Times New Roman" w:eastAsia="Times New Roman" w:hAnsi="Times New Roman" w:cs="Times New Roman"/>
+          <w:color w:val="auto"/>
+          <w:sz w:val="24"/>
+          <w:szCs w:val="24"/>
           <w:lang w:val="en-GB" w:eastAsia="en-GB"/>
         </w:rPr>
         <w:t>Gruendner</w:t>
@@ -8757,44 +8792,62 @@
       <w:proofErr w:type="spellEnd"/>
       <w:r>
         <w:rPr>
+          <w:rFonts w:ascii="Times New Roman" w:eastAsia="Times New Roman" w:hAnsi="Times New Roman" w:cs="Times New Roman"/>
+          <w:color w:val="auto"/>
+          <w:sz w:val="24"/>
+          <w:szCs w:val="24"/>
           <w:lang w:val="en-GB" w:eastAsia="en-GB"/>
         </w:rPr>
-        <w:t xml:space="preserve"> et al., 2021).</w:t>
-      </w:r>
-      <w:r>
-        <w:rPr>
+        <w:t xml:space="preserve"> et al., 2021). </w:t>
+      </w:r>
+      <w:r>
+        <w:rPr>
+          <w:rFonts w:ascii="Times New Roman" w:eastAsia="Times New Roman" w:hAnsi="Times New Roman" w:cs="Times New Roman"/>
+          <w:color w:val="auto"/>
+          <w:sz w:val="24"/>
+          <w:szCs w:val="24"/>
           <w:lang w:val="en-GB" w:eastAsia="en-GB"/>
         </w:rPr>
-        <w:t xml:space="preserve"> </w:t>
-      </w:r>
-      <w:r>
-        <w:rPr>
+        <w:t xml:space="preserve"> In addition, HL7 v2 messages can be simulated in case it is required. Data will go through the terminology mapping stage, where representative clinical concepts will be mapped on SNOMED CT-AU, ICD-10-AM and MBS</w:t>
+      </w:r>
+      <w:r>
+        <w:rPr>
+          <w:rFonts w:ascii="Times New Roman" w:eastAsia="Times New Roman" w:hAnsi="Times New Roman" w:cs="Times New Roman"/>
+          <w:color w:val="auto"/>
+          <w:sz w:val="24"/>
+          <w:szCs w:val="24"/>
           <w:lang w:val="en-GB" w:eastAsia="en-GB"/>
         </w:rPr>
-        <w:t xml:space="preserve"> In addition, HL7 v2 messages can be simulated in case it is required. Data will go through the terminology mapping stage, where representative clinical concepts will be mapped on SNOMED CT-AU, ICD-10-AM and MBS</w:t>
-      </w:r>
-      <w:r>
-        <w:rPr>
+        <w:t xml:space="preserve"> (</w:t>
+      </w:r>
+      <w:proofErr w:type="spellStart"/>
+      <w:r>
+        <w:rPr>
+          <w:rFonts w:ascii="Times New Roman" w:eastAsia="Times New Roman" w:hAnsi="Times New Roman" w:cs="Times New Roman"/>
+          <w:color w:val="auto"/>
+          <w:sz w:val="24"/>
+          <w:szCs w:val="24"/>
           <w:lang w:val="en-GB" w:eastAsia="en-GB"/>
         </w:rPr>
-        <w:t xml:space="preserve"> (</w:t>
-      </w:r>
-      <w:proofErr w:type="spellStart"/>
-      <w:r>
-        <w:rPr>
+        <w:t>Giannangelo</w:t>
+      </w:r>
+      <w:proofErr w:type="spellEnd"/>
+      <w:r>
+        <w:rPr>
+          <w:rFonts w:ascii="Times New Roman" w:eastAsia="Times New Roman" w:hAnsi="Times New Roman" w:cs="Times New Roman"/>
+          <w:color w:val="auto"/>
+          <w:sz w:val="24"/>
+          <w:szCs w:val="24"/>
           <w:lang w:val="en-GB" w:eastAsia="en-GB"/>
         </w:rPr>
-        <w:t>Giannangelo</w:t>
-      </w:r>
-      <w:proofErr w:type="spellEnd"/>
-      <w:r>
-        <w:rPr>
-          <w:lang w:val="en-GB" w:eastAsia="en-GB"/>
-        </w:rPr>
         <w:t xml:space="preserve"> et al., 2012).</w:t>
       </w:r>
       <w:r>
         <w:rPr>
+          <w:rFonts w:ascii="Times New Roman" w:eastAsia="Times New Roman" w:hAnsi="Times New Roman" w:cs="Times New Roman"/>
+          <w:color w:val="auto"/>
+          <w:sz w:val="24"/>
+          <w:szCs w:val="24"/>
           <w:lang w:val="en-GB" w:eastAsia="en-GB"/>
         </w:rPr>
         <w:t xml:space="preserve"> Repository will provide a special terminology mapping chain that depicts this process.</w:t>
@@ -8821,7 +8874,6 @@
           <w:szCs w:val="24"/>
           <w:lang w:val="en-GB" w:eastAsia="en-GB"/>
         </w:rPr>
-        <w:lastRenderedPageBreak/>
         <w:drawing>
           <wp:inline distT="0" distB="0" distL="0" distR="0" wp14:anchorId="6B26B5B5" wp14:editId="4715E35B">
             <wp:extent cx="5943600" cy="586105"/>
@@ -8867,71 +8919,6 @@
     </w:p>
     <w:p>
       <w:pPr>
-        <w:rPr>
-          <w:lang w:val="en-GB" w:eastAsia="en-GB"/>
-        </w:rPr>
-      </w:pPr>
-      <w:r>
-        <w:rPr>
-          <w:lang w:val="en-GB" w:eastAsia="en-GB"/>
-        </w:rPr>
-        <w:t>Figure 4.1.</w:t>
-      </w:r>
-      <w:r>
-        <w:rPr>
-          <w:lang w:val="en-GB" w:eastAsia="en-GB"/>
-        </w:rPr>
-        <w:t>2</w:t>
-      </w:r>
-      <w:r>
-        <w:rPr>
-          <w:lang w:val="en-GB" w:eastAsia="en-GB"/>
-        </w:rPr>
-        <w:t xml:space="preserve"> Terminology Mapping Chain</w:t>
-      </w:r>
-    </w:p>
-    <w:p>
-      <w:pPr>
-        <w:rPr>
-          <w:lang w:val="en-GB" w:eastAsia="en-GB"/>
-        </w:rPr>
-      </w:pPr>
-      <w:r>
-        <w:rPr>
-          <w:lang w:val="en-GB" w:eastAsia="en-GB"/>
-        </w:rPr>
-        <w:t xml:space="preserve">Test execution layer performs normal, negative and degraded scenarios. These involve successful message exchange, malformed data, slow responses and dropped connections. The response from test execution layer is evaluated according to the expected outcome and stored for future analysis. Simulated connector layer provides simulated EMR integrations relevant to MedTalk Connect, which will allow testing connector </w:t>
-      </w:r>
-      <w:proofErr w:type="spellStart"/>
-      <w:r>
-        <w:rPr>
-          <w:lang w:val="en-GB" w:eastAsia="en-GB"/>
-        </w:rPr>
-        <w:t>behavior</w:t>
-      </w:r>
-      <w:proofErr w:type="spellEnd"/>
-      <w:r>
-        <w:rPr>
-          <w:lang w:val="en-GB" w:eastAsia="en-GB"/>
-        </w:rPr>
-        <w:t xml:space="preserve"> without having to connect the test harness to production clinical systems.</w:t>
-      </w:r>
-    </w:p>
-    <w:p>
-      <w:pPr>
-        <w:rPr>
-          <w:lang w:val="en-GB" w:eastAsia="en-GB"/>
-        </w:rPr>
-      </w:pPr>
-      <w:r>
-        <w:rPr>
-          <w:lang w:val="en-GB" w:eastAsia="en-GB"/>
-        </w:rPr>
-        <w:t>The primary trust boundaries are thus established between the authorized user and the test harness, between unvalidated and validated synthetic data and between internal test environment and simulated connectors. The authentication, access control, data validation, connector isolation and secure communication are proposed as a protection measure at these trust boundaries. Such design allows implementing all the necessary requirements of the project directly.</w:t>
-      </w:r>
-    </w:p>
-    <w:p>
-      <w:pPr>
         <w:pStyle w:val="Heading2"/>
         <w:jc w:val="both"/>
         <w:rPr>
@@ -8942,10 +8929,121 @@
           <w:lang w:val="en-GB" w:eastAsia="en-GB"/>
         </w:rPr>
       </w:pPr>
+      <w:r>
+        <w:rPr>
+          <w:rFonts w:ascii="Times New Roman" w:eastAsia="Times New Roman" w:hAnsi="Times New Roman" w:cs="Times New Roman"/>
+          <w:color w:val="auto"/>
+          <w:sz w:val="24"/>
+          <w:szCs w:val="24"/>
+          <w:lang w:val="en-GB" w:eastAsia="en-GB"/>
+        </w:rPr>
+        <w:t>Figure 4.1.</w:t>
+      </w:r>
+      <w:r>
+        <w:rPr>
+          <w:rFonts w:ascii="Times New Roman" w:eastAsia="Times New Roman" w:hAnsi="Times New Roman" w:cs="Times New Roman"/>
+          <w:color w:val="auto"/>
+          <w:sz w:val="24"/>
+          <w:szCs w:val="24"/>
+          <w:lang w:val="en-GB" w:eastAsia="en-GB"/>
+        </w:rPr>
+        <w:t>2</w:t>
+      </w:r>
+      <w:r>
+        <w:rPr>
+          <w:rFonts w:ascii="Times New Roman" w:eastAsia="Times New Roman" w:hAnsi="Times New Roman" w:cs="Times New Roman"/>
+          <w:color w:val="auto"/>
+          <w:sz w:val="24"/>
+          <w:szCs w:val="24"/>
+          <w:lang w:val="en-GB" w:eastAsia="en-GB"/>
+        </w:rPr>
+        <w:t xml:space="preserve"> Terminology Mapping Chain</w:t>
+      </w:r>
     </w:p>
     <w:p>
       <w:pPr>
         <w:pStyle w:val="Heading2"/>
+        <w:jc w:val="both"/>
+        <w:rPr>
+          <w:rFonts w:ascii="Times New Roman" w:eastAsia="Times New Roman" w:hAnsi="Times New Roman" w:cs="Times New Roman"/>
+          <w:color w:val="auto"/>
+          <w:sz w:val="24"/>
+          <w:szCs w:val="24"/>
+          <w:lang w:val="en-GB" w:eastAsia="en-GB"/>
+        </w:rPr>
+      </w:pPr>
+      <w:r>
+        <w:rPr>
+          <w:rFonts w:ascii="Times New Roman" w:eastAsia="Times New Roman" w:hAnsi="Times New Roman" w:cs="Times New Roman"/>
+          <w:color w:val="auto"/>
+          <w:sz w:val="24"/>
+          <w:szCs w:val="24"/>
+          <w:lang w:val="en-GB" w:eastAsia="en-GB"/>
+        </w:rPr>
+        <w:t xml:space="preserve">Test execution layer performs normal, negative and degraded scenarios. These involve successful message exchange, malformed data, slow responses and dropped connections. The response from test execution layer is evaluated according to the expected outcome and stored for future analysis. Simulated connector layer provides simulated EMR integrations relevant to MedTalk Connect, which will allow testing connector </w:t>
+      </w:r>
+      <w:proofErr w:type="spellStart"/>
+      <w:r>
+        <w:rPr>
+          <w:rFonts w:ascii="Times New Roman" w:eastAsia="Times New Roman" w:hAnsi="Times New Roman" w:cs="Times New Roman"/>
+          <w:color w:val="auto"/>
+          <w:sz w:val="24"/>
+          <w:szCs w:val="24"/>
+          <w:lang w:val="en-GB" w:eastAsia="en-GB"/>
+        </w:rPr>
+        <w:t>behavior</w:t>
+      </w:r>
+      <w:proofErr w:type="spellEnd"/>
+      <w:r>
+        <w:rPr>
+          <w:rFonts w:ascii="Times New Roman" w:eastAsia="Times New Roman" w:hAnsi="Times New Roman" w:cs="Times New Roman"/>
+          <w:color w:val="auto"/>
+          <w:sz w:val="24"/>
+          <w:szCs w:val="24"/>
+          <w:lang w:val="en-GB" w:eastAsia="en-GB"/>
+        </w:rPr>
+        <w:t xml:space="preserve"> without having to connect the test harness to production clinical systems.</w:t>
+      </w:r>
+    </w:p>
+    <w:p>
+      <w:pPr>
+        <w:pStyle w:val="Heading2"/>
+        <w:jc w:val="both"/>
+        <w:rPr>
+          <w:rFonts w:ascii="Times New Roman" w:eastAsia="Times New Roman" w:hAnsi="Times New Roman" w:cs="Times New Roman"/>
+          <w:color w:val="auto"/>
+          <w:sz w:val="24"/>
+          <w:szCs w:val="24"/>
+          <w:lang w:val="en-GB" w:eastAsia="en-GB"/>
+        </w:rPr>
+      </w:pPr>
+      <w:r>
+        <w:rPr>
+          <w:rFonts w:ascii="Times New Roman" w:eastAsia="Times New Roman" w:hAnsi="Times New Roman" w:cs="Times New Roman"/>
+          <w:color w:val="auto"/>
+          <w:sz w:val="24"/>
+          <w:szCs w:val="24"/>
+          <w:lang w:val="en-GB" w:eastAsia="en-GB"/>
+        </w:rPr>
+        <w:t>The primary trust boundaries are thus established between the authorized user and the test harness, between unvalidated and validated synthetic data and between internal test environment and simulated connectors. The authentication, access control, data validation, connector isolation and secure communication are proposed as a protection measure at these trust boundaries. Such design allows implementing all the necessary requirements of the project directly.</w:t>
+      </w:r>
+    </w:p>
+    <w:p>
+      <w:pPr>
+        <w:pStyle w:val="Heading2"/>
+        <w:jc w:val="both"/>
+        <w:rPr>
+          <w:rFonts w:ascii="Times New Roman" w:eastAsia="Times New Roman" w:hAnsi="Times New Roman" w:cs="Times New Roman"/>
+          <w:color w:val="auto"/>
+          <w:sz w:val="24"/>
+          <w:szCs w:val="24"/>
+          <w:lang w:val="en-GB" w:eastAsia="en-GB"/>
+        </w:rPr>
+      </w:pPr>
+    </w:p>
+    <w:p>
+      <w:pPr>
+        <w:pStyle w:val="Heading2"/>
       </w:pPr>
       <w:r>
         <w:t>4.2 Technology Stack and Justification</w:t>
@@ -8955,13 +9053,13 @@
       <w:pPr>
         <w:jc w:val="both"/>
         <w:rPr>
-          <w:rFonts w:eastAsia="Times New Roman" w:cs="Times New Roman"/>
+          <w:rFonts w:ascii="Times New Roman" w:eastAsia="Times New Roman" w:hAnsi="Times New Roman" w:cs="Times New Roman"/>
           <w:lang w:val="en-GB" w:eastAsia="en-GB"/>
         </w:rPr>
       </w:pPr>
       <w:r>
         <w:rPr>
-          <w:rFonts w:eastAsia="Times New Roman" w:cs="Times New Roman"/>
+          <w:rFonts w:ascii="Times New Roman" w:eastAsia="Times New Roman" w:hAnsi="Times New Roman" w:cs="Times New Roman"/>
           <w:lang w:val="en-GB" w:eastAsia="en-GB"/>
         </w:rPr>
         <w:t>The technology stack is chosen taking into consideration interoperability standards, needs of Australian healthcare system, security and cheapness of implementation. The selected technologies will enable implementing the Stage 1 architecture, laying a foundation for the Stage 2.</w:t>
@@ -8971,13 +9069,13 @@
       <w:pPr>
         <w:jc w:val="both"/>
         <w:rPr>
-          <w:rFonts w:eastAsia="Times New Roman" w:cs="Times New Roman"/>
+          <w:rFonts w:ascii="Times New Roman" w:eastAsia="Times New Roman" w:hAnsi="Times New Roman" w:cs="Times New Roman"/>
           <w:lang w:val="en-GB" w:eastAsia="en-GB"/>
         </w:rPr>
       </w:pPr>
       <w:r>
         <w:rPr>
-          <w:rFonts w:eastAsia="Times New Roman" w:cs="Times New Roman"/>
+          <w:rFonts w:ascii="Times New Roman" w:eastAsia="Times New Roman" w:hAnsi="Times New Roman" w:cs="Times New Roman"/>
           <w:lang w:val="en-GB" w:eastAsia="en-GB"/>
         </w:rPr>
         <w:t>React technology is used as the frontend framework because of the requirement to use the stateful and component-based interface (scenario builder, results of the live test, connector statuses) instead of several static pages; React technology, along with its ecosystem, will enable developing such an interface without paying license costs, which is possible due to the limitations of the project budget.  There are both Python (</w:t>
@@ -8985,7 +9083,7 @@
       <w:proofErr w:type="spellStart"/>
       <w:r>
         <w:rPr>
-          <w:rFonts w:eastAsia="Times New Roman" w:cs="Times New Roman"/>
+          <w:rFonts w:ascii="Times New Roman" w:eastAsia="Times New Roman" w:hAnsi="Times New Roman" w:cs="Times New Roman"/>
           <w:lang w:val="en-GB" w:eastAsia="en-GB"/>
         </w:rPr>
         <w:t>FastAPI</w:t>
@@ -8993,7 +9091,7 @@
       <w:proofErr w:type="spellEnd"/>
       <w:r>
         <w:rPr>
-          <w:rFonts w:eastAsia="Times New Roman" w:cs="Times New Roman"/>
+          <w:rFonts w:ascii="Times New Roman" w:eastAsia="Times New Roman" w:hAnsi="Times New Roman" w:cs="Times New Roman"/>
           <w:lang w:val="en-GB" w:eastAsia="en-GB"/>
         </w:rPr>
         <w:t>) and Node.js (Express) suggested as the backend languages, not as the single option, because any of these frameworks will be able to implement the sandbox FHIR API with equal level of efficiency and community; the actual choice will be decided by the knowledge of the team, not by any technological requirement.</w:t>
@@ -9027,9 +9125,9 @@
         <w:tblLook w:val="04A0" w:firstRow="1" w:lastRow="0" w:firstColumn="1" w:lastColumn="0" w:noHBand="0" w:noVBand="1"/>
       </w:tblPr>
       <w:tblGrid>
-        <w:gridCol w:w="1843"/>
-        <w:gridCol w:w="1935"/>
-        <w:gridCol w:w="2760"/>
+        <w:gridCol w:w="1865"/>
+        <w:gridCol w:w="1784"/>
+        <w:gridCol w:w="2889"/>
         <w:gridCol w:w="3635"/>
       </w:tblGrid>
       <w:tr>
@@ -9706,33 +9804,22 @@
     </w:tbl>
     <w:p>
       <w:pPr>
-        <w:rPr>
+        <w:pStyle w:val="Heading2"/>
+        <w:jc w:val="both"/>
+        <w:rPr>
+          <w:rFonts w:ascii="Times New Roman" w:eastAsia="Times New Roman" w:hAnsi="Times New Roman" w:cs="Times New Roman"/>
+          <w:color w:val="auto"/>
+          <w:sz w:val="24"/>
+          <w:szCs w:val="24"/>
           <w:lang w:val="en-GB" w:eastAsia="en-GB"/>
         </w:rPr>
       </w:pPr>
-    </w:p>
-    <w:p>
-      <w:pPr>
-        <w:rPr>
-          <w:lang w:val="en-GB" w:eastAsia="en-GB"/>
-        </w:rPr>
-      </w:pPr>
-      <w:r>
-        <w:rPr>
-          <w:lang w:val="en-GB" w:eastAsia="en-GB"/>
-        </w:rPr>
-        <w:br w:type="page"/>
-      </w:r>
-    </w:p>
-    <w:p>
-      <w:pPr>
-        <w:jc w:val="both"/>
-        <w:rPr>
-          <w:lang w:val="en-GB" w:eastAsia="en-GB"/>
-        </w:rPr>
-      </w:pPr>
-      <w:r>
-        <w:rPr>
+      <w:r>
+        <w:rPr>
+          <w:rFonts w:ascii="Times New Roman" w:eastAsia="Times New Roman" w:hAnsi="Times New Roman" w:cs="Times New Roman"/>
+          <w:color w:val="auto"/>
+          <w:sz w:val="24"/>
+          <w:szCs w:val="24"/>
           <w:lang w:val="en-GB" w:eastAsia="en-GB"/>
         </w:rPr>
         <w:lastRenderedPageBreak/>
@@ -9740,30 +9827,50 @@
       </w:r>
       <w:r>
         <w:rPr>
+          <w:rFonts w:ascii="Times New Roman" w:eastAsia="Times New Roman" w:hAnsi="Times New Roman" w:cs="Times New Roman"/>
+          <w:color w:val="auto"/>
+          <w:sz w:val="24"/>
+          <w:szCs w:val="24"/>
           <w:lang w:val="en-GB" w:eastAsia="en-GB"/>
         </w:rPr>
         <w:t xml:space="preserve"> (HL7 Australia, n.d.). </w:t>
       </w:r>
       <w:r>
         <w:rPr>
+          <w:rFonts w:ascii="Times New Roman" w:eastAsia="Times New Roman" w:hAnsi="Times New Roman" w:cs="Times New Roman"/>
+          <w:color w:val="auto"/>
+          <w:sz w:val="24"/>
+          <w:szCs w:val="24"/>
           <w:lang w:val="en-GB" w:eastAsia="en-GB"/>
         </w:rPr>
         <w:t xml:space="preserve"> HL7 v2 remains part of the complementary simulation capabilities but not a substitute for FHIR. The terminology standards (SNOMED CT-AU, ICD-10-AM, MBS) serve as the foundation for clinical and billing mapping testing, whereas SMART on FHIR and OAuth 2.0 become the proposed authentication </w:t>
       </w:r>
       <w:r>
         <w:rPr>
+          <w:rFonts w:ascii="Times New Roman" w:eastAsia="Times New Roman" w:hAnsi="Times New Roman" w:cs="Times New Roman"/>
+          <w:color w:val="auto"/>
+          <w:sz w:val="24"/>
+          <w:szCs w:val="24"/>
           <w:lang w:val="en-GB" w:eastAsia="en-GB"/>
         </w:rPr>
         <w:t xml:space="preserve">approach (SMART Health IT, n.d.). </w:t>
       </w:r>
       <w:r>
         <w:rPr>
+          <w:rFonts w:ascii="Times New Roman" w:eastAsia="Times New Roman" w:hAnsi="Times New Roman" w:cs="Times New Roman"/>
+          <w:color w:val="auto"/>
+          <w:sz w:val="24"/>
+          <w:szCs w:val="24"/>
           <w:lang w:val="en-GB" w:eastAsia="en-GB"/>
         </w:rPr>
         <w:t>Docker becomes a Stage 2 implementation technology and not the pre-existing solution due to the scope of work, where no test harness implementation takes place in Stage 1. Postman/Newman becomes part of the solution besides the unit-testing platform since the API validation comes from an external protocol level that the unit testing cannot handle</w:t>
       </w:r>
       <w:r>
         <w:rPr>
+          <w:rFonts w:ascii="Times New Roman" w:eastAsia="Times New Roman" w:hAnsi="Times New Roman" w:cs="Times New Roman"/>
+          <w:color w:val="auto"/>
+          <w:sz w:val="24"/>
+          <w:szCs w:val="24"/>
           <w:lang w:val="en-GB" w:eastAsia="en-GB"/>
         </w:rPr>
         <w:t xml:space="preserve"> (</w:t>
@@ -9771,6 +9878,10 @@
       <w:proofErr w:type="spellStart"/>
       <w:r>
         <w:rPr>
+          <w:rFonts w:ascii="Times New Roman" w:eastAsia="Times New Roman" w:hAnsi="Times New Roman" w:cs="Times New Roman"/>
+          <w:color w:val="auto"/>
+          <w:sz w:val="24"/>
+          <w:szCs w:val="24"/>
           <w:lang w:val="en-GB" w:eastAsia="en-GB"/>
         </w:rPr>
         <w:t>Gruendner</w:t>
@@ -9778,6 +9889,10 @@
       <w:proofErr w:type="spellEnd"/>
       <w:r>
         <w:rPr>
+          <w:rFonts w:ascii="Times New Roman" w:eastAsia="Times New Roman" w:hAnsi="Times New Roman" w:cs="Times New Roman"/>
+          <w:color w:val="auto"/>
+          <w:sz w:val="24"/>
+          <w:szCs w:val="24"/>
           <w:lang w:val="en-GB" w:eastAsia="en-GB"/>
         </w:rPr>
         <w:t xml:space="preserve"> et al., 2021).</w:t>
@@ -9872,10 +9987,10 @@
         <w:tblLook w:val="04A0" w:firstRow="1" w:lastRow="0" w:firstColumn="1" w:lastColumn="0" w:noHBand="0" w:noVBand="1"/>
       </w:tblPr>
       <w:tblGrid>
-        <w:gridCol w:w="2405"/>
-        <w:gridCol w:w="3223"/>
-        <w:gridCol w:w="1220"/>
-        <w:gridCol w:w="2168"/>
+        <w:gridCol w:w="2374"/>
+        <w:gridCol w:w="3268"/>
+        <w:gridCol w:w="1186"/>
+        <w:gridCol w:w="2188"/>
       </w:tblGrid>
       <w:tr>
         <w:trPr>
@@ -10653,109 +10768,10 @@
     </w:p>
     <w:p>
       <w:pPr>
-        <w:pStyle w:val="NormalWeb"/>
-        <w:jc w:val="both"/>
-      </w:pPr>
-      <w:r>
-        <w:rPr>
-          <w:noProof/>
-          <w14:ligatures w14:val="standardContextual"/>
-        </w:rPr>
-        <w:lastRenderedPageBreak/>
-        <w:drawing>
-          <wp:inline distT="0" distB="0" distL="0" distR="0" wp14:anchorId="0426236E" wp14:editId="020FE4F1">
-            <wp:extent cx="5731510" cy="3783330"/>
-            <wp:effectExtent l="0" t="0" r="0" b="1270"/>
-            <wp:docPr id="976933799" name="Picture 2"/>
-            <wp:cNvGraphicFramePr>
-              <a:graphicFrameLocks xmlns:a="http://schemas.openxmlformats.org/drawingml/2006/main" noChangeAspect="1"/>
-            </wp:cNvGraphicFramePr>
-            <a:graphic xmlns:a="http://schemas.openxmlformats.org/drawingml/2006/main">
-              <a:graphicData uri="http://schemas.openxmlformats.org/drawingml/2006/picture">
-                <pic:pic xmlns:pic="http://schemas.openxmlformats.org/drawingml/2006/picture">
-                  <pic:nvPicPr>
-                    <pic:cNvPr id="976933799" name="Picture 976933799"/>
-                    <pic:cNvPicPr/>
-                  </pic:nvPicPr>
-                  <pic:blipFill>
-                    <a:blip r:embed="rId13" cstate="print">
-                      <a:extLst>
-                        <a:ext uri="{28A0092B-C50C-407E-A947-70E740481C1C}">
-                          <a14:useLocalDpi xmlns:a14="http://schemas.microsoft.com/office/drawing/2010/main" val="0"/>
-                        </a:ext>
-                      </a:extLst>
-                    </a:blip>
-                    <a:stretch>
-                      <a:fillRect/>
-                    </a:stretch>
-                  </pic:blipFill>
-                  <pic:spPr>
-                    <a:xfrm>
-                      <a:off x="0" y="0"/>
-                      <a:ext cx="5731510" cy="3783330"/>
-                    </a:xfrm>
-                    <a:prstGeom prst="rect">
-                      <a:avLst/>
-                    </a:prstGeom>
-                  </pic:spPr>
-                </pic:pic>
-              </a:graphicData>
-            </a:graphic>
-          </wp:inline>
-        </w:drawing>
-      </w:r>
-    </w:p>
-    <w:p>
-      <w:pPr>
-        <w:pStyle w:val="NormalWeb"/>
-        <w:jc w:val="both"/>
-        <w:rPr>
-          <w:b/>
-          <w:bCs/>
-        </w:rPr>
-      </w:pPr>
-      <w:r>
-        <w:rPr>
-          <w:b/>
-          <w:bCs/>
-        </w:rPr>
-        <w:t>Figure 4.3.0:</w:t>
-      </w:r>
-      <w:r>
-        <w:rPr>
-          <w:b/>
-          <w:bCs/>
-        </w:rPr>
-        <w:t xml:space="preserve"> </w:t>
-      </w:r>
-      <w:r>
-        <w:rPr>
-          <w:b/>
-          <w:bCs/>
-        </w:rPr>
-        <w:t>Threat model</w:t>
-      </w:r>
-    </w:p>
-    <w:p>
-      <w:pPr>
-        <w:pStyle w:val="NormalWeb"/>
-        <w:jc w:val="both"/>
-      </w:pPr>
-      <w:r>
-        <w:t>This figure extends the design presented in Section 4.1 by assigning the STRIDE threats across the three trust boundaries that have been defined previously. Clinicians and testers access the design via two separate but authenticated methods: a federated SMART on FHIR launch and a sandbox token login, both traversing Trust Boundary 1 via the identity gateway. The data travels through the scenario building, validating synthetic data (Boundary 2), terminology mapping, and tests, finally arriving at simulated EMR connectors (Boundary 3). The two threat actors used for analysis in the design — an external attacker testing credentials and a malicious insider posing a risk of configuration drift — are represented with vectors pointing at the threatened boundaries. A panel showing asset categorisation lists data at rest, data in transit, and credentials/secrets, and STRIDE matrix (R-01-R-05) is included linking risks with their assets and mitigations</w:t>
-      </w:r>
-      <w:r>
-        <w:t xml:space="preserve"> as shown in the table below</w:t>
-      </w:r>
-      <w:r>
-        <w:t>.</w:t>
-      </w:r>
-    </w:p>
-    <w:p>
-      <w:pPr>
-        <w:rPr>
-          <w:rFonts w:eastAsia="Times New Roman" w:cs="Times New Roman"/>
+        <w:rPr>
+          <w:rFonts w:ascii="Times New Roman" w:eastAsia="Times New Roman" w:hAnsi="Times New Roman" w:cs="Times New Roman"/>
           <w:kern w:val="0"/>
+          <w:sz w:val="24"/>
           <w:szCs w:val="24"/>
           <w:lang w:val="en-GB" w:eastAsia="en-GB"/>
           <w14:ligatures w14:val="none"/>
@@ -10767,1249 +10783,60 @@
     </w:p>
     <w:p>
       <w:pPr>
-        <w:pStyle w:val="NormalWeb"/>
-        <w:rPr>
+        <w:pStyle w:val="Heading2"/>
+      </w:pPr>
+      <w:r>
+        <w:lastRenderedPageBreak/>
+        <w:t>4.4 Capital and Non-Capital Cost Estimation</w:t>
+      </w:r>
+    </w:p>
+    <w:p>
+      <w:pPr>
+        <w:jc w:val="both"/>
+        <w:rPr>
+          <w:rFonts w:ascii="Times New Roman" w:eastAsia="Times New Roman" w:hAnsi="Times New Roman" w:cs="Times New Roman"/>
+          <w:lang w:val="en-GB" w:eastAsia="en-GB"/>
+        </w:rPr>
+      </w:pPr>
+      <w:r>
+        <w:rPr>
+          <w:rFonts w:ascii="Times New Roman" w:eastAsia="Times New Roman" w:hAnsi="Times New Roman" w:cs="Times New Roman"/>
+          <w:lang w:val="en-GB" w:eastAsia="en-GB"/>
+        </w:rPr>
+        <w:t>The solution suggested has an indirect financial impact as stage 1 is related to design, and it can be implemented using only free-tier and open-source tools, according to the report. As stated in the report, there is no budget allocated for any client or College, and there is also no allocation of cloud services, so students must use free-tier and open-source software.</w:t>
+      </w:r>
+    </w:p>
+    <w:p>
+      <w:pPr>
+        <w:jc w:val="both"/>
+        <w:rPr>
+          <w:rFonts w:ascii="Times New Roman" w:eastAsia="Times New Roman" w:hAnsi="Times New Roman" w:cs="Times New Roman"/>
           <w:b/>
           <w:bCs/>
-        </w:rPr>
-      </w:pPr>
-      <w:r>
-        <w:rPr>
+          <w:lang w:val="en-GB" w:eastAsia="en-GB"/>
+        </w:rPr>
+      </w:pPr>
+      <w:r>
+        <w:rPr>
+          <w:rFonts w:ascii="Times New Roman" w:eastAsia="Times New Roman" w:hAnsi="Times New Roman" w:cs="Times New Roman"/>
           <w:b/>
           <w:bCs/>
-        </w:rPr>
-        <w:lastRenderedPageBreak/>
-        <w:t>Table 4.3.2 Stride Table</w:t>
+          <w:lang w:val="en-GB" w:eastAsia="en-GB"/>
+        </w:rPr>
+        <w:t>Table 4.4.1: Cost category and estimation</w:t>
       </w:r>
     </w:p>
     <w:tbl>
       <w:tblPr>
-        <w:tblStyle w:val="TableGridLight"/>
-        <w:tblW w:w="10207" w:type="dxa"/>
-        <w:tblInd w:w="-431" w:type="dxa"/>
+        <w:tblStyle w:val="PlainTable1"/>
+        <w:tblW w:w="0" w:type="auto"/>
         <w:tblLook w:val="04A0" w:firstRow="1" w:lastRow="0" w:firstColumn="1" w:lastColumn="0" w:noHBand="0" w:noVBand="1"/>
       </w:tblPr>
       <w:tblGrid>
-        <w:gridCol w:w="912"/>
-        <w:gridCol w:w="2349"/>
-        <w:gridCol w:w="1276"/>
-        <w:gridCol w:w="1197"/>
-        <w:gridCol w:w="2347"/>
-        <w:gridCol w:w="2126"/>
-      </w:tblGrid>
-      <w:tr>
-        <w:tc>
-          <w:tcPr>
-            <w:tcW w:w="912" w:type="dxa"/>
-            <w:hideMark/>
-          </w:tcPr>
-          <w:p>
-            <w:pPr>
-              <w:jc w:val="center"/>
-              <w:rPr>
-                <w:rFonts w:ascii="Arial" w:eastAsia="Times New Roman" w:hAnsi="Arial" w:cs="Arial"/>
-                <w:b/>
-                <w:bCs/>
-                <w:kern w:val="0"/>
-                <w:sz w:val="21"/>
-                <w:szCs w:val="21"/>
-                <w:lang w:val="en-GB" w:eastAsia="en-GB"/>
-                <w14:ligatures w14:val="none"/>
-              </w:rPr>
-            </w:pPr>
-            <w:r>
-              <w:rPr>
-                <w:rFonts w:ascii="Arial" w:eastAsia="Times New Roman" w:hAnsi="Arial" w:cs="Arial"/>
-                <w:b/>
-                <w:bCs/>
-                <w:kern w:val="0"/>
-                <w:sz w:val="21"/>
-                <w:szCs w:val="21"/>
-                <w:lang w:val="en-GB" w:eastAsia="en-GB"/>
-                <w14:ligatures w14:val="none"/>
-              </w:rPr>
-              <w:t>ID</w:t>
-            </w:r>
-          </w:p>
-        </w:tc>
-        <w:tc>
-          <w:tcPr>
-            <w:tcW w:w="2349" w:type="dxa"/>
-            <w:hideMark/>
-          </w:tcPr>
-          <w:p>
-            <w:pPr>
-              <w:jc w:val="center"/>
-              <w:rPr>
-                <w:rFonts w:ascii="Arial" w:eastAsia="Times New Roman" w:hAnsi="Arial" w:cs="Arial"/>
-                <w:b/>
-                <w:bCs/>
-                <w:kern w:val="0"/>
-                <w:sz w:val="21"/>
-                <w:szCs w:val="21"/>
-                <w:lang w:val="en-GB" w:eastAsia="en-GB"/>
-                <w14:ligatures w14:val="none"/>
-              </w:rPr>
-            </w:pPr>
-            <w:r>
-              <w:rPr>
-                <w:rFonts w:ascii="Arial" w:eastAsia="Times New Roman" w:hAnsi="Arial" w:cs="Arial"/>
-                <w:b/>
-                <w:bCs/>
-                <w:kern w:val="0"/>
-                <w:sz w:val="21"/>
-                <w:szCs w:val="21"/>
-                <w:lang w:val="en-GB" w:eastAsia="en-GB"/>
-                <w14:ligatures w14:val="none"/>
-              </w:rPr>
-              <w:t>Risk Description</w:t>
-            </w:r>
-          </w:p>
-        </w:tc>
-        <w:tc>
-          <w:tcPr>
-            <w:tcW w:w="1276" w:type="dxa"/>
-            <w:hideMark/>
-          </w:tcPr>
-          <w:p>
-            <w:pPr>
-              <w:jc w:val="center"/>
-              <w:rPr>
-                <w:rFonts w:ascii="Arial" w:eastAsia="Times New Roman" w:hAnsi="Arial" w:cs="Arial"/>
-                <w:b/>
-                <w:bCs/>
-                <w:kern w:val="0"/>
-                <w:sz w:val="21"/>
-                <w:szCs w:val="21"/>
-                <w:lang w:val="en-GB" w:eastAsia="en-GB"/>
-                <w14:ligatures w14:val="none"/>
-              </w:rPr>
-            </w:pPr>
-            <w:r>
-              <w:rPr>
-                <w:rFonts w:ascii="Arial" w:eastAsia="Times New Roman" w:hAnsi="Arial" w:cs="Arial"/>
-                <w:b/>
-                <w:bCs/>
-                <w:kern w:val="0"/>
-                <w:sz w:val="21"/>
-                <w:szCs w:val="21"/>
-                <w:lang w:val="en-GB" w:eastAsia="en-GB"/>
-                <w14:ligatures w14:val="none"/>
-              </w:rPr>
-              <w:t>STRIDE Category</w:t>
-            </w:r>
-          </w:p>
-        </w:tc>
-        <w:tc>
-          <w:tcPr>
-            <w:tcW w:w="1197" w:type="dxa"/>
-            <w:hideMark/>
-          </w:tcPr>
-          <w:p>
-            <w:pPr>
-              <w:jc w:val="center"/>
-              <w:rPr>
-                <w:rFonts w:ascii="Arial" w:eastAsia="Times New Roman" w:hAnsi="Arial" w:cs="Arial"/>
-                <w:b/>
-                <w:bCs/>
-                <w:kern w:val="0"/>
-                <w:sz w:val="21"/>
-                <w:szCs w:val="21"/>
-                <w:lang w:val="en-GB" w:eastAsia="en-GB"/>
-                <w14:ligatures w14:val="none"/>
-              </w:rPr>
-            </w:pPr>
-            <w:r>
-              <w:rPr>
-                <w:rFonts w:ascii="Arial" w:eastAsia="Times New Roman" w:hAnsi="Arial" w:cs="Arial"/>
-                <w:b/>
-                <w:bCs/>
-                <w:kern w:val="0"/>
-                <w:sz w:val="21"/>
-                <w:szCs w:val="21"/>
-                <w:lang w:val="en-GB" w:eastAsia="en-GB"/>
-                <w14:ligatures w14:val="none"/>
-              </w:rPr>
-              <w:t>Boundary</w:t>
-            </w:r>
-          </w:p>
-        </w:tc>
-        <w:tc>
-          <w:tcPr>
-            <w:tcW w:w="2347" w:type="dxa"/>
-            <w:hideMark/>
-          </w:tcPr>
-          <w:p>
-            <w:pPr>
-              <w:jc w:val="center"/>
-              <w:rPr>
-                <w:rFonts w:ascii="Arial" w:eastAsia="Times New Roman" w:hAnsi="Arial" w:cs="Arial"/>
-                <w:b/>
-                <w:bCs/>
-                <w:kern w:val="0"/>
-                <w:sz w:val="21"/>
-                <w:szCs w:val="21"/>
-                <w:lang w:val="en-GB" w:eastAsia="en-GB"/>
-                <w14:ligatures w14:val="none"/>
-              </w:rPr>
-            </w:pPr>
-            <w:r>
-              <w:rPr>
-                <w:rFonts w:ascii="Arial" w:eastAsia="Times New Roman" w:hAnsi="Arial" w:cs="Arial"/>
-                <w:b/>
-                <w:bCs/>
-                <w:kern w:val="0"/>
-                <w:sz w:val="21"/>
-                <w:szCs w:val="21"/>
-                <w:lang w:val="en-GB" w:eastAsia="en-GB"/>
-                <w14:ligatures w14:val="none"/>
-              </w:rPr>
-              <w:t>Asset(s) Affected</w:t>
-            </w:r>
-          </w:p>
-        </w:tc>
-        <w:tc>
-          <w:tcPr>
-            <w:tcW w:w="2126" w:type="dxa"/>
-            <w:hideMark/>
-          </w:tcPr>
-          <w:p>
-            <w:pPr>
-              <w:jc w:val="center"/>
-              <w:rPr>
-                <w:rFonts w:ascii="Arial" w:eastAsia="Times New Roman" w:hAnsi="Arial" w:cs="Arial"/>
-                <w:b/>
-                <w:bCs/>
-                <w:kern w:val="0"/>
-                <w:sz w:val="21"/>
-                <w:szCs w:val="21"/>
-                <w:lang w:val="en-GB" w:eastAsia="en-GB"/>
-                <w14:ligatures w14:val="none"/>
-              </w:rPr>
-            </w:pPr>
-            <w:r>
-              <w:rPr>
-                <w:rFonts w:ascii="Arial" w:eastAsia="Times New Roman" w:hAnsi="Arial" w:cs="Arial"/>
-                <w:b/>
-                <w:bCs/>
-                <w:kern w:val="0"/>
-                <w:sz w:val="21"/>
-                <w:szCs w:val="21"/>
-                <w:lang w:val="en-GB" w:eastAsia="en-GB"/>
-                <w14:ligatures w14:val="none"/>
-              </w:rPr>
-              <w:t>Mitigation</w:t>
-            </w:r>
-          </w:p>
-        </w:tc>
-      </w:tr>
-      <w:tr>
-        <w:tc>
-          <w:tcPr>
-            <w:tcW w:w="912" w:type="dxa"/>
-            <w:hideMark/>
-          </w:tcPr>
-          <w:p>
-            <w:pPr>
-              <w:rPr>
-                <w:rFonts w:ascii="Arial" w:eastAsia="Times New Roman" w:hAnsi="Arial" w:cs="Arial"/>
-                <w:kern w:val="0"/>
-                <w:sz w:val="21"/>
-                <w:szCs w:val="21"/>
-                <w:lang w:val="en-GB" w:eastAsia="en-GB"/>
-                <w14:ligatures w14:val="none"/>
-              </w:rPr>
-            </w:pPr>
-            <w:r>
-              <w:rPr>
-                <w:rFonts w:ascii="Arial" w:eastAsia="Times New Roman" w:hAnsi="Arial" w:cs="Arial"/>
-                <w:b/>
-                <w:bCs/>
-                <w:kern w:val="0"/>
-                <w:sz w:val="21"/>
-                <w:szCs w:val="21"/>
-                <w:lang w:val="en-GB" w:eastAsia="en-GB"/>
-                <w14:ligatures w14:val="none"/>
-              </w:rPr>
-              <w:t>R-01</w:t>
-            </w:r>
-          </w:p>
-        </w:tc>
-        <w:tc>
-          <w:tcPr>
-            <w:tcW w:w="2349" w:type="dxa"/>
-            <w:hideMark/>
-          </w:tcPr>
-          <w:p>
-            <w:pPr>
-              <w:rPr>
-                <w:rFonts w:ascii="Arial" w:eastAsia="Times New Roman" w:hAnsi="Arial" w:cs="Arial"/>
-                <w:kern w:val="0"/>
-                <w:sz w:val="21"/>
-                <w:szCs w:val="21"/>
-                <w:lang w:val="en-GB" w:eastAsia="en-GB"/>
-                <w14:ligatures w14:val="none"/>
-              </w:rPr>
-            </w:pPr>
-            <w:r>
-              <w:rPr>
-                <w:rFonts w:ascii="Arial" w:eastAsia="Times New Roman" w:hAnsi="Arial" w:cs="Arial"/>
-                <w:kern w:val="0"/>
-                <w:sz w:val="21"/>
-                <w:szCs w:val="21"/>
-                <w:lang w:val="en-GB" w:eastAsia="en-GB"/>
-                <w14:ligatures w14:val="none"/>
-              </w:rPr>
-              <w:t>Fake or replayed credential reaches the identity gateway</w:t>
-            </w:r>
-          </w:p>
-        </w:tc>
-        <w:tc>
-          <w:tcPr>
-            <w:tcW w:w="1276" w:type="dxa"/>
-            <w:hideMark/>
-          </w:tcPr>
-          <w:p>
-            <w:pPr>
-              <w:rPr>
-                <w:rFonts w:ascii="Arial" w:eastAsia="Times New Roman" w:hAnsi="Arial" w:cs="Arial"/>
-                <w:kern w:val="0"/>
-                <w:sz w:val="21"/>
-                <w:szCs w:val="21"/>
-                <w:lang w:val="en-GB" w:eastAsia="en-GB"/>
-                <w14:ligatures w14:val="none"/>
-              </w:rPr>
-            </w:pPr>
-            <w:r>
-              <w:rPr>
-                <w:rFonts w:ascii="Arial" w:eastAsia="Times New Roman" w:hAnsi="Arial" w:cs="Arial"/>
-                <w:kern w:val="0"/>
-                <w:sz w:val="21"/>
-                <w:szCs w:val="21"/>
-                <w:lang w:val="en-GB" w:eastAsia="en-GB"/>
-                <w14:ligatures w14:val="none"/>
-              </w:rPr>
-              <w:t>Spoofing</w:t>
-            </w:r>
-          </w:p>
-        </w:tc>
-        <w:tc>
-          <w:tcPr>
-            <w:tcW w:w="1197" w:type="dxa"/>
-            <w:hideMark/>
-          </w:tcPr>
-          <w:p>
-            <w:pPr>
-              <w:rPr>
-                <w:rFonts w:ascii="Arial" w:eastAsia="Times New Roman" w:hAnsi="Arial" w:cs="Arial"/>
-                <w:kern w:val="0"/>
-                <w:sz w:val="21"/>
-                <w:szCs w:val="21"/>
-                <w:lang w:val="en-GB" w:eastAsia="en-GB"/>
-                <w14:ligatures w14:val="none"/>
-              </w:rPr>
-            </w:pPr>
-            <w:r>
-              <w:rPr>
-                <w:rFonts w:ascii="Arial" w:eastAsia="Times New Roman" w:hAnsi="Arial" w:cs="Arial"/>
-                <w:kern w:val="0"/>
-                <w:sz w:val="21"/>
-                <w:szCs w:val="21"/>
-                <w:lang w:val="en-GB" w:eastAsia="en-GB"/>
-                <w14:ligatures w14:val="none"/>
-              </w:rPr>
-              <w:t>B1</w:t>
-            </w:r>
-          </w:p>
-        </w:tc>
-        <w:tc>
-          <w:tcPr>
-            <w:tcW w:w="2347" w:type="dxa"/>
-            <w:hideMark/>
-          </w:tcPr>
-          <w:p>
-            <w:pPr>
-              <w:rPr>
-                <w:rFonts w:ascii="Arial" w:eastAsia="Times New Roman" w:hAnsi="Arial" w:cs="Arial"/>
-                <w:kern w:val="0"/>
-                <w:sz w:val="21"/>
-                <w:szCs w:val="21"/>
-                <w:lang w:val="en-GB" w:eastAsia="en-GB"/>
-                <w14:ligatures w14:val="none"/>
-              </w:rPr>
-            </w:pPr>
-            <w:r>
-              <w:rPr>
-                <w:rFonts w:ascii="Arial" w:eastAsia="Times New Roman" w:hAnsi="Arial" w:cs="Arial"/>
-                <w:kern w:val="0"/>
-                <w:sz w:val="21"/>
-                <w:szCs w:val="21"/>
-                <w:lang w:val="en-GB" w:eastAsia="en-GB"/>
-                <w14:ligatures w14:val="none"/>
-              </w:rPr>
-              <w:t>Credentials &amp; Secrets</w:t>
-            </w:r>
-            <w:r>
-              <w:rPr>
-                <w:rFonts w:ascii="Arial" w:eastAsia="Times New Roman" w:hAnsi="Arial" w:cs="Arial"/>
-                <w:kern w:val="0"/>
-                <w:sz w:val="21"/>
-                <w:szCs w:val="21"/>
-                <w:lang w:val="en-GB" w:eastAsia="en-GB"/>
-                <w14:ligatures w14:val="none"/>
-              </w:rPr>
-              <w:br/>
-              <w:t>(OAuth token)</w:t>
-            </w:r>
-          </w:p>
-        </w:tc>
-        <w:tc>
-          <w:tcPr>
-            <w:tcW w:w="2126" w:type="dxa"/>
-            <w:hideMark/>
-          </w:tcPr>
-          <w:p>
-            <w:pPr>
-              <w:rPr>
-                <w:rFonts w:ascii="Arial" w:eastAsia="Times New Roman" w:hAnsi="Arial" w:cs="Arial"/>
-                <w:kern w:val="0"/>
-                <w:sz w:val="21"/>
-                <w:szCs w:val="21"/>
-                <w:lang w:val="en-GB" w:eastAsia="en-GB"/>
-                <w14:ligatures w14:val="none"/>
-              </w:rPr>
-            </w:pPr>
-            <w:r>
-              <w:rPr>
-                <w:rFonts w:ascii="Arial" w:eastAsia="Times New Roman" w:hAnsi="Arial" w:cs="Arial"/>
-                <w:kern w:val="0"/>
-                <w:sz w:val="21"/>
-                <w:szCs w:val="21"/>
-                <w:lang w:val="en-GB" w:eastAsia="en-GB"/>
-                <w14:ligatures w14:val="none"/>
-              </w:rPr>
-              <w:t>SMART on FHIR + OAuth 2.0; short-lived tokens</w:t>
-            </w:r>
-          </w:p>
-        </w:tc>
-      </w:tr>
-      <w:tr>
-        <w:tc>
-          <w:tcPr>
-            <w:tcW w:w="912" w:type="dxa"/>
-            <w:hideMark/>
-          </w:tcPr>
-          <w:p>
-            <w:pPr>
-              <w:rPr>
-                <w:rFonts w:ascii="Arial" w:eastAsia="Times New Roman" w:hAnsi="Arial" w:cs="Arial"/>
-                <w:kern w:val="0"/>
-                <w:sz w:val="21"/>
-                <w:szCs w:val="21"/>
-                <w:lang w:val="en-GB" w:eastAsia="en-GB"/>
-                <w14:ligatures w14:val="none"/>
-              </w:rPr>
-            </w:pPr>
-            <w:r>
-              <w:rPr>
-                <w:rFonts w:ascii="Arial" w:eastAsia="Times New Roman" w:hAnsi="Arial" w:cs="Arial"/>
-                <w:b/>
-                <w:bCs/>
-                <w:kern w:val="0"/>
-                <w:sz w:val="21"/>
-                <w:szCs w:val="21"/>
-                <w:lang w:val="en-GB" w:eastAsia="en-GB"/>
-                <w14:ligatures w14:val="none"/>
-              </w:rPr>
-              <w:t>R-02</w:t>
-            </w:r>
-          </w:p>
-        </w:tc>
-        <w:tc>
-          <w:tcPr>
-            <w:tcW w:w="2349" w:type="dxa"/>
-            <w:hideMark/>
-          </w:tcPr>
-          <w:p>
-            <w:pPr>
-              <w:rPr>
-                <w:rFonts w:ascii="Arial" w:eastAsia="Times New Roman" w:hAnsi="Arial" w:cs="Arial"/>
-                <w:kern w:val="0"/>
-                <w:sz w:val="21"/>
-                <w:szCs w:val="21"/>
-                <w:lang w:val="en-GB" w:eastAsia="en-GB"/>
-                <w14:ligatures w14:val="none"/>
-              </w:rPr>
-            </w:pPr>
-            <w:r>
-              <w:rPr>
-                <w:rFonts w:ascii="Arial" w:eastAsia="Times New Roman" w:hAnsi="Arial" w:cs="Arial"/>
-                <w:kern w:val="0"/>
-                <w:sz w:val="21"/>
-                <w:szCs w:val="21"/>
-                <w:lang w:val="en-GB" w:eastAsia="en-GB"/>
-                <w14:ligatures w14:val="none"/>
-              </w:rPr>
-              <w:t>Tester's sandbox token reused to perform clinician-only actions</w:t>
-            </w:r>
-          </w:p>
-        </w:tc>
-        <w:tc>
-          <w:tcPr>
-            <w:tcW w:w="1276" w:type="dxa"/>
-            <w:hideMark/>
-          </w:tcPr>
-          <w:p>
-            <w:pPr>
-              <w:rPr>
-                <w:rFonts w:ascii="Arial" w:eastAsia="Times New Roman" w:hAnsi="Arial" w:cs="Arial"/>
-                <w:kern w:val="0"/>
-                <w:sz w:val="21"/>
-                <w:szCs w:val="21"/>
-                <w:lang w:val="en-GB" w:eastAsia="en-GB"/>
-                <w14:ligatures w14:val="none"/>
-              </w:rPr>
-            </w:pPr>
-            <w:r>
-              <w:rPr>
-                <w:rFonts w:ascii="Arial" w:eastAsia="Times New Roman" w:hAnsi="Arial" w:cs="Arial"/>
-                <w:kern w:val="0"/>
-                <w:sz w:val="21"/>
-                <w:szCs w:val="21"/>
-                <w:lang w:val="en-GB" w:eastAsia="en-GB"/>
-                <w14:ligatures w14:val="none"/>
-              </w:rPr>
-              <w:t>Elevation of Privilege</w:t>
-            </w:r>
-          </w:p>
-        </w:tc>
-        <w:tc>
-          <w:tcPr>
-            <w:tcW w:w="1197" w:type="dxa"/>
-            <w:hideMark/>
-          </w:tcPr>
-          <w:p>
-            <w:pPr>
-              <w:rPr>
-                <w:rFonts w:ascii="Arial" w:eastAsia="Times New Roman" w:hAnsi="Arial" w:cs="Arial"/>
-                <w:kern w:val="0"/>
-                <w:sz w:val="21"/>
-                <w:szCs w:val="21"/>
-                <w:lang w:val="en-GB" w:eastAsia="en-GB"/>
-                <w14:ligatures w14:val="none"/>
-              </w:rPr>
-            </w:pPr>
-            <w:r>
-              <w:rPr>
-                <w:rFonts w:ascii="Arial" w:eastAsia="Times New Roman" w:hAnsi="Arial" w:cs="Arial"/>
-                <w:kern w:val="0"/>
-                <w:sz w:val="21"/>
-                <w:szCs w:val="21"/>
-                <w:lang w:val="en-GB" w:eastAsia="en-GB"/>
-                <w14:ligatures w14:val="none"/>
-              </w:rPr>
-              <w:t>B1</w:t>
-            </w:r>
-          </w:p>
-        </w:tc>
-        <w:tc>
-          <w:tcPr>
-            <w:tcW w:w="2347" w:type="dxa"/>
-            <w:hideMark/>
-          </w:tcPr>
-          <w:p>
-            <w:pPr>
-              <w:rPr>
-                <w:rFonts w:ascii="Arial" w:eastAsia="Times New Roman" w:hAnsi="Arial" w:cs="Arial"/>
-                <w:kern w:val="0"/>
-                <w:sz w:val="21"/>
-                <w:szCs w:val="21"/>
-                <w:lang w:val="en-GB" w:eastAsia="en-GB"/>
-                <w14:ligatures w14:val="none"/>
-              </w:rPr>
-            </w:pPr>
-            <w:r>
-              <w:rPr>
-                <w:rFonts w:ascii="Arial" w:eastAsia="Times New Roman" w:hAnsi="Arial" w:cs="Arial"/>
-                <w:kern w:val="0"/>
-                <w:sz w:val="21"/>
-                <w:szCs w:val="21"/>
-                <w:lang w:val="en-GB" w:eastAsia="en-GB"/>
-                <w14:ligatures w14:val="none"/>
-              </w:rPr>
-              <w:t>Credentials &amp; Secrets</w:t>
-            </w:r>
-            <w:r>
-              <w:rPr>
-                <w:rFonts w:ascii="Arial" w:eastAsia="Times New Roman" w:hAnsi="Arial" w:cs="Arial"/>
-                <w:kern w:val="0"/>
-                <w:sz w:val="21"/>
-                <w:szCs w:val="21"/>
-                <w:lang w:val="en-GB" w:eastAsia="en-GB"/>
-                <w14:ligatures w14:val="none"/>
-              </w:rPr>
-              <w:br/>
-              <w:t>(sandbox client secret)</w:t>
-            </w:r>
-          </w:p>
-        </w:tc>
-        <w:tc>
-          <w:tcPr>
-            <w:tcW w:w="2126" w:type="dxa"/>
-            <w:hideMark/>
-          </w:tcPr>
-          <w:p>
-            <w:pPr>
-              <w:rPr>
-                <w:rFonts w:ascii="Arial" w:eastAsia="Times New Roman" w:hAnsi="Arial" w:cs="Arial"/>
-                <w:kern w:val="0"/>
-                <w:sz w:val="21"/>
-                <w:szCs w:val="21"/>
-                <w:lang w:val="en-GB" w:eastAsia="en-GB"/>
-                <w14:ligatures w14:val="none"/>
-              </w:rPr>
-            </w:pPr>
-            <w:r>
-              <w:rPr>
-                <w:rFonts w:ascii="Arial" w:eastAsia="Times New Roman" w:hAnsi="Arial" w:cs="Arial"/>
-                <w:kern w:val="0"/>
-                <w:sz w:val="21"/>
-                <w:szCs w:val="21"/>
-                <w:lang w:val="en-GB" w:eastAsia="en-GB"/>
-                <w14:ligatures w14:val="none"/>
-              </w:rPr>
-              <w:t>Role-based access control; tenant isolation</w:t>
-            </w:r>
-          </w:p>
-        </w:tc>
-      </w:tr>
-      <w:tr>
-        <w:tc>
-          <w:tcPr>
-            <w:tcW w:w="912" w:type="dxa"/>
-            <w:hideMark/>
-          </w:tcPr>
-          <w:p>
-            <w:pPr>
-              <w:rPr>
-                <w:rFonts w:ascii="Arial" w:eastAsia="Times New Roman" w:hAnsi="Arial" w:cs="Arial"/>
-                <w:kern w:val="0"/>
-                <w:sz w:val="21"/>
-                <w:szCs w:val="21"/>
-                <w:lang w:val="en-GB" w:eastAsia="en-GB"/>
-                <w14:ligatures w14:val="none"/>
-              </w:rPr>
-            </w:pPr>
-            <w:r>
-              <w:rPr>
-                <w:rFonts w:ascii="Arial" w:eastAsia="Times New Roman" w:hAnsi="Arial" w:cs="Arial"/>
-                <w:b/>
-                <w:bCs/>
-                <w:kern w:val="0"/>
-                <w:sz w:val="21"/>
-                <w:szCs w:val="21"/>
-                <w:lang w:val="en-GB" w:eastAsia="en-GB"/>
-                <w14:ligatures w14:val="none"/>
-              </w:rPr>
-              <w:t>R-03</w:t>
-            </w:r>
-          </w:p>
-        </w:tc>
-        <w:tc>
-          <w:tcPr>
-            <w:tcW w:w="2349" w:type="dxa"/>
-            <w:hideMark/>
-          </w:tcPr>
-          <w:p>
-            <w:pPr>
-              <w:rPr>
-                <w:rFonts w:ascii="Arial" w:eastAsia="Times New Roman" w:hAnsi="Arial" w:cs="Arial"/>
-                <w:kern w:val="0"/>
-                <w:sz w:val="21"/>
-                <w:szCs w:val="21"/>
-                <w:lang w:val="en-GB" w:eastAsia="en-GB"/>
-                <w14:ligatures w14:val="none"/>
-              </w:rPr>
-            </w:pPr>
-            <w:r>
-              <w:rPr>
-                <w:rFonts w:ascii="Arial" w:eastAsia="Times New Roman" w:hAnsi="Arial" w:cs="Arial"/>
-                <w:kern w:val="0"/>
-                <w:sz w:val="21"/>
-                <w:szCs w:val="21"/>
-                <w:lang w:val="en-GB" w:eastAsia="en-GB"/>
-                <w14:ligatures w14:val="none"/>
-              </w:rPr>
-              <w:t>Untrusted or drifted scenario/mapping configuration passed downstream</w:t>
-            </w:r>
-          </w:p>
-        </w:tc>
-        <w:tc>
-          <w:tcPr>
-            <w:tcW w:w="1276" w:type="dxa"/>
-            <w:hideMark/>
-          </w:tcPr>
-          <w:p>
-            <w:pPr>
-              <w:rPr>
-                <w:rFonts w:ascii="Arial" w:eastAsia="Times New Roman" w:hAnsi="Arial" w:cs="Arial"/>
-                <w:kern w:val="0"/>
-                <w:sz w:val="21"/>
-                <w:szCs w:val="21"/>
-                <w:lang w:val="en-GB" w:eastAsia="en-GB"/>
-                <w14:ligatures w14:val="none"/>
-              </w:rPr>
-            </w:pPr>
-            <w:r>
-              <w:rPr>
-                <w:rFonts w:ascii="Arial" w:eastAsia="Times New Roman" w:hAnsi="Arial" w:cs="Arial"/>
-                <w:kern w:val="0"/>
-                <w:sz w:val="21"/>
-                <w:szCs w:val="21"/>
-                <w:lang w:val="en-GB" w:eastAsia="en-GB"/>
-                <w14:ligatures w14:val="none"/>
-              </w:rPr>
-              <w:t>Tampering</w:t>
-            </w:r>
-          </w:p>
-        </w:tc>
-        <w:tc>
-          <w:tcPr>
-            <w:tcW w:w="1197" w:type="dxa"/>
-            <w:hideMark/>
-          </w:tcPr>
-          <w:p>
-            <w:pPr>
-              <w:rPr>
-                <w:rFonts w:ascii="Arial" w:eastAsia="Times New Roman" w:hAnsi="Arial" w:cs="Arial"/>
-                <w:kern w:val="0"/>
-                <w:sz w:val="21"/>
-                <w:szCs w:val="21"/>
-                <w:lang w:val="en-GB" w:eastAsia="en-GB"/>
-                <w14:ligatures w14:val="none"/>
-              </w:rPr>
-            </w:pPr>
-            <w:r>
-              <w:rPr>
-                <w:rFonts w:ascii="Arial" w:eastAsia="Times New Roman" w:hAnsi="Arial" w:cs="Arial"/>
-                <w:kern w:val="0"/>
-                <w:sz w:val="21"/>
-                <w:szCs w:val="21"/>
-                <w:lang w:val="en-GB" w:eastAsia="en-GB"/>
-                <w14:ligatures w14:val="none"/>
-              </w:rPr>
-              <w:t>B2</w:t>
-            </w:r>
-          </w:p>
-        </w:tc>
-        <w:tc>
-          <w:tcPr>
-            <w:tcW w:w="2347" w:type="dxa"/>
-            <w:hideMark/>
-          </w:tcPr>
-          <w:p>
-            <w:pPr>
-              <w:rPr>
-                <w:rFonts w:ascii="Arial" w:eastAsia="Times New Roman" w:hAnsi="Arial" w:cs="Arial"/>
-                <w:kern w:val="0"/>
-                <w:sz w:val="21"/>
-                <w:szCs w:val="21"/>
-                <w:lang w:val="en-GB" w:eastAsia="en-GB"/>
-                <w14:ligatures w14:val="none"/>
-              </w:rPr>
-            </w:pPr>
-            <w:r>
-              <w:rPr>
-                <w:rFonts w:ascii="Arial" w:eastAsia="Times New Roman" w:hAnsi="Arial" w:cs="Arial"/>
-                <w:kern w:val="0"/>
-                <w:sz w:val="21"/>
-                <w:szCs w:val="21"/>
-                <w:lang w:val="en-GB" w:eastAsia="en-GB"/>
-                <w14:ligatures w14:val="none"/>
-              </w:rPr>
-              <w:t>Data in Motion</w:t>
-            </w:r>
-            <w:r>
-              <w:rPr>
-                <w:rFonts w:ascii="Arial" w:eastAsia="Times New Roman" w:hAnsi="Arial" w:cs="Arial"/>
-                <w:kern w:val="0"/>
-                <w:sz w:val="21"/>
-                <w:szCs w:val="21"/>
-                <w:lang w:val="en-GB" w:eastAsia="en-GB"/>
-                <w14:ligatures w14:val="none"/>
-              </w:rPr>
-              <w:br/>
-              <w:t>(FHIR scenario payload)</w:t>
-            </w:r>
-          </w:p>
-        </w:tc>
-        <w:tc>
-          <w:tcPr>
-            <w:tcW w:w="2126" w:type="dxa"/>
-            <w:hideMark/>
-          </w:tcPr>
-          <w:p>
-            <w:pPr>
-              <w:rPr>
-                <w:rFonts w:ascii="Arial" w:eastAsia="Times New Roman" w:hAnsi="Arial" w:cs="Arial"/>
-                <w:kern w:val="0"/>
-                <w:sz w:val="21"/>
-                <w:szCs w:val="21"/>
-                <w:lang w:val="en-GB" w:eastAsia="en-GB"/>
-                <w14:ligatures w14:val="none"/>
-              </w:rPr>
-            </w:pPr>
-            <w:r>
-              <w:rPr>
-                <w:rFonts w:ascii="Arial" w:eastAsia="Times New Roman" w:hAnsi="Arial" w:cs="Arial"/>
-                <w:kern w:val="0"/>
-                <w:sz w:val="21"/>
-                <w:szCs w:val="21"/>
-                <w:lang w:val="en-GB" w:eastAsia="en-GB"/>
-                <w14:ligatures w14:val="none"/>
-              </w:rPr>
-              <w:t>Input validation on FHIR resources before execution</w:t>
-            </w:r>
-          </w:p>
-        </w:tc>
-      </w:tr>
-      <w:tr>
-        <w:tc>
-          <w:tcPr>
-            <w:tcW w:w="912" w:type="dxa"/>
-            <w:hideMark/>
-          </w:tcPr>
-          <w:p>
-            <w:pPr>
-              <w:rPr>
-                <w:rFonts w:ascii="Arial" w:eastAsia="Times New Roman" w:hAnsi="Arial" w:cs="Arial"/>
-                <w:kern w:val="0"/>
-                <w:sz w:val="21"/>
-                <w:szCs w:val="21"/>
-                <w:lang w:val="en-GB" w:eastAsia="en-GB"/>
-                <w14:ligatures w14:val="none"/>
-              </w:rPr>
-            </w:pPr>
-            <w:r>
-              <w:rPr>
-                <w:rFonts w:ascii="Arial" w:eastAsia="Times New Roman" w:hAnsi="Arial" w:cs="Arial"/>
-                <w:b/>
-                <w:bCs/>
-                <w:kern w:val="0"/>
-                <w:sz w:val="21"/>
-                <w:szCs w:val="21"/>
-                <w:lang w:val="en-GB" w:eastAsia="en-GB"/>
-                <w14:ligatures w14:val="none"/>
-              </w:rPr>
-              <w:t>R-04</w:t>
-            </w:r>
-          </w:p>
-        </w:tc>
-        <w:tc>
-          <w:tcPr>
-            <w:tcW w:w="2349" w:type="dxa"/>
-            <w:hideMark/>
-          </w:tcPr>
-          <w:p>
-            <w:pPr>
-              <w:rPr>
-                <w:rFonts w:ascii="Arial" w:eastAsia="Times New Roman" w:hAnsi="Arial" w:cs="Arial"/>
-                <w:kern w:val="0"/>
-                <w:sz w:val="21"/>
-                <w:szCs w:val="21"/>
-                <w:lang w:val="en-GB" w:eastAsia="en-GB"/>
-                <w14:ligatures w14:val="none"/>
-              </w:rPr>
-            </w:pPr>
-            <w:r>
-              <w:rPr>
-                <w:rFonts w:ascii="Arial" w:eastAsia="Times New Roman" w:hAnsi="Arial" w:cs="Arial"/>
-                <w:kern w:val="0"/>
-                <w:sz w:val="21"/>
-                <w:szCs w:val="21"/>
-                <w:lang w:val="en-GB" w:eastAsia="en-GB"/>
-                <w14:ligatures w14:val="none"/>
-              </w:rPr>
-              <w:t>Real-world identifier pattern slips into the synthetic data set</w:t>
-            </w:r>
-          </w:p>
-        </w:tc>
-        <w:tc>
-          <w:tcPr>
-            <w:tcW w:w="1276" w:type="dxa"/>
-            <w:hideMark/>
-          </w:tcPr>
-          <w:p>
-            <w:pPr>
-              <w:rPr>
-                <w:rFonts w:ascii="Arial" w:eastAsia="Times New Roman" w:hAnsi="Arial" w:cs="Arial"/>
-                <w:kern w:val="0"/>
-                <w:sz w:val="21"/>
-                <w:szCs w:val="21"/>
-                <w:lang w:val="en-GB" w:eastAsia="en-GB"/>
-                <w14:ligatures w14:val="none"/>
-              </w:rPr>
-            </w:pPr>
-            <w:r>
-              <w:rPr>
-                <w:rFonts w:ascii="Arial" w:eastAsia="Times New Roman" w:hAnsi="Arial" w:cs="Arial"/>
-                <w:kern w:val="0"/>
-                <w:sz w:val="21"/>
-                <w:szCs w:val="21"/>
-                <w:lang w:val="en-GB" w:eastAsia="en-GB"/>
-                <w14:ligatures w14:val="none"/>
-              </w:rPr>
-              <w:t>Information Disclosure</w:t>
-            </w:r>
-          </w:p>
-        </w:tc>
-        <w:tc>
-          <w:tcPr>
-            <w:tcW w:w="1197" w:type="dxa"/>
-            <w:hideMark/>
-          </w:tcPr>
-          <w:p>
-            <w:pPr>
-              <w:rPr>
-                <w:rFonts w:ascii="Arial" w:eastAsia="Times New Roman" w:hAnsi="Arial" w:cs="Arial"/>
-                <w:kern w:val="0"/>
-                <w:sz w:val="21"/>
-                <w:szCs w:val="21"/>
-                <w:lang w:val="en-GB" w:eastAsia="en-GB"/>
-                <w14:ligatures w14:val="none"/>
-              </w:rPr>
-            </w:pPr>
-            <w:r>
-              <w:rPr>
-                <w:rFonts w:ascii="Arial" w:eastAsia="Times New Roman" w:hAnsi="Arial" w:cs="Arial"/>
-                <w:kern w:val="0"/>
-                <w:sz w:val="21"/>
-                <w:szCs w:val="21"/>
-                <w:lang w:val="en-GB" w:eastAsia="en-GB"/>
-                <w14:ligatures w14:val="none"/>
-              </w:rPr>
-              <w:t>B2</w:t>
-            </w:r>
-          </w:p>
-        </w:tc>
-        <w:tc>
-          <w:tcPr>
-            <w:tcW w:w="2347" w:type="dxa"/>
-            <w:hideMark/>
-          </w:tcPr>
-          <w:p>
-            <w:pPr>
-              <w:rPr>
-                <w:rFonts w:ascii="Arial" w:eastAsia="Times New Roman" w:hAnsi="Arial" w:cs="Arial"/>
-                <w:kern w:val="0"/>
-                <w:sz w:val="21"/>
-                <w:szCs w:val="21"/>
-                <w:lang w:val="en-GB" w:eastAsia="en-GB"/>
-                <w14:ligatures w14:val="none"/>
-              </w:rPr>
-            </w:pPr>
-            <w:r>
-              <w:rPr>
-                <w:rFonts w:ascii="Arial" w:eastAsia="Times New Roman" w:hAnsi="Arial" w:cs="Arial"/>
-                <w:kern w:val="0"/>
-                <w:sz w:val="21"/>
-                <w:szCs w:val="21"/>
-                <w:lang w:val="en-GB" w:eastAsia="en-GB"/>
-                <w14:ligatures w14:val="none"/>
-              </w:rPr>
-              <w:t>Data at Rest</w:t>
-            </w:r>
-            <w:r>
-              <w:rPr>
-                <w:rFonts w:ascii="Arial" w:eastAsia="Times New Roman" w:hAnsi="Arial" w:cs="Arial"/>
-                <w:kern w:val="0"/>
-                <w:sz w:val="21"/>
-                <w:szCs w:val="21"/>
-                <w:lang w:val="en-GB" w:eastAsia="en-GB"/>
-                <w14:ligatures w14:val="none"/>
-              </w:rPr>
-              <w:br/>
-              <w:t>(synthetic patient records)</w:t>
-            </w:r>
-          </w:p>
-        </w:tc>
-        <w:tc>
-          <w:tcPr>
-            <w:tcW w:w="2126" w:type="dxa"/>
-            <w:hideMark/>
-          </w:tcPr>
-          <w:p>
-            <w:pPr>
-              <w:rPr>
-                <w:rFonts w:ascii="Arial" w:eastAsia="Times New Roman" w:hAnsi="Arial" w:cs="Arial"/>
-                <w:kern w:val="0"/>
-                <w:sz w:val="21"/>
-                <w:szCs w:val="21"/>
-                <w:lang w:val="en-GB" w:eastAsia="en-GB"/>
-                <w14:ligatures w14:val="none"/>
-              </w:rPr>
-            </w:pPr>
-            <w:r>
-              <w:rPr>
-                <w:rFonts w:ascii="Arial" w:eastAsia="Times New Roman" w:hAnsi="Arial" w:cs="Arial"/>
-                <w:kern w:val="0"/>
-                <w:sz w:val="21"/>
-                <w:szCs w:val="21"/>
-                <w:lang w:val="en-GB" w:eastAsia="en-GB"/>
-                <w14:ligatures w14:val="none"/>
-              </w:rPr>
-              <w:t>Luhn-check rejection of real AU IHI ranges (e.g. 800360 prefix)</w:t>
-            </w:r>
-          </w:p>
-        </w:tc>
-      </w:tr>
-      <w:tr>
-        <w:tc>
-          <w:tcPr>
-            <w:tcW w:w="912" w:type="dxa"/>
-            <w:hideMark/>
-          </w:tcPr>
-          <w:p>
-            <w:pPr>
-              <w:rPr>
-                <w:rFonts w:ascii="Arial" w:eastAsia="Times New Roman" w:hAnsi="Arial" w:cs="Arial"/>
-                <w:kern w:val="0"/>
-                <w:sz w:val="21"/>
-                <w:szCs w:val="21"/>
-                <w:lang w:val="en-GB" w:eastAsia="en-GB"/>
-                <w14:ligatures w14:val="none"/>
-              </w:rPr>
-            </w:pPr>
-            <w:r>
-              <w:rPr>
-                <w:rFonts w:ascii="Arial" w:eastAsia="Times New Roman" w:hAnsi="Arial" w:cs="Arial"/>
-                <w:b/>
-                <w:bCs/>
-                <w:kern w:val="0"/>
-                <w:sz w:val="21"/>
-                <w:szCs w:val="21"/>
-                <w:lang w:val="en-GB" w:eastAsia="en-GB"/>
-                <w14:ligatures w14:val="none"/>
-              </w:rPr>
-              <w:t>R-05</w:t>
-            </w:r>
-          </w:p>
-        </w:tc>
-        <w:tc>
-          <w:tcPr>
-            <w:tcW w:w="2349" w:type="dxa"/>
-            <w:hideMark/>
-          </w:tcPr>
-          <w:p>
-            <w:pPr>
-              <w:rPr>
-                <w:rFonts w:ascii="Arial" w:eastAsia="Times New Roman" w:hAnsi="Arial" w:cs="Arial"/>
-                <w:kern w:val="0"/>
-                <w:sz w:val="21"/>
-                <w:szCs w:val="21"/>
-                <w:lang w:val="en-GB" w:eastAsia="en-GB"/>
-                <w14:ligatures w14:val="none"/>
-              </w:rPr>
-            </w:pPr>
-            <w:r>
-              <w:rPr>
-                <w:rFonts w:ascii="Arial" w:eastAsia="Times New Roman" w:hAnsi="Arial" w:cs="Arial"/>
-                <w:kern w:val="0"/>
-                <w:sz w:val="21"/>
-                <w:szCs w:val="21"/>
-                <w:lang w:val="en-GB" w:eastAsia="en-GB"/>
-                <w14:ligatures w14:val="none"/>
-              </w:rPr>
-              <w:t>Malformed or flooded response from a simulated connector</w:t>
-            </w:r>
-          </w:p>
-        </w:tc>
-        <w:tc>
-          <w:tcPr>
-            <w:tcW w:w="1276" w:type="dxa"/>
-            <w:hideMark/>
-          </w:tcPr>
-          <w:p>
-            <w:pPr>
-              <w:rPr>
-                <w:rFonts w:ascii="Arial" w:eastAsia="Times New Roman" w:hAnsi="Arial" w:cs="Arial"/>
-                <w:kern w:val="0"/>
-                <w:sz w:val="21"/>
-                <w:szCs w:val="21"/>
-                <w:lang w:val="en-GB" w:eastAsia="en-GB"/>
-                <w14:ligatures w14:val="none"/>
-              </w:rPr>
-            </w:pPr>
-            <w:r>
-              <w:rPr>
-                <w:rFonts w:ascii="Arial" w:eastAsia="Times New Roman" w:hAnsi="Arial" w:cs="Arial"/>
-                <w:kern w:val="0"/>
-                <w:sz w:val="21"/>
-                <w:szCs w:val="21"/>
-                <w:lang w:val="en-GB" w:eastAsia="en-GB"/>
-                <w14:ligatures w14:val="none"/>
-              </w:rPr>
-              <w:t>Denial of Service</w:t>
-            </w:r>
-          </w:p>
-        </w:tc>
-        <w:tc>
-          <w:tcPr>
-            <w:tcW w:w="1197" w:type="dxa"/>
-            <w:hideMark/>
-          </w:tcPr>
-          <w:p>
-            <w:pPr>
-              <w:rPr>
-                <w:rFonts w:ascii="Arial" w:eastAsia="Times New Roman" w:hAnsi="Arial" w:cs="Arial"/>
-                <w:kern w:val="0"/>
-                <w:sz w:val="21"/>
-                <w:szCs w:val="21"/>
-                <w:lang w:val="en-GB" w:eastAsia="en-GB"/>
-                <w14:ligatures w14:val="none"/>
-              </w:rPr>
-            </w:pPr>
-            <w:r>
-              <w:rPr>
-                <w:rFonts w:ascii="Arial" w:eastAsia="Times New Roman" w:hAnsi="Arial" w:cs="Arial"/>
-                <w:kern w:val="0"/>
-                <w:sz w:val="21"/>
-                <w:szCs w:val="21"/>
-                <w:lang w:val="en-GB" w:eastAsia="en-GB"/>
-                <w14:ligatures w14:val="none"/>
-              </w:rPr>
-              <w:t>B3</w:t>
-            </w:r>
-          </w:p>
-        </w:tc>
-        <w:tc>
-          <w:tcPr>
-            <w:tcW w:w="2347" w:type="dxa"/>
-            <w:hideMark/>
-          </w:tcPr>
-          <w:p>
-            <w:pPr>
-              <w:rPr>
-                <w:rFonts w:ascii="Arial" w:eastAsia="Times New Roman" w:hAnsi="Arial" w:cs="Arial"/>
-                <w:kern w:val="0"/>
-                <w:sz w:val="21"/>
-                <w:szCs w:val="21"/>
-                <w:lang w:val="en-GB" w:eastAsia="en-GB"/>
-                <w14:ligatures w14:val="none"/>
-              </w:rPr>
-            </w:pPr>
-            <w:r>
-              <w:rPr>
-                <w:rFonts w:ascii="Arial" w:eastAsia="Times New Roman" w:hAnsi="Arial" w:cs="Arial"/>
-                <w:kern w:val="0"/>
-                <w:sz w:val="21"/>
-                <w:szCs w:val="21"/>
-                <w:lang w:val="en-GB" w:eastAsia="en-GB"/>
-                <w14:ligatures w14:val="none"/>
-              </w:rPr>
-              <w:t>Data in Motion</w:t>
-            </w:r>
-            <w:r>
-              <w:rPr>
-                <w:rFonts w:ascii="Arial" w:eastAsia="Times New Roman" w:hAnsi="Arial" w:cs="Arial"/>
-                <w:kern w:val="0"/>
-                <w:sz w:val="21"/>
-                <w:szCs w:val="21"/>
-                <w:lang w:val="en-GB" w:eastAsia="en-GB"/>
-                <w14:ligatures w14:val="none"/>
-              </w:rPr>
-              <w:br/>
-              <w:t>(FHIR / HL7v2 messages)</w:t>
-            </w:r>
-          </w:p>
-        </w:tc>
-        <w:tc>
-          <w:tcPr>
-            <w:tcW w:w="2126" w:type="dxa"/>
-            <w:hideMark/>
-          </w:tcPr>
-          <w:p>
-            <w:pPr>
-              <w:rPr>
-                <w:rFonts w:ascii="Arial" w:eastAsia="Times New Roman" w:hAnsi="Arial" w:cs="Arial"/>
-                <w:kern w:val="0"/>
-                <w:sz w:val="21"/>
-                <w:szCs w:val="21"/>
-                <w:lang w:val="en-GB" w:eastAsia="en-GB"/>
-                <w14:ligatures w14:val="none"/>
-              </w:rPr>
-            </w:pPr>
-            <w:r>
-              <w:rPr>
-                <w:rFonts w:ascii="Arial" w:eastAsia="Times New Roman" w:hAnsi="Arial" w:cs="Arial"/>
-                <w:kern w:val="0"/>
-                <w:sz w:val="21"/>
-                <w:szCs w:val="21"/>
-                <w:lang w:val="en-GB" w:eastAsia="en-GB"/>
-                <w14:ligatures w14:val="none"/>
-              </w:rPr>
-              <w:t>Structured error handling; rate limiting; connector isolation</w:t>
-            </w:r>
-          </w:p>
-        </w:tc>
-      </w:tr>
-    </w:tbl>
-    <w:p/>
-    <w:p>
-      <w:pPr>
-        <w:pStyle w:val="Heading2"/>
-      </w:pPr>
-      <w:r>
-        <w:t>4.4 Capital and Non-Capital Cost Estimation</w:t>
-      </w:r>
-    </w:p>
-    <w:p>
-      <w:pPr>
-        <w:jc w:val="both"/>
-        <w:rPr>
-          <w:rFonts w:eastAsia="Times New Roman" w:cs="Times New Roman"/>
-          <w:lang w:val="en-GB" w:eastAsia="en-GB"/>
-        </w:rPr>
-      </w:pPr>
-      <w:r>
-        <w:rPr>
-          <w:rFonts w:eastAsia="Times New Roman" w:cs="Times New Roman"/>
-          <w:lang w:val="en-GB" w:eastAsia="en-GB"/>
-        </w:rPr>
-        <w:t>The solution suggested has an indirect financial impact as stage 1 is related to design, and it can be implemented using only free-tier and open-source tools, according to the report. As stated in the report, there is no budget allocated for any client or College, and there is also no allocation of cloud services, so students must use free-tier and open-source software.</w:t>
-      </w:r>
-    </w:p>
-    <w:p>
-      <w:pPr>
-        <w:jc w:val="both"/>
-        <w:rPr>
-          <w:rFonts w:eastAsia="Times New Roman" w:cs="Times New Roman"/>
-          <w:b/>
-          <w:bCs/>
-          <w:lang w:val="en-GB" w:eastAsia="en-GB"/>
-        </w:rPr>
-      </w:pPr>
-      <w:r>
-        <w:rPr>
-          <w:rFonts w:eastAsia="Times New Roman" w:cs="Times New Roman"/>
-          <w:b/>
-          <w:bCs/>
-          <w:lang w:val="en-GB" w:eastAsia="en-GB"/>
-        </w:rPr>
-        <w:t>Table 4.4.1: Cost category and estimation</w:t>
-      </w:r>
-    </w:p>
-    <w:tbl>
-      <w:tblPr>
-        <w:tblStyle w:val="PlainTable1"/>
-        <w:tblW w:w="9776" w:type="dxa"/>
-        <w:tblLook w:val="04A0" w:firstRow="1" w:lastRow="0" w:firstColumn="1" w:lastColumn="0" w:noHBand="0" w:noVBand="1"/>
-      </w:tblPr>
-      <w:tblGrid>
-        <w:gridCol w:w="2877"/>
-        <w:gridCol w:w="1375"/>
-        <w:gridCol w:w="2831"/>
-        <w:gridCol w:w="2693"/>
+        <w:gridCol w:w="2890"/>
+        <w:gridCol w:w="1348"/>
+        <w:gridCol w:w="2251"/>
+        <w:gridCol w:w="2527"/>
       </w:tblGrid>
       <w:tr>
         <w:trPr>
@@ -12059,7 +10886,7 @@
         </w:tc>
         <w:tc>
           <w:tcPr>
-            <w:tcW w:w="2831" w:type="dxa"/>
+            <w:tcW w:w="0" w:type="auto"/>
             <w:hideMark/>
           </w:tcPr>
           <w:p>
@@ -12082,7 +10909,7 @@
         </w:tc>
         <w:tc>
           <w:tcPr>
-            <w:tcW w:w="2693" w:type="dxa"/>
+            <w:tcW w:w="0" w:type="auto"/>
             <w:hideMark/>
           </w:tcPr>
           <w:p>
@@ -12142,7 +10969,7 @@
         </w:tc>
         <w:tc>
           <w:tcPr>
-            <w:tcW w:w="2831" w:type="dxa"/>
+            <w:tcW w:w="0" w:type="auto"/>
             <w:hideMark/>
           </w:tcPr>
           <w:p>
@@ -12156,7 +10983,7 @@
         </w:tc>
         <w:tc>
           <w:tcPr>
-            <w:tcW w:w="2693" w:type="dxa"/>
+            <w:tcW w:w="0" w:type="auto"/>
             <w:hideMark/>
           </w:tcPr>
           <w:p>
@@ -12198,7 +11025,7 @@
         </w:tc>
         <w:tc>
           <w:tcPr>
-            <w:tcW w:w="2831" w:type="dxa"/>
+            <w:tcW w:w="0" w:type="auto"/>
             <w:hideMark/>
           </w:tcPr>
           <w:p>
@@ -12212,7 +11039,7 @@
         </w:tc>
         <w:tc>
           <w:tcPr>
-            <w:tcW w:w="2693" w:type="dxa"/>
+            <w:tcW w:w="0" w:type="auto"/>
             <w:hideMark/>
           </w:tcPr>
           <w:p>
@@ -12257,7 +11084,7 @@
         </w:tc>
         <w:tc>
           <w:tcPr>
-            <w:tcW w:w="2831" w:type="dxa"/>
+            <w:tcW w:w="0" w:type="auto"/>
             <w:hideMark/>
           </w:tcPr>
           <w:p>
@@ -12271,7 +11098,7 @@
         </w:tc>
         <w:tc>
           <w:tcPr>
-            <w:tcW w:w="2693" w:type="dxa"/>
+            <w:tcW w:w="0" w:type="auto"/>
             <w:hideMark/>
           </w:tcPr>
           <w:p>
@@ -12313,7 +11140,7 @@
         </w:tc>
         <w:tc>
           <w:tcPr>
-            <w:tcW w:w="2831" w:type="dxa"/>
+            <w:tcW w:w="0" w:type="auto"/>
             <w:hideMark/>
           </w:tcPr>
           <w:p>
@@ -12327,7 +11154,7 @@
         </w:tc>
         <w:tc>
           <w:tcPr>
-            <w:tcW w:w="2693" w:type="dxa"/>
+            <w:tcW w:w="0" w:type="auto"/>
             <w:hideMark/>
           </w:tcPr>
           <w:p>
@@ -12372,7 +11199,7 @@
         </w:tc>
         <w:tc>
           <w:tcPr>
-            <w:tcW w:w="2831" w:type="dxa"/>
+            <w:tcW w:w="0" w:type="auto"/>
             <w:hideMark/>
           </w:tcPr>
           <w:p>
@@ -12386,7 +11213,7 @@
         </w:tc>
         <w:tc>
           <w:tcPr>
-            <w:tcW w:w="2693" w:type="dxa"/>
+            <w:tcW w:w="0" w:type="auto"/>
             <w:hideMark/>
           </w:tcPr>
           <w:p>
@@ -12404,16 +11231,24 @@
       <w:pPr>
         <w:jc w:val="both"/>
         <w:rPr>
-          <w:rFonts w:eastAsia="Times New Roman" w:cs="Times New Roman"/>
+          <w:rFonts w:ascii="Times New Roman" w:eastAsia="Times New Roman" w:hAnsi="Times New Roman" w:cs="Times New Roman"/>
           <w:lang w:val="en-GB" w:eastAsia="en-GB"/>
         </w:rPr>
       </w:pPr>
-      <w:r>
-        <w:rPr>
-          <w:rFonts w:eastAsia="Times New Roman" w:cs="Times New Roman"/>
+    </w:p>
+    <w:p>
+      <w:pPr>
+        <w:jc w:val="both"/>
+        <w:rPr>
+          <w:rFonts w:ascii="Times New Roman" w:eastAsia="Times New Roman" w:hAnsi="Times New Roman" w:cs="Times New Roman"/>
           <w:lang w:val="en-GB" w:eastAsia="en-GB"/>
         </w:rPr>
-        <w:lastRenderedPageBreak/>
+      </w:pPr>
+      <w:r>
+        <w:rPr>
+          <w:rFonts w:ascii="Times New Roman" w:eastAsia="Times New Roman" w:hAnsi="Times New Roman" w:cs="Times New Roman"/>
+          <w:lang w:val="en-GB" w:eastAsia="en-GB"/>
+        </w:rPr>
         <w:t>Labour is not considered as part of the expense for the student project; an organisational implementation will require accounting for labour associated with engineering and support.</w:t>
       </w:r>
     </w:p>
@@ -12423,7 +11258,7 @@
       </w:pPr>
       <w:r>
         <w:rPr>
-          <w:rFonts w:eastAsia="Times New Roman" w:cs="Times New Roman"/>
+          <w:rFonts w:ascii="Times New Roman" w:eastAsia="Times New Roman" w:hAnsi="Times New Roman" w:cs="Times New Roman"/>
           <w:lang w:val="en-GB" w:eastAsia="en-GB"/>
         </w:rPr>
         <w:t>The solution will have a number of cost advantages beyond its low cost to implement. For instance, the creation of a synthetic reusable testing environment can limit testing near production and make repeat testing of the connectors possible, while reducing risks of privacy incidents or unknown issues of interoperability. It might also help to decrease testing efforts with the addition of new connectors. But it is not possible to determine a reliable financial return on investment or break-even point, as there is no information about the costs related to testing or incidents in the available project data, labour rates or expected savings of the implementation – the invention of such a number would be inappropriate.</w:t>
@@ -12439,6 +11274,7 @@
         </w:rPr>
       </w:pPr>
       <w:r>
+        <w:lastRenderedPageBreak/>
         <w:t>5. Proof of Concept, and Evaluation</w:t>
       </w:r>
       <w:bookmarkEnd w:id="17"/>
@@ -12521,7 +11357,7 @@
       <w:r>
         <w:t xml:space="preserve">Attorney-General's Department. (n.d.). Document Verification Service (DVS). Australian Government. </w:t>
       </w:r>
-      <w:hyperlink r:id="rId14" w:history="1">
+      <w:hyperlink r:id="rId13" w:history="1">
         <w:r>
           <w:rPr>
             <w:rStyle w:val="Hyperlink"/>
@@ -12545,7 +11381,7 @@
       <w:r>
         <w:t xml:space="preserve">). </w:t>
       </w:r>
-      <w:hyperlink r:id="rId15" w:history="1">
+      <w:hyperlink r:id="rId14" w:history="1">
         <w:r>
           <w:rPr>
             <w:rStyle w:val="Hyperlink"/>
@@ -12569,7 +11405,7 @@
       <w:r>
         <w:t xml:space="preserve">). </w:t>
       </w:r>
-      <w:hyperlink r:id="rId16" w:history="1">
+      <w:hyperlink r:id="rId15" w:history="1">
         <w:r>
           <w:rPr>
             <w:rStyle w:val="Hyperlink"/>
@@ -12605,7 +11441,7 @@
         </w:rPr>
         <w:t xml:space="preserve">. Bonami Software. </w:t>
       </w:r>
-      <w:hyperlink r:id="rId17" w:history="1">
+      <w:hyperlink r:id="rId16" w:history="1">
         <w:r>
           <w:rPr>
             <w:rStyle w:val="Hyperlink"/>
@@ -12670,7 +11506,7 @@
         </w:rPr>
         <w:t xml:space="preserve">. </w:t>
       </w:r>
-      <w:hyperlink r:id="rId18" w:history="1">
+      <w:hyperlink r:id="rId17" w:history="1">
         <w:r>
           <w:rPr>
             <w:rStyle w:val="Hyperlink"/>
@@ -12724,25 +11560,15 @@
           <w:iCs/>
           <w:color w:val="000000"/>
         </w:rPr>
-        <w:t xml:space="preserve"> Resource </w:t>
-      </w:r>
-      <w:proofErr w:type="spellStart"/>
-      <w:r>
-        <w:rPr>
-          <w:i/>
-          <w:iCs/>
+        <w:t xml:space="preserve"> Resource Center</w:t>
+      </w:r>
+      <w:r>
+        <w:rPr>
           <w:color w:val="000000"/>
         </w:rPr>
-        <w:t>Center</w:t>
-      </w:r>
-      <w:proofErr w:type="spellEnd"/>
-      <w:r>
-        <w:rPr>
-          <w:color w:val="000000"/>
-        </w:rPr>
         <w:t xml:space="preserve">. Healthit.Gov. </w:t>
       </w:r>
-      <w:hyperlink r:id="rId19" w:history="1">
+      <w:hyperlink r:id="rId18" w:history="1">
         <w:r>
           <w:rPr>
             <w:rStyle w:val="Hyperlink"/>
@@ -12773,7 +11599,6 @@
           <w:iCs/>
           <w:color w:val="000000"/>
         </w:rPr>
-        <w:lastRenderedPageBreak/>
         <w:t>For practices - Halo Connect Documentation</w:t>
       </w:r>
       <w:r>
@@ -12817,7 +11642,7 @@
       <w:r>
         <w:t xml:space="preserve"> </w:t>
       </w:r>
-      <w:hyperlink r:id="rId20" w:history="1">
+      <w:hyperlink r:id="rId19" w:history="1">
         <w:r>
           <w:rPr>
             <w:rStyle w:val="Hyperlink"/>
@@ -12838,7 +11663,7 @@
       <w:r>
         <w:t xml:space="preserve">, J., Gulden, C., Kampf, M., Mate, S., Prokosch, H.-U., &amp; Zierk, J. (2021). A framework for criteria-based selection and processing of Fast Healthcare Interoperability Resources (FHIR) data for statistical analysis: Design and implementation study. JMIR Medical Informatics, 9(4), e25645. </w:t>
       </w:r>
-      <w:hyperlink r:id="rId21" w:history="1">
+      <w:hyperlink r:id="rId20" w:history="1">
         <w:r>
           <w:rPr>
             <w:rStyle w:val="Hyperlink"/>
@@ -12854,7 +11679,7 @@
       <w:r>
         <w:t xml:space="preserve">HL7 Australia. (n.d.). AU Core Implementation Guide (v1.0.0). HL7 International. </w:t>
       </w:r>
-      <w:hyperlink r:id="rId22" w:history="1">
+      <w:hyperlink r:id="rId21" w:history="1">
         <w:r>
           <w:rPr>
             <w:rStyle w:val="Hyperlink"/>
@@ -12868,9 +11693,10 @@
         <w:ind w:left="720" w:hanging="720"/>
       </w:pPr>
       <w:r>
+        <w:lastRenderedPageBreak/>
         <w:t xml:space="preserve">HL7 International. (2019). HL7 FHIR Release 4 (R4). </w:t>
       </w:r>
-      <w:hyperlink r:id="rId23" w:history="1">
+      <w:hyperlink r:id="rId22" w:history="1">
         <w:r>
           <w:rPr>
             <w:rStyle w:val="Hyperlink"/>
@@ -12928,7 +11754,7 @@
         </w:rPr>
         <w:t xml:space="preserve">. </w:t>
       </w:r>
-      <w:hyperlink r:id="rId24" w:history="1">
+      <w:hyperlink r:id="rId23" w:history="1">
         <w:r>
           <w:rPr>
             <w:rStyle w:val="Hyperlink"/>
@@ -12983,7 +11809,7 @@
         </w:rPr>
         <w:t xml:space="preserve">. </w:t>
       </w:r>
-      <w:hyperlink r:id="rId25" w:history="1">
+      <w:hyperlink r:id="rId24" w:history="1">
         <w:r>
           <w:rPr>
             <w:rStyle w:val="Hyperlink"/>
@@ -13013,7 +11839,7 @@
         </w:rPr>
         <w:t xml:space="preserve">. (2026). Knowledge Base. </w:t>
       </w:r>
-      <w:hyperlink r:id="rId26" w:history="1">
+      <w:hyperlink r:id="rId25" w:history="1">
         <w:r>
           <w:rPr>
             <w:rStyle w:val="Hyperlink"/>
@@ -13089,7 +11915,7 @@
       <w:r>
         <w:t xml:space="preserve">National Institute of Standards and Technology. (2024). The NIST Cybersecurity Framework (CSF) 2.0 (NIST CSWP 29). U.S. Department of Commerce. </w:t>
       </w:r>
-      <w:hyperlink r:id="rId27" w:history="1">
+      <w:hyperlink r:id="rId26" w:history="1">
         <w:r>
           <w:rPr>
             <w:rStyle w:val="Hyperlink"/>
@@ -13105,7 +11931,7 @@
       <w:r>
         <w:t xml:space="preserve">SMART Health IT. (n.d.). SMART App Launch Framework. HL7 International. </w:t>
       </w:r>
-      <w:hyperlink r:id="rId28" w:history="1">
+      <w:hyperlink r:id="rId27" w:history="1">
         <w:r>
           <w:rPr>
             <w:rStyle w:val="Hyperlink"/>
@@ -13135,7 +11961,7 @@
         </w:rPr>
         <w:t xml:space="preserve">. (n.d.). Docs.Smarthealthit.Org. Retrieved September 11, 2026, from </w:t>
       </w:r>
-      <w:hyperlink r:id="rId29" w:history="1">
+      <w:hyperlink r:id="rId28" w:history="1">
         <w:r>
           <w:rPr>
             <w:rStyle w:val="Hyperlink"/>
@@ -13166,7 +11992,7 @@
         </w:rPr>
         <w:t xml:space="preserve">. (2022). Digitalhealth.Gov.Au. </w:t>
       </w:r>
-      <w:hyperlink r:id="rId30" w:history="1">
+      <w:hyperlink r:id="rId29" w:history="1">
         <w:r>
           <w:rPr>
             <w:rStyle w:val="Hyperlink"/>
@@ -13217,7 +12043,6 @@
         <w:ind w:left="720" w:hanging="720"/>
       </w:pPr>
       <w:r>
-        <w:lastRenderedPageBreak/>
         <w:t xml:space="preserve">Walonoski, J., Kramer, M., Nichols, J., Quina, A., </w:t>
       </w:r>
       <w:proofErr w:type="spellStart"/>
@@ -13228,7 +12053,7 @@
       <w:r>
         <w:t xml:space="preserve">, C., Hall, D., Duffett, C., Dube, K., Gallagher, T., &amp; McLachlan, S. (2018). Synthea: An approach, method, and software mechanism for generating synthetic patients and the synthetic electronic health care record. Journal of the American Medical Informatics Association, 25(3), 230–238. </w:t>
       </w:r>
-      <w:hyperlink r:id="rId31" w:history="1">
+      <w:hyperlink r:id="rId30" w:history="1">
         <w:r>
           <w:rPr>
             <w:rStyle w:val="Hyperlink"/>
@@ -13263,7 +12088,7 @@
 </file>
 
 <file path=word/endnotes.xml><?xml version="1.0" encoding="utf-8"?>
-<w:endnotes xmlns:wpc="http://schemas.microsoft.com/office/word/2010/wordprocessingCanvas" xmlns:cx="http://schemas.microsoft.com/office/drawing/2014/chartex" xmlns:cx1="http://schemas.microsoft.com/office/drawing/2015/9/8/chartex" xmlns:cx2="http://schemas.microsoft.com/office/drawing/2015/10/21/chartex" xmlns:cx3="http://schemas.microsoft.com/office/drawing/2016/5/9/chartex" xmlns:cx4="http://schemas.microsoft.com/office/drawing/2016/5/10/chartex" xmlns:cx5="http://schemas.microsoft.com/office/drawing/2016/5/11/chartex" xmlns:cx6="http://schemas.microsoft.com/office/drawing/2016/5/12/chartex" xmlns:cx7="http://schemas.microsoft.com/office/drawing/2016/5/13/chartex" xmlns:cx8="http://schemas.microsoft.com/office/drawing/2016/5/14/chartex" xmlns:mc="http://schemas.openxmlformats.org/markup-compatibility/2006" xmlns:m="http://schemas.openxmlformats.org/officeDocument/2006/math" xmlns:aink="http://schemas.microsoft.com/office/drawing/2016/ink" xmlns:am3d="http://schemas.microsoft.com/office/drawing/2017/model3d" xmlns:oel="http://schemas.microsoft.com/office/2019/extlst" xmlns:r="http://schemas.openxmlformats.org/officeDocument/2006/relationships" xmlns:wp14="http://schemas.microsoft.com/office/word/2010/wordprocessingDrawing" xmlns:wp="http://schemas.openxmlformats.org/drawingml/2006/wordprocessingDrawing" xmlns:wpg="http://schemas.microsoft.com/office/word/2010/wordprocessingGroup" xmlns:wpi="http://schemas.microsoft.com/office/word/2010/wordprocessingInk" xmlns:wps="http://schemas.microsoft.com/office/word/2010/wordprocessingShape" xmlns:o="urn:schemas-microsoft-com:office:office" xmlns:v="urn:schemas-microsoft-com:vml" xmlns:w10="urn:schemas-microsoft-com:office:word" xmlns:w="http://schemas.openxmlformats.org/wordprocessingml/2006/main" xmlns:w14="http://schemas.microsoft.com/office/word/2010/wordml" xmlns:w15="http://schemas.microsoft.com/office/word/2012/wordml" xmlns:w16cex="http://schemas.microsoft.com/office/word/2018/wordml/cex" xmlns:w16cid="http://schemas.microsoft.com/office/word/2016/wordml/cid" xmlns:w16="http://schemas.microsoft.com/office/word/2018/wordml" xmlns:w16sdtdh="http://schemas.microsoft.com/office/word/2020/wordml/sdtdatahash" xmlns:w16sdtfl="http://schemas.microsoft.com/office/word/2024/wordml/sdtformatlock" xmlns:w16se="http://schemas.microsoft.com/office/word/2015/wordml/symex" xmlns:w16du="http://schemas.microsoft.com/office/word/2023/wordml/word16du" xmlns:wne="http://schemas.microsoft.com/office/word/2006/wordml" mc:Ignorable="w14 w15 w16se w16cid w16 w16cex w16sdtdh w16sdtfl w16du wp14">
+<w:endnotes xmlns:wpc="http://schemas.microsoft.com/office/word/2010/wordprocessingCanvas" xmlns:cx="http://schemas.microsoft.com/office/drawing/2014/chartex" xmlns:cx1="http://schemas.microsoft.com/office/drawing/2015/9/8/chartex" xmlns:cx2="http://schemas.microsoft.com/office/drawing/2015/10/21/chartex" xmlns:cx3="http://schemas.microsoft.com/office/drawing/2016/5/9/chartex" xmlns:cx4="http://schemas.microsoft.com/office/drawing/2016/5/10/chartex" xmlns:cx5="http://schemas.microsoft.com/office/drawing/2016/5/11/chartex" xmlns:cx6="http://schemas.microsoft.com/office/drawing/2016/5/12/chartex" xmlns:cx7="http://schemas.microsoft.com/office/drawing/2016/5/13/chartex" xmlns:cx8="http://schemas.microsoft.com/office/drawing/2016/5/14/chartex" xmlns:mc="http://schemas.openxmlformats.org/markup-compatibility/2006" xmlns:aink="http://schemas.microsoft.com/office/drawing/2016/ink" xmlns:am3d="http://schemas.microsoft.com/office/drawing/2017/model3d" xmlns:o="urn:schemas-microsoft-com:office:office" xmlns:oel="http://schemas.microsoft.com/office/2019/extlst" xmlns:r="http://schemas.openxmlformats.org/officeDocument/2006/relationships" xmlns:m="http://schemas.openxmlformats.org/officeDocument/2006/math" xmlns:v="urn:schemas-microsoft-com:vml" xmlns:wp14="http://schemas.microsoft.com/office/word/2010/wordprocessingDrawing" xmlns:wp="http://schemas.openxmlformats.org/drawingml/2006/wordprocessingDrawing" xmlns:w10="urn:schemas-microsoft-com:office:word" xmlns:w="http://schemas.openxmlformats.org/wordprocessingml/2006/main" xmlns:w14="http://schemas.microsoft.com/office/word/2010/wordml" xmlns:w15="http://schemas.microsoft.com/office/word/2012/wordml" xmlns:w16cex="http://schemas.microsoft.com/office/word/2018/wordml/cex" xmlns:w16cid="http://schemas.microsoft.com/office/word/2016/wordml/cid" xmlns:w16="http://schemas.microsoft.com/office/word/2018/wordml" xmlns:w16du="http://schemas.microsoft.com/office/word/2023/wordml/word16du" xmlns:w16sdtdh="http://schemas.microsoft.com/office/word/2020/wordml/sdtdatahash" xmlns:w16sdtfl="http://schemas.microsoft.com/office/word/2024/wordml/sdtformatlock" xmlns:w16se="http://schemas.microsoft.com/office/word/2015/wordml/symex" xmlns:wpg="http://schemas.microsoft.com/office/word/2010/wordprocessingGroup" xmlns:wpi="http://schemas.microsoft.com/office/word/2010/wordprocessingInk" xmlns:wne="http://schemas.microsoft.com/office/word/2006/wordml" xmlns:wps="http://schemas.microsoft.com/office/word/2010/wordprocessingShape" mc:Ignorable="w14 w15 w16se w16cid w16 w16cex w16sdtdh w16sdtfl w16du wp14">
   <w:endnote w:type="separator" w:id="-1">
     <w:p>
       <w:r>
@@ -13282,7 +12107,7 @@
 </file>
 
 <file path=word/footer1.xml><?xml version="1.0" encoding="utf-8"?>
-<w:ftr xmlns:wpc="http://schemas.microsoft.com/office/word/2010/wordprocessingCanvas" xmlns:cx="http://schemas.microsoft.com/office/drawing/2014/chartex" xmlns:cx1="http://schemas.microsoft.com/office/drawing/2015/9/8/chartex" xmlns:cx2="http://schemas.microsoft.com/office/drawing/2015/10/21/chartex" xmlns:cx3="http://schemas.microsoft.com/office/drawing/2016/5/9/chartex" xmlns:cx4="http://schemas.microsoft.com/office/drawing/2016/5/10/chartex" xmlns:cx5="http://schemas.microsoft.com/office/drawing/2016/5/11/chartex" xmlns:cx6="http://schemas.microsoft.com/office/drawing/2016/5/12/chartex" xmlns:cx7="http://schemas.microsoft.com/office/drawing/2016/5/13/chartex" xmlns:cx8="http://schemas.microsoft.com/office/drawing/2016/5/14/chartex" xmlns:mc="http://schemas.openxmlformats.org/markup-compatibility/2006" xmlns:m="http://schemas.openxmlformats.org/officeDocument/2006/math" xmlns:aink="http://schemas.microsoft.com/office/drawing/2016/ink" xmlns:am3d="http://schemas.microsoft.com/office/drawing/2017/model3d" xmlns:oel="http://schemas.microsoft.com/office/2019/extlst" xmlns:r="http://schemas.openxmlformats.org/officeDocument/2006/relationships" xmlns:wp14="http://schemas.microsoft.com/office/word/2010/wordprocessingDrawing" xmlns:wp="http://schemas.openxmlformats.org/drawingml/2006/wordprocessingDrawing" xmlns:wpg="http://schemas.microsoft.com/office/word/2010/wordprocessingGroup" xmlns:wpi="http://schemas.microsoft.com/office/word/2010/wordprocessingInk" xmlns:wps="http://schemas.microsoft.com/office/word/2010/wordprocessingShape" xmlns:o="urn:schemas-microsoft-com:office:office" xmlns:v="urn:schemas-microsoft-com:vml" xmlns:w10="urn:schemas-microsoft-com:office:word" xmlns:w="http://schemas.openxmlformats.org/wordprocessingml/2006/main" xmlns:w14="http://schemas.microsoft.com/office/word/2010/wordml" xmlns:w15="http://schemas.microsoft.com/office/word/2012/wordml" xmlns:w16cex="http://schemas.microsoft.com/office/word/2018/wordml/cex" xmlns:w16cid="http://schemas.microsoft.com/office/word/2016/wordml/cid" xmlns:w16="http://schemas.microsoft.com/office/word/2018/wordml" xmlns:w16sdtdh="http://schemas.microsoft.com/office/word/2020/wordml/sdtdatahash" xmlns:w16sdtfl="http://schemas.microsoft.com/office/word/2024/wordml/sdtformatlock" xmlns:w16se="http://schemas.microsoft.com/office/word/2015/wordml/symex" xmlns:w16du="http://schemas.microsoft.com/office/word/2023/wordml/word16du" xmlns:wne="http://schemas.microsoft.com/office/word/2006/wordml" mc:Ignorable="w14 w15 w16se w16cid w16 w16cex w16sdtdh w16sdtfl w16du wp14">
+<w:ftr xmlns:wpc="http://schemas.microsoft.com/office/word/2010/wordprocessingCanvas" xmlns:cx="http://schemas.microsoft.com/office/drawing/2014/chartex" xmlns:cx1="http://schemas.microsoft.com/office/drawing/2015/9/8/chartex" xmlns:cx2="http://schemas.microsoft.com/office/drawing/2015/10/21/chartex" xmlns:cx3="http://schemas.microsoft.com/office/drawing/2016/5/9/chartex" xmlns:cx4="http://schemas.microsoft.com/office/drawing/2016/5/10/chartex" xmlns:cx5="http://schemas.microsoft.com/office/drawing/2016/5/11/chartex" xmlns:cx6="http://schemas.microsoft.com/office/drawing/2016/5/12/chartex" xmlns:cx7="http://schemas.microsoft.com/office/drawing/2016/5/13/chartex" xmlns:cx8="http://schemas.microsoft.com/office/drawing/2016/5/14/chartex" xmlns:mc="http://schemas.openxmlformats.org/markup-compatibility/2006" xmlns:aink="http://schemas.microsoft.com/office/drawing/2016/ink" xmlns:am3d="http://schemas.microsoft.com/office/drawing/2017/model3d" xmlns:o="urn:schemas-microsoft-com:office:office" xmlns:oel="http://schemas.microsoft.com/office/2019/extlst" xmlns:r="http://schemas.openxmlformats.org/officeDocument/2006/relationships" xmlns:m="http://schemas.openxmlformats.org/officeDocument/2006/math" xmlns:v="urn:schemas-microsoft-com:vml" xmlns:wp14="http://schemas.microsoft.com/office/word/2010/wordprocessingDrawing" xmlns:wp="http://schemas.openxmlformats.org/drawingml/2006/wordprocessingDrawing" xmlns:w10="urn:schemas-microsoft-com:office:word" xmlns:w="http://schemas.openxmlformats.org/wordprocessingml/2006/main" xmlns:w14="http://schemas.microsoft.com/office/word/2010/wordml" xmlns:w15="http://schemas.microsoft.com/office/word/2012/wordml" xmlns:w16cex="http://schemas.microsoft.com/office/word/2018/wordml/cex" xmlns:w16cid="http://schemas.microsoft.com/office/word/2016/wordml/cid" xmlns:w16="http://schemas.microsoft.com/office/word/2018/wordml" xmlns:w16du="http://schemas.microsoft.com/office/word/2023/wordml/word16du" xmlns:w16sdtdh="http://schemas.microsoft.com/office/word/2020/wordml/sdtdatahash" xmlns:w16sdtfl="http://schemas.microsoft.com/office/word/2024/wordml/sdtformatlock" xmlns:w16se="http://schemas.microsoft.com/office/word/2015/wordml/symex" xmlns:wpg="http://schemas.microsoft.com/office/word/2010/wordprocessingGroup" xmlns:wpi="http://schemas.microsoft.com/office/word/2010/wordprocessingInk" xmlns:wne="http://schemas.microsoft.com/office/word/2006/wordml" xmlns:wps="http://schemas.microsoft.com/office/word/2010/wordprocessingShape" mc:Ignorable="w14 w15 w16se w16cid w16 w16cex w16sdtdh w16sdtfl w16du wp14">
   <w:p>
     <w:pPr>
       <w:pStyle w:val="Footer"/>
@@ -13297,7 +12122,7 @@
 </file>
 
 <file path=word/footnotes.xml><?xml version="1.0" encoding="utf-8"?>
-<w:footnotes xmlns:wpc="http://schemas.microsoft.com/office/word/2010/wordprocessingCanvas" xmlns:cx="http://schemas.microsoft.com/office/drawing/2014/chartex" xmlns:cx1="http://schemas.microsoft.com/office/drawing/2015/9/8/chartex" xmlns:cx2="http://schemas.microsoft.com/office/drawing/2015/10/21/chartex" xmlns:cx3="http://schemas.microsoft.com/office/drawing/2016/5/9/chartex" xmlns:cx4="http://schemas.microsoft.com/office/drawing/2016/5/10/chartex" xmlns:cx5="http://schemas.microsoft.com/office/drawing/2016/5/11/chartex" xmlns:cx6="http://schemas.microsoft.com/office/drawing/2016/5/12/chartex" xmlns:cx7="http://schemas.microsoft.com/office/drawing/2016/5/13/chartex" xmlns:cx8="http://schemas.microsoft.com/office/drawing/2016/5/14/chartex" xmlns:mc="http://schemas.openxmlformats.org/markup-compatibility/2006" xmlns:m="http://schemas.openxmlformats.org/officeDocument/2006/math" xmlns:aink="http://schemas.microsoft.com/office/drawing/2016/ink" xmlns:am3d="http://schemas.microsoft.com/office/drawing/2017/model3d" xmlns:oel="http://schemas.microsoft.com/office/2019/extlst" xmlns:r="http://schemas.openxmlformats.org/officeDocument/2006/relationships" xmlns:wp14="http://schemas.microsoft.com/office/word/2010/wordprocessingDrawing" xmlns:wp="http://schemas.openxmlformats.org/drawingml/2006/wordprocessingDrawing" xmlns:wpg="http://schemas.microsoft.com/office/word/2010/wordprocessingGroup" xmlns:wpi="http://schemas.microsoft.com/office/word/2010/wordprocessingInk" xmlns:wps="http://schemas.microsoft.com/office/word/2010/wordprocessingShape" xmlns:o="urn:schemas-microsoft-com:office:office" xmlns:v="urn:schemas-microsoft-com:vml" xmlns:w10="urn:schemas-microsoft-com:office:word" xmlns:w="http://schemas.openxmlformats.org/wordprocessingml/2006/main" xmlns:w14="http://schemas.microsoft.com/office/word/2010/wordml" xmlns:w15="http://schemas.microsoft.com/office/word/2012/wordml" xmlns:w16cex="http://schemas.microsoft.com/office/word/2018/wordml/cex" xmlns:w16cid="http://schemas.microsoft.com/office/word/2016/wordml/cid" xmlns:w16="http://schemas.microsoft.com/office/word/2018/wordml" xmlns:w16sdtdh="http://schemas.microsoft.com/office/word/2020/wordml/sdtdatahash" xmlns:w16sdtfl="http://schemas.microsoft.com/office/word/2024/wordml/sdtformatlock" xmlns:w16se="http://schemas.microsoft.com/office/word/2015/wordml/symex" xmlns:w16du="http://schemas.microsoft.com/office/word/2023/wordml/word16du" xmlns:wne="http://schemas.microsoft.com/office/word/2006/wordml" mc:Ignorable="w14 w15 w16se w16cid w16 w16cex w16sdtdh w16sdtfl w16du wp14">
+<w:footnotes xmlns:wpc="http://schemas.microsoft.com/office/word/2010/wordprocessingCanvas" xmlns:cx="http://schemas.microsoft.com/office/drawing/2014/chartex" xmlns:cx1="http://schemas.microsoft.com/office/drawing/2015/9/8/chartex" xmlns:cx2="http://schemas.microsoft.com/office/drawing/2015/10/21/chartex" xmlns:cx3="http://schemas.microsoft.com/office/drawing/2016/5/9/chartex" xmlns:cx4="http://schemas.microsoft.com/office/drawing/2016/5/10/chartex" xmlns:cx5="http://schemas.microsoft.com/office/drawing/2016/5/11/chartex" xmlns:cx6="http://schemas.microsoft.com/office/drawing/2016/5/12/chartex" xmlns:cx7="http://schemas.microsoft.com/office/drawing/2016/5/13/chartex" xmlns:cx8="http://schemas.microsoft.com/office/drawing/2016/5/14/chartex" xmlns:mc="http://schemas.openxmlformats.org/markup-compatibility/2006" xmlns:aink="http://schemas.microsoft.com/office/drawing/2016/ink" xmlns:am3d="http://schemas.microsoft.com/office/drawing/2017/model3d" xmlns:o="urn:schemas-microsoft-com:office:office" xmlns:oel="http://schemas.microsoft.com/office/2019/extlst" xmlns:r="http://schemas.openxmlformats.org/officeDocument/2006/relationships" xmlns:m="http://schemas.openxmlformats.org/officeDocument/2006/math" xmlns:v="urn:schemas-microsoft-com:vml" xmlns:wp14="http://schemas.microsoft.com/office/word/2010/wordprocessingDrawing" xmlns:wp="http://schemas.openxmlformats.org/drawingml/2006/wordprocessingDrawing" xmlns:w10="urn:schemas-microsoft-com:office:word" xmlns:w="http://schemas.openxmlformats.org/wordprocessingml/2006/main" xmlns:w14="http://schemas.microsoft.com/office/word/2010/wordml" xmlns:w15="http://schemas.microsoft.com/office/word/2012/wordml" xmlns:w16cex="http://schemas.microsoft.com/office/word/2018/wordml/cex" xmlns:w16cid="http://schemas.microsoft.com/office/word/2016/wordml/cid" xmlns:w16="http://schemas.microsoft.com/office/word/2018/wordml" xmlns:w16du="http://schemas.microsoft.com/office/word/2023/wordml/word16du" xmlns:w16sdtdh="http://schemas.microsoft.com/office/word/2020/wordml/sdtdatahash" xmlns:w16sdtfl="http://schemas.microsoft.com/office/word/2024/wordml/sdtformatlock" xmlns:w16se="http://schemas.microsoft.com/office/word/2015/wordml/symex" xmlns:wpg="http://schemas.microsoft.com/office/word/2010/wordprocessingGroup" xmlns:wpi="http://schemas.microsoft.com/office/word/2010/wordprocessingInk" xmlns:wne="http://schemas.microsoft.com/office/word/2006/wordml" xmlns:wps="http://schemas.microsoft.com/office/word/2010/wordprocessingShape" mc:Ignorable="w14 w15 w16se w16cid w16 w16cex w16sdtdh w16sdtfl w16du wp14">
   <w:footnote w:type="separator" w:id="-1">
     <w:p>
       <w:r>
@@ -13316,7 +12141,7 @@
 </file>
 
 <file path=word/numbering.xml><?xml version="1.0" encoding="utf-8"?>
-<w:numbering xmlns:wpc="http://schemas.microsoft.com/office/word/2010/wordprocessingCanvas" xmlns:cx="http://schemas.microsoft.com/office/drawing/2014/chartex" xmlns:cx1="http://schemas.microsoft.com/office/drawing/2015/9/8/chartex" xmlns:cx2="http://schemas.microsoft.com/office/drawing/2015/10/21/chartex" xmlns:cx3="http://schemas.microsoft.com/office/drawing/2016/5/9/chartex" xmlns:cx4="http://schemas.microsoft.com/office/drawing/2016/5/10/chartex" xmlns:cx5="http://schemas.microsoft.com/office/drawing/2016/5/11/chartex" xmlns:cx6="http://schemas.microsoft.com/office/drawing/2016/5/12/chartex" xmlns:cx7="http://schemas.microsoft.com/office/drawing/2016/5/13/chartex" xmlns:cx8="http://schemas.microsoft.com/office/drawing/2016/5/14/chartex" xmlns:mc="http://schemas.openxmlformats.org/markup-compatibility/2006" xmlns:m="http://schemas.openxmlformats.org/officeDocument/2006/math" xmlns:aink="http://schemas.microsoft.com/office/drawing/2016/ink" xmlns:am3d="http://schemas.microsoft.com/office/drawing/2017/model3d" xmlns:oel="http://schemas.microsoft.com/office/2019/extlst" xmlns:r="http://schemas.openxmlformats.org/officeDocument/2006/relationships" xmlns:wp14="http://schemas.microsoft.com/office/word/2010/wordprocessingDrawing" xmlns:wp="http://schemas.openxmlformats.org/drawingml/2006/wordprocessingDrawing" xmlns:wpg="http://schemas.microsoft.com/office/word/2010/wordprocessingGroup" xmlns:wpi="http://schemas.microsoft.com/office/word/2010/wordprocessingInk" xmlns:wps="http://schemas.microsoft.com/office/word/2010/wordprocessingShape" xmlns:o="urn:schemas-microsoft-com:office:office" xmlns:v="urn:schemas-microsoft-com:vml" xmlns:w10="urn:schemas-microsoft-com:office:word" xmlns:w="http://schemas.openxmlformats.org/wordprocessingml/2006/main" xmlns:w14="http://schemas.microsoft.com/office/word/2010/wordml" xmlns:w15="http://schemas.microsoft.com/office/word/2012/wordml" xmlns:w16cex="http://schemas.microsoft.com/office/word/2018/wordml/cex" xmlns:w16cid="http://schemas.microsoft.com/office/word/2016/wordml/cid" xmlns:w16="http://schemas.microsoft.com/office/word/2018/wordml" xmlns:w16sdtdh="http://schemas.microsoft.com/office/word/2020/wordml/sdtdatahash" xmlns:w16sdtfl="http://schemas.microsoft.com/office/word/2024/wordml/sdtformatlock" xmlns:w16se="http://schemas.microsoft.com/office/word/2015/wordml/symex" xmlns:w16du="http://schemas.microsoft.com/office/word/2023/wordml/word16du" xmlns:wne="http://schemas.microsoft.com/office/word/2006/wordml" mc:Ignorable="w14 w15 w16se w16cid w16 w16cex w16sdtdh w16sdtfl w16du wp14">
+<w:numbering xmlns:wpc="http://schemas.microsoft.com/office/word/2010/wordprocessingCanvas" xmlns:cx="http://schemas.microsoft.com/office/drawing/2014/chartex" xmlns:cx1="http://schemas.microsoft.com/office/drawing/2015/9/8/chartex" xmlns:cx2="http://schemas.microsoft.com/office/drawing/2015/10/21/chartex" xmlns:cx3="http://schemas.microsoft.com/office/drawing/2016/5/9/chartex" xmlns:cx4="http://schemas.microsoft.com/office/drawing/2016/5/10/chartex" xmlns:cx5="http://schemas.microsoft.com/office/drawing/2016/5/11/chartex" xmlns:cx6="http://schemas.microsoft.com/office/drawing/2016/5/12/chartex" xmlns:cx7="http://schemas.microsoft.com/office/drawing/2016/5/13/chartex" xmlns:cx8="http://schemas.microsoft.com/office/drawing/2016/5/14/chartex" xmlns:mc="http://schemas.openxmlformats.org/markup-compatibility/2006" xmlns:aink="http://schemas.microsoft.com/office/drawing/2016/ink" xmlns:am3d="http://schemas.microsoft.com/office/drawing/2017/model3d" xmlns:o="urn:schemas-microsoft-com:office:office" xmlns:oel="http://schemas.microsoft.com/office/2019/extlst" xmlns:r="http://schemas.openxmlformats.org/officeDocument/2006/relationships" xmlns:m="http://schemas.openxmlformats.org/officeDocument/2006/math" xmlns:v="urn:schemas-microsoft-com:vml" xmlns:wp14="http://schemas.microsoft.com/office/word/2010/wordprocessingDrawing" xmlns:wp="http://schemas.openxmlformats.org/drawingml/2006/wordprocessingDrawing" xmlns:w10="urn:schemas-microsoft-com:office:word" xmlns:w="http://schemas.openxmlformats.org/wordprocessingml/2006/main" xmlns:w14="http://schemas.microsoft.com/office/word/2010/wordml" xmlns:w15="http://schemas.microsoft.com/office/word/2012/wordml" xmlns:w16cex="http://schemas.microsoft.com/office/word/2018/wordml/cex" xmlns:w16cid="http://schemas.microsoft.com/office/word/2016/wordml/cid" xmlns:w16="http://schemas.microsoft.com/office/word/2018/wordml" xmlns:w16du="http://schemas.microsoft.com/office/word/2023/wordml/word16du" xmlns:w16sdtdh="http://schemas.microsoft.com/office/word/2020/wordml/sdtdatahash" xmlns:w16sdtfl="http://schemas.microsoft.com/office/word/2024/wordml/sdtformatlock" xmlns:w16se="http://schemas.microsoft.com/office/word/2015/wordml/symex" xmlns:wpg="http://schemas.microsoft.com/office/word/2010/wordprocessingGroup" xmlns:wpi="http://schemas.microsoft.com/office/word/2010/wordprocessingInk" xmlns:wne="http://schemas.microsoft.com/office/word/2006/wordml" xmlns:wps="http://schemas.microsoft.com/office/word/2010/wordprocessingShape" mc:Ignorable="w14 w15 w16se w16cid w16 w16cex w16sdtdh w16sdtfl w16du wp14">
   <w:abstractNum w:abstractNumId="0" w15:restartNumberingAfterBreak="0">
     <w:nsid w:val="01E30731"/>
     <w:multiLevelType w:val="hybridMultilevel"/>
@@ -16151,7 +14976,7 @@
 </file>
 
 <file path=word/styles.xml><?xml version="1.0" encoding="utf-8"?>
-<w:styles xmlns:mc="http://schemas.openxmlformats.org/markup-compatibility/2006" xmlns:r="http://schemas.openxmlformats.org/officeDocument/2006/relationships" xmlns:w="http://schemas.openxmlformats.org/wordprocessingml/2006/main" xmlns:w14="http://schemas.microsoft.com/office/word/2010/wordml" xmlns:w15="http://schemas.microsoft.com/office/word/2012/wordml" xmlns:w16cex="http://schemas.microsoft.com/office/word/2018/wordml/cex" xmlns:w16cid="http://schemas.microsoft.com/office/word/2016/wordml/cid" xmlns:w16="http://schemas.microsoft.com/office/word/2018/wordml" xmlns:w16sdtdh="http://schemas.microsoft.com/office/word/2020/wordml/sdtdatahash" xmlns:w16sdtfl="http://schemas.microsoft.com/office/word/2024/wordml/sdtformatlock" xmlns:w16se="http://schemas.microsoft.com/office/word/2015/wordml/symex" xmlns:w16du="http://schemas.microsoft.com/office/word/2023/wordml/word16du" mc:Ignorable="w14 w15 w16se w16cid w16 w16cex w16sdtdh w16sdtfl w16du">
+<w:styles xmlns:mc="http://schemas.openxmlformats.org/markup-compatibility/2006" xmlns:r="http://schemas.openxmlformats.org/officeDocument/2006/relationships" xmlns:w="http://schemas.openxmlformats.org/wordprocessingml/2006/main" xmlns:w14="http://schemas.microsoft.com/office/word/2010/wordml" xmlns:w15="http://schemas.microsoft.com/office/word/2012/wordml" xmlns:w16cex="http://schemas.microsoft.com/office/word/2018/wordml/cex" xmlns:w16cid="http://schemas.microsoft.com/office/word/2016/wordml/cid" xmlns:w16="http://schemas.microsoft.com/office/word/2018/wordml" xmlns:w16du="http://schemas.microsoft.com/office/word/2023/wordml/word16du" xmlns:w16sdtdh="http://schemas.microsoft.com/office/word/2020/wordml/sdtdatahash" xmlns:w16sdtfl="http://schemas.microsoft.com/office/word/2024/wordml/sdtformatlock" xmlns:w16se="http://schemas.microsoft.com/office/word/2015/wordml/symex" mc:Ignorable="w14 w15 w16se w16cid w16 w16cex w16sdtdh w16sdtfl w16du">
   <w:docDefaults>
     <w:rPrDefault>
       <w:rPr>
@@ -16550,11 +15375,7 @@
   <w:style w:type="paragraph" w:default="1" w:styleId="Normal">
     <w:name w:val="Normal"/>
     <w:qFormat/>
-    <w:rsid w:val="009A43F4"/>
-    <w:rPr>
-      <w:rFonts w:ascii="Times New Roman" w:hAnsi="Times New Roman"/>
-      <w:sz w:val="24"/>
-    </w:rPr>
+    <w:rsid w:val="000F16A6"/>
   </w:style>
   <w:style w:type="paragraph" w:styleId="Heading1">
     <w:name w:val="heading 1"/>
@@ -16758,6 +15579,7 @@
   <w:style w:type="character" w:default="1" w:styleId="DefaultParagraphFont">
     <w:name w:val="Default Paragraph Font"/>
     <w:uiPriority w:val="1"/>
+    <w:semiHidden/>
     <w:unhideWhenUsed/>
   </w:style>
   <w:style w:type="table" w:default="1" w:styleId="TableNormal">
@@ -17887,8 +16709,9 @@
       <w:spacing w:before="100" w:beforeAutospacing="1" w:after="100" w:afterAutospacing="1" w:line="240" w:lineRule="auto"/>
     </w:pPr>
     <w:rPr>
-      <w:rFonts w:eastAsia="Times New Roman" w:cs="Times New Roman"/>
+      <w:rFonts w:ascii="Times New Roman" w:eastAsia="Times New Roman" w:hAnsi="Times New Roman" w:cs="Times New Roman"/>
       <w:kern w:val="0"/>
+      <w:sz w:val="24"/>
       <w:szCs w:val="24"/>
       <w:lang w:val="en-GB" w:eastAsia="en-GB"/>
       <w14:ligatures w14:val="none"/>
@@ -17905,16 +16728,6 @@
       <w:color w:val="96607D" w:themeColor="followedHyperlink"/>
       <w:u w:val="single"/>
     </w:rPr>
-  </w:style>
-  <w:style w:type="paragraph" w:styleId="Revision">
-    <w:name w:val="Revision"/>
-    <w:hidden/>
-    <w:uiPriority w:val="99"/>
-    <w:semiHidden/>
-    <w:rsid w:val="009A43F4"/>
-    <w:pPr>
-      <w:spacing w:after="0" w:line="240" w:lineRule="auto"/>
-    </w:pPr>
   </w:style>
 </w:styles>
 </file>

</xml_diff>

<commit_message>
Threat model and stride table
</commit_message>
<xml_diff>
--- a/DOCUMENTS/Assessment_2_report.docx
+++ b/DOCUMENTS/Assessment_2_report.docx
@@ -1,6 +1,6 @@
 
 <file path=word/document.xml><?xml version="1.0" encoding="utf-8"?>
-<w:document xmlns:wpc="http://schemas.microsoft.com/office/word/2010/wordprocessingCanvas" xmlns:cx="http://schemas.microsoft.com/office/drawing/2014/chartex" xmlns:cx1="http://schemas.microsoft.com/office/drawing/2015/9/8/chartex" xmlns:cx2="http://schemas.microsoft.com/office/drawing/2015/10/21/chartex" xmlns:cx3="http://schemas.microsoft.com/office/drawing/2016/5/9/chartex" xmlns:cx4="http://schemas.microsoft.com/office/drawing/2016/5/10/chartex" xmlns:cx5="http://schemas.microsoft.com/office/drawing/2016/5/11/chartex" xmlns:cx6="http://schemas.microsoft.com/office/drawing/2016/5/12/chartex" xmlns:cx7="http://schemas.microsoft.com/office/drawing/2016/5/13/chartex" xmlns:cx8="http://schemas.microsoft.com/office/drawing/2016/5/14/chartex" xmlns:mc="http://schemas.openxmlformats.org/markup-compatibility/2006" xmlns:aink="http://schemas.microsoft.com/office/drawing/2016/ink" xmlns:am3d="http://schemas.microsoft.com/office/drawing/2017/model3d" xmlns:o="urn:schemas-microsoft-com:office:office" xmlns:oel="http://schemas.microsoft.com/office/2019/extlst" xmlns:r="http://schemas.openxmlformats.org/officeDocument/2006/relationships" xmlns:m="http://schemas.openxmlformats.org/officeDocument/2006/math" xmlns:v="urn:schemas-microsoft-com:vml" xmlns:wp14="http://schemas.microsoft.com/office/word/2010/wordprocessingDrawing" xmlns:wp="http://schemas.openxmlformats.org/drawingml/2006/wordprocessingDrawing" xmlns:w10="urn:schemas-microsoft-com:office:word" xmlns:w="http://schemas.openxmlformats.org/wordprocessingml/2006/main" xmlns:w14="http://schemas.microsoft.com/office/word/2010/wordml" xmlns:w15="http://schemas.microsoft.com/office/word/2012/wordml" xmlns:w16cex="http://schemas.microsoft.com/office/word/2018/wordml/cex" xmlns:w16cid="http://schemas.microsoft.com/office/word/2016/wordml/cid" xmlns:w16="http://schemas.microsoft.com/office/word/2018/wordml" xmlns:w16du="http://schemas.microsoft.com/office/word/2023/wordml/word16du" xmlns:w16sdtdh="http://schemas.microsoft.com/office/word/2020/wordml/sdtdatahash" xmlns:w16sdtfl="http://schemas.microsoft.com/office/word/2024/wordml/sdtformatlock" xmlns:w16se="http://schemas.microsoft.com/office/word/2015/wordml/symex" xmlns:wpg="http://schemas.microsoft.com/office/word/2010/wordprocessingGroup" xmlns:wpi="http://schemas.microsoft.com/office/word/2010/wordprocessingInk" xmlns:wne="http://schemas.microsoft.com/office/word/2006/wordml" xmlns:wps="http://schemas.microsoft.com/office/word/2010/wordprocessingShape" mc:Ignorable="w14 w15 w16se w16cid w16 w16cex w16sdtdh w16sdtfl w16du wp14">
+<w:document xmlns:wpc="http://schemas.microsoft.com/office/word/2010/wordprocessingCanvas" xmlns:cx="http://schemas.microsoft.com/office/drawing/2014/chartex" xmlns:cx1="http://schemas.microsoft.com/office/drawing/2015/9/8/chartex" xmlns:cx2="http://schemas.microsoft.com/office/drawing/2015/10/21/chartex" xmlns:cx3="http://schemas.microsoft.com/office/drawing/2016/5/9/chartex" xmlns:cx4="http://schemas.microsoft.com/office/drawing/2016/5/10/chartex" xmlns:cx5="http://schemas.microsoft.com/office/drawing/2016/5/11/chartex" xmlns:cx6="http://schemas.microsoft.com/office/drawing/2016/5/12/chartex" xmlns:cx7="http://schemas.microsoft.com/office/drawing/2016/5/13/chartex" xmlns:cx8="http://schemas.microsoft.com/office/drawing/2016/5/14/chartex" xmlns:mc="http://schemas.openxmlformats.org/markup-compatibility/2006" xmlns:m="http://schemas.openxmlformats.org/officeDocument/2006/math" xmlns:aink="http://schemas.microsoft.com/office/drawing/2016/ink" xmlns:am3d="http://schemas.microsoft.com/office/drawing/2017/model3d" xmlns:oel="http://schemas.microsoft.com/office/2019/extlst" xmlns:r="http://schemas.openxmlformats.org/officeDocument/2006/relationships" xmlns:wp14="http://schemas.microsoft.com/office/word/2010/wordprocessingDrawing" xmlns:wp="http://schemas.openxmlformats.org/drawingml/2006/wordprocessingDrawing" xmlns:wpg="http://schemas.microsoft.com/office/word/2010/wordprocessingGroup" xmlns:wpi="http://schemas.microsoft.com/office/word/2010/wordprocessingInk" xmlns:wps="http://schemas.microsoft.com/office/word/2010/wordprocessingShape" xmlns:o="urn:schemas-microsoft-com:office:office" xmlns:v="urn:schemas-microsoft-com:vml" xmlns:w10="urn:schemas-microsoft-com:office:word" xmlns:w="http://schemas.openxmlformats.org/wordprocessingml/2006/main" xmlns:w14="http://schemas.microsoft.com/office/word/2010/wordml" xmlns:w15="http://schemas.microsoft.com/office/word/2012/wordml" xmlns:w16cex="http://schemas.microsoft.com/office/word/2018/wordml/cex" xmlns:w16cid="http://schemas.microsoft.com/office/word/2016/wordml/cid" xmlns:w16="http://schemas.microsoft.com/office/word/2018/wordml" xmlns:w16sdtdh="http://schemas.microsoft.com/office/word/2020/wordml/sdtdatahash" xmlns:w16sdtfl="http://schemas.microsoft.com/office/word/2024/wordml/sdtformatlock" xmlns:w16se="http://schemas.microsoft.com/office/word/2015/wordml/symex" xmlns:w16du="http://schemas.microsoft.com/office/word/2023/wordml/word16du" xmlns:wne="http://schemas.microsoft.com/office/word/2006/wordml" mc:Ignorable="w14 w15 w16se w16cid w16 w16cex w16sdtdh w16sdtfl w16du wp14">
   <w:body>
     <w:p>
       <w:pPr>
@@ -264,7 +264,21 @@
               <w:rPr>
                 <w:lang w:val="en-US"/>
               </w:rPr>
-              <w:t xml:space="preserve"> Sonam Pelden, </w:t>
+              <w:t xml:space="preserve"> Sonam </w:t>
+            </w:r>
+            <w:proofErr w:type="spellStart"/>
+            <w:r>
+              <w:rPr>
+                <w:lang w:val="en-US"/>
+              </w:rPr>
+              <w:t>Pelden</w:t>
+            </w:r>
+            <w:proofErr w:type="spellEnd"/>
+            <w:r>
+              <w:rPr>
+                <w:lang w:val="en-US"/>
+              </w:rPr>
+              <w:t xml:space="preserve">, </w:t>
             </w:r>
             <w:r>
               <w:rPr>
@@ -914,6 +928,12 @@
                 <w:lang w:val="en-NZ" w:eastAsia="en-NZ"/>
               </w:rPr>
             </w:pPr>
+            <w:r>
+              <w:rPr>
+                <w:lang w:val="en-NZ" w:eastAsia="en-NZ"/>
+              </w:rPr>
+              <w:t>Solution Design/Tech Justification/security design/ threat model/cost estimation.</w:t>
+            </w:r>
           </w:p>
         </w:tc>
       </w:tr>
@@ -1216,7 +1236,9 @@
       </w:sdtPr>
       <w:sdtEndPr>
         <w:rPr>
+          <w:rFonts w:ascii="Times New Roman" w:hAnsi="Times New Roman"/>
           <w:noProof/>
+          <w:sz w:val="24"/>
         </w:rPr>
       </w:sdtEndPr>
       <w:sdtContent>
@@ -1237,7 +1259,6 @@
             <w:rPr>
               <w:rFonts w:eastAsiaTheme="minorEastAsia"/>
               <w:noProof/>
-              <w:sz w:val="24"/>
               <w:szCs w:val="34"/>
               <w:lang w:val="en-US" w:bidi="dz-BT"/>
             </w:rPr>
@@ -1318,7 +1339,6 @@
             <w:rPr>
               <w:rFonts w:eastAsiaTheme="minorEastAsia"/>
               <w:noProof/>
-              <w:sz w:val="24"/>
               <w:szCs w:val="34"/>
               <w:lang w:val="en-US" w:bidi="dz-BT"/>
             </w:rPr>
@@ -1390,7 +1410,6 @@
             <w:rPr>
               <w:rFonts w:eastAsiaTheme="minorEastAsia"/>
               <w:noProof/>
-              <w:sz w:val="24"/>
               <w:szCs w:val="34"/>
               <w:lang w:val="en-US" w:bidi="dz-BT"/>
             </w:rPr>
@@ -1462,7 +1481,6 @@
             <w:rPr>
               <w:rFonts w:eastAsiaTheme="minorEastAsia"/>
               <w:noProof/>
-              <w:sz w:val="24"/>
               <w:szCs w:val="34"/>
               <w:lang w:val="en-US" w:bidi="dz-BT"/>
             </w:rPr>
@@ -1534,7 +1552,6 @@
             <w:rPr>
               <w:rFonts w:eastAsiaTheme="minorEastAsia"/>
               <w:noProof/>
-              <w:sz w:val="24"/>
               <w:szCs w:val="34"/>
               <w:lang w:val="en-US" w:bidi="dz-BT"/>
             </w:rPr>
@@ -1606,7 +1623,6 @@
             <w:rPr>
               <w:rFonts w:eastAsiaTheme="minorEastAsia"/>
               <w:noProof/>
-              <w:sz w:val="24"/>
               <w:szCs w:val="34"/>
               <w:lang w:val="en-US" w:bidi="dz-BT"/>
             </w:rPr>
@@ -1678,7 +1694,6 @@
             <w:rPr>
               <w:rFonts w:eastAsiaTheme="minorEastAsia"/>
               <w:noProof/>
-              <w:sz w:val="24"/>
               <w:szCs w:val="34"/>
               <w:lang w:val="en-US" w:bidi="dz-BT"/>
             </w:rPr>
@@ -1750,7 +1765,6 @@
             <w:rPr>
               <w:rFonts w:eastAsiaTheme="minorEastAsia"/>
               <w:noProof/>
-              <w:sz w:val="24"/>
               <w:szCs w:val="34"/>
               <w:lang w:val="en-US" w:bidi="dz-BT"/>
             </w:rPr>
@@ -1822,7 +1836,6 @@
             <w:rPr>
               <w:rFonts w:eastAsiaTheme="minorEastAsia"/>
               <w:noProof/>
-              <w:sz w:val="24"/>
               <w:szCs w:val="34"/>
               <w:lang w:val="en-US" w:bidi="dz-BT"/>
             </w:rPr>
@@ -1894,7 +1907,6 @@
             <w:rPr>
               <w:rFonts w:eastAsiaTheme="minorEastAsia"/>
               <w:noProof/>
-              <w:sz w:val="24"/>
               <w:szCs w:val="34"/>
               <w:lang w:val="en-US" w:bidi="dz-BT"/>
             </w:rPr>
@@ -1966,7 +1978,6 @@
             <w:rPr>
               <w:rFonts w:eastAsiaTheme="minorEastAsia"/>
               <w:noProof/>
-              <w:sz w:val="24"/>
               <w:szCs w:val="34"/>
               <w:lang w:val="en-US" w:bidi="dz-BT"/>
             </w:rPr>
@@ -2038,7 +2049,6 @@
             <w:rPr>
               <w:rFonts w:eastAsiaTheme="minorEastAsia"/>
               <w:noProof/>
-              <w:sz w:val="24"/>
               <w:szCs w:val="34"/>
               <w:lang w:val="en-US" w:bidi="dz-BT"/>
             </w:rPr>
@@ -2110,7 +2120,6 @@
             <w:rPr>
               <w:rFonts w:eastAsiaTheme="minorEastAsia"/>
               <w:noProof/>
-              <w:sz w:val="24"/>
               <w:szCs w:val="34"/>
               <w:lang w:val="en-US" w:bidi="dz-BT"/>
             </w:rPr>
@@ -2182,7 +2191,6 @@
             <w:rPr>
               <w:rFonts w:eastAsiaTheme="minorEastAsia"/>
               <w:noProof/>
-              <w:sz w:val="24"/>
               <w:szCs w:val="34"/>
               <w:lang w:val="en-US" w:bidi="dz-BT"/>
             </w:rPr>
@@ -2254,7 +2262,6 @@
             <w:rPr>
               <w:rFonts w:eastAsiaTheme="minorEastAsia"/>
               <w:noProof/>
-              <w:sz w:val="24"/>
               <w:szCs w:val="34"/>
               <w:lang w:val="en-US" w:bidi="dz-BT"/>
             </w:rPr>
@@ -2326,7 +2333,6 @@
             <w:rPr>
               <w:rFonts w:eastAsiaTheme="minorEastAsia"/>
               <w:noProof/>
-              <w:sz w:val="24"/>
               <w:szCs w:val="34"/>
               <w:lang w:val="en-US" w:bidi="dz-BT"/>
             </w:rPr>
@@ -2398,7 +2404,6 @@
             <w:rPr>
               <w:rFonts w:eastAsiaTheme="minorEastAsia"/>
               <w:noProof/>
-              <w:sz w:val="24"/>
               <w:szCs w:val="34"/>
               <w:lang w:val="en-US" w:bidi="dz-BT"/>
             </w:rPr>
@@ -2470,7 +2475,6 @@
             <w:rPr>
               <w:rFonts w:eastAsiaTheme="minorEastAsia"/>
               <w:noProof/>
-              <w:sz w:val="24"/>
               <w:szCs w:val="34"/>
               <w:lang w:val="en-US" w:bidi="dz-BT"/>
             </w:rPr>
@@ -2542,7 +2546,6 @@
             <w:rPr>
               <w:rFonts w:eastAsiaTheme="minorEastAsia"/>
               <w:noProof/>
-              <w:sz w:val="24"/>
               <w:szCs w:val="34"/>
               <w:lang w:val="en-US" w:bidi="dz-BT"/>
             </w:rPr>
@@ -2614,7 +2617,6 @@
             <w:rPr>
               <w:rFonts w:eastAsiaTheme="minorEastAsia"/>
               <w:noProof/>
-              <w:sz w:val="24"/>
               <w:szCs w:val="34"/>
               <w:lang w:val="en-US" w:bidi="dz-BT"/>
             </w:rPr>
@@ -2686,7 +2688,6 @@
             <w:rPr>
               <w:rFonts w:eastAsiaTheme="minorEastAsia"/>
               <w:noProof/>
-              <w:sz w:val="24"/>
               <w:szCs w:val="34"/>
               <w:lang w:val="en-US" w:bidi="dz-BT"/>
             </w:rPr>
@@ -2758,7 +2759,6 @@
             <w:rPr>
               <w:rFonts w:eastAsiaTheme="minorEastAsia"/>
               <w:noProof/>
-              <w:sz w:val="24"/>
               <w:szCs w:val="34"/>
               <w:lang w:val="en-US" w:bidi="dz-BT"/>
             </w:rPr>
@@ -2830,7 +2830,6 @@
             <w:rPr>
               <w:rFonts w:eastAsiaTheme="minorEastAsia"/>
               <w:noProof/>
-              <w:sz w:val="24"/>
               <w:szCs w:val="34"/>
               <w:lang w:val="en-US" w:bidi="dz-BT"/>
             </w:rPr>
@@ -2902,7 +2901,6 @@
             <w:rPr>
               <w:rFonts w:eastAsiaTheme="minorEastAsia"/>
               <w:noProof/>
-              <w:sz w:val="24"/>
               <w:szCs w:val="34"/>
               <w:lang w:val="en-US" w:bidi="dz-BT"/>
             </w:rPr>
@@ -2974,7 +2972,6 @@
             <w:rPr>
               <w:rFonts w:eastAsiaTheme="minorEastAsia"/>
               <w:noProof/>
-              <w:sz w:val="24"/>
               <w:szCs w:val="34"/>
               <w:lang w:val="en-US" w:bidi="dz-BT"/>
             </w:rPr>
@@ -3046,7 +3043,6 @@
             <w:rPr>
               <w:rFonts w:eastAsiaTheme="minorEastAsia"/>
               <w:noProof/>
-              <w:sz w:val="24"/>
               <w:szCs w:val="34"/>
               <w:lang w:val="en-US" w:bidi="dz-BT"/>
             </w:rPr>
@@ -3118,7 +3114,6 @@
             <w:rPr>
               <w:rFonts w:eastAsiaTheme="minorEastAsia"/>
               <w:noProof/>
-              <w:sz w:val="24"/>
               <w:szCs w:val="34"/>
               <w:lang w:val="en-US" w:bidi="dz-BT"/>
             </w:rPr>
@@ -3190,7 +3185,6 @@
             <w:rPr>
               <w:rFonts w:eastAsiaTheme="minorEastAsia"/>
               <w:noProof/>
-              <w:sz w:val="24"/>
               <w:szCs w:val="34"/>
               <w:lang w:val="en-US" w:bidi="dz-BT"/>
             </w:rPr>
@@ -3262,7 +3256,6 @@
             <w:rPr>
               <w:rFonts w:eastAsiaTheme="minorEastAsia"/>
               <w:noProof/>
-              <w:sz w:val="24"/>
               <w:szCs w:val="34"/>
               <w:lang w:val="en-US" w:bidi="dz-BT"/>
             </w:rPr>
@@ -3341,6 +3334,7 @@
     <w:p/>
     <w:p>
       <w:r>
+        <w:lastRenderedPageBreak/>
         <w:br w:type="page"/>
       </w:r>
     </w:p>
@@ -3700,6 +3694,7 @@
         </w:numPr>
       </w:pPr>
       <w:r>
+        <w:lastRenderedPageBreak/>
         <w:t xml:space="preserve">A synthetic test-data plan </w:t>
       </w:r>
       <w:r>
@@ -3724,7 +3719,6 @@
         </w:numPr>
       </w:pPr>
       <w:r>
-        <w:lastRenderedPageBreak/>
         <w:t>A written, connector-weighted test plan covering happy-path, error-handling and degradation scenarios for all three connectors.</w:t>
       </w:r>
     </w:p>
@@ -4010,6 +4004,7 @@
       </w:pPr>
       <w:bookmarkStart w:id="5" w:name="_Toc238803235"/>
       <w:r>
+        <w:lastRenderedPageBreak/>
         <w:t>1.4 Stakeholders and User Requirements</w:t>
       </w:r>
       <w:bookmarkEnd w:id="5"/>
@@ -4128,7 +4123,6 @@
           </w:tcPr>
           <w:p>
             <w:r>
-              <w:lastRenderedPageBreak/>
               <w:t>Md Ashraf Uddin</w:t>
             </w:r>
           </w:p>
@@ -4715,6 +4709,7 @@
           </w:tcPr>
           <w:p>
             <w:r>
+              <w:lastRenderedPageBreak/>
               <w:t>Solution Design &amp; PoC Planning</w:t>
             </w:r>
           </w:p>
@@ -4747,7 +4742,6 @@
           </w:tcPr>
           <w:p>
             <w:r>
-              <w:lastRenderedPageBreak/>
               <w:t>Finalisation &amp; Submission</w:t>
             </w:r>
           </w:p>
@@ -4804,11 +4798,11 @@
         <w:tblLook w:val="0000" w:firstRow="0" w:lastRow="0" w:firstColumn="0" w:lastColumn="0" w:noHBand="0" w:noVBand="0"/>
       </w:tblPr>
       <w:tblGrid>
-        <w:gridCol w:w="2856"/>
-        <w:gridCol w:w="1542"/>
-        <w:gridCol w:w="1529"/>
-        <w:gridCol w:w="1542"/>
-        <w:gridCol w:w="1557"/>
+        <w:gridCol w:w="2811"/>
+        <w:gridCol w:w="1541"/>
+        <w:gridCol w:w="1513"/>
+        <w:gridCol w:w="1538"/>
+        <w:gridCol w:w="1623"/>
       </w:tblGrid>
       <w:tr>
         <w:tc>
@@ -5582,6 +5576,7 @@
       </w:pPr>
       <w:bookmarkStart w:id="10" w:name="_Toc238803240"/>
       <w:r>
+        <w:lastRenderedPageBreak/>
         <w:t>2.4 Risk Register</w:t>
       </w:r>
       <w:bookmarkEnd w:id="10"/>
@@ -5608,13 +5603,13 @@
       </w:tblPr>
       <w:tblGrid>
         <w:gridCol w:w="499"/>
-        <w:gridCol w:w="2196"/>
-        <w:gridCol w:w="1004"/>
+        <w:gridCol w:w="2234"/>
+        <w:gridCol w:w="985"/>
         <w:gridCol w:w="846"/>
-        <w:gridCol w:w="650"/>
-        <w:gridCol w:w="800"/>
-        <w:gridCol w:w="2293"/>
-        <w:gridCol w:w="712"/>
+        <w:gridCol w:w="603"/>
+        <w:gridCol w:w="799"/>
+        <w:gridCol w:w="2333"/>
+        <w:gridCol w:w="701"/>
       </w:tblGrid>
       <w:tr>
         <w:tc>
@@ -5827,7 +5822,6 @@
                 <w:sz w:val="17"/>
                 <w:szCs w:val="17"/>
               </w:rPr>
-              <w:lastRenderedPageBreak/>
               <w:t>R1</w:t>
             </w:r>
           </w:p>
@@ -6997,6 +6991,7 @@
     </w:p>
     <w:p>
       <w:r>
+        <w:lastRenderedPageBreak/>
         <w:t xml:space="preserve">Economic </w:t>
       </w:r>
       <w:r>
@@ -7016,7 +7011,6 @@
     </w:p>
     <w:p>
       <w:r>
-        <w:lastRenderedPageBreak/>
         <w:t xml:space="preserve">Legal feasibility is </w:t>
       </w:r>
       <w:r>
@@ -7250,12 +7244,19 @@
         <w:rPr>
           <w:color w:val="000000"/>
         </w:rPr>
-        <w:t xml:space="preserve">). One of the developing platforms that MedTalk uses is Epic.  Epic sandbox provides platform for developers to test integration first using mock patient data before EHR (Electronic Health Records) exchange. According to </w:t>
+        <w:t xml:space="preserve">). One of the developing platforms that MedTalk uses is Epic.  Epic sandbox provides platform for developers to test integration first using mock patient data before EHR (Electronic Health Records) exchange. </w:t>
       </w:r>
       <w:r>
         <w:rPr>
           <w:color w:val="000000"/>
         </w:rPr>
+        <w:lastRenderedPageBreak/>
+        <w:t xml:space="preserve">According to </w:t>
+      </w:r>
+      <w:r>
+        <w:rPr>
+          <w:color w:val="000000"/>
+        </w:rPr>
         <w:t>Choudhary</w:t>
       </w:r>
       <w:r>
@@ -7298,14 +7299,7 @@
         <w:rPr>
           <w:color w:val="000000"/>
         </w:rPr>
-        <w:t xml:space="preserve"> a flat fee ranges </w:t>
-      </w:r>
-      <w:r>
-        <w:rPr>
-          <w:color w:val="000000"/>
-        </w:rPr>
-        <w:lastRenderedPageBreak/>
-        <w:t xml:space="preserve">from $100 to $500. This excludes the subscription of the MediBetter professional suite which </w:t>
+        <w:t xml:space="preserve"> a flat fee ranges from $100 to $500. This excludes the subscription of the MediBetter professional suite which </w:t>
       </w:r>
       <w:r>
         <w:rPr>
@@ -7428,7 +7422,14 @@
         <w:rPr>
           <w:lang w:val="en-US"/>
         </w:rPr>
-        <w:t xml:space="preserve">MedTalk is part of the Australian health interoperability market. The main technical challenge in this market is not only generating accurate clinical notes but safe exchange of the clinical notes and correct translation of the data to the receiving system.  The most relevant technologies for the test harness are HL7 FHIR, SMART, vendor integration layers and Australian clinical terminology. These are all essential for the project as it </w:t>
+        <w:t xml:space="preserve">MedTalk is part of the Australian health interoperability market. The main technical challenge in this market is not only generating accurate clinical notes but safe exchange of the clinical </w:t>
+      </w:r>
+      <w:r>
+        <w:rPr>
+          <w:lang w:val="en-US"/>
+        </w:rPr>
+        <w:lastRenderedPageBreak/>
+        <w:t xml:space="preserve">notes and correct translation of the data to the receiving system.  The most relevant technologies for the test harness are HL7 FHIR, SMART, vendor integration layers and Australian clinical terminology. These are all essential for the project as it </w:t>
       </w:r>
       <w:proofErr w:type="gramStart"/>
       <w:r>
@@ -7464,219 +7465,216 @@
         <w:rPr>
           <w:lang w:val="en-US"/>
         </w:rPr>
+        <w:t>FHIR (</w:t>
+      </w:r>
+      <w:r>
+        <w:rPr>
+          <w:color w:val="000000"/>
+        </w:rPr>
+        <w:t>Fast Healthcare Interoperability Resources</w:t>
+      </w:r>
+      <w:r>
+        <w:rPr>
+          <w:lang w:val="en-US"/>
+        </w:rPr>
+        <w:t>) is the central exchange standard that defines resources meaning patient data, appointments, clinical notes and related information structure and transferred between systems (</w:t>
+      </w:r>
+      <w:proofErr w:type="spellStart"/>
+      <w:r>
+        <w:rPr>
+          <w:color w:val="000000"/>
+        </w:rPr>
+        <w:t>eCQI</w:t>
+      </w:r>
+      <w:proofErr w:type="spellEnd"/>
+      <w:r>
+        <w:rPr>
+          <w:color w:val="000000"/>
+        </w:rPr>
+        <w:t xml:space="preserve">, </w:t>
+      </w:r>
+      <w:r>
+        <w:rPr>
+          <w:color w:val="000000"/>
+        </w:rPr>
+        <w:t>2025)</w:t>
+      </w:r>
+      <w:r>
+        <w:rPr>
+          <w:lang w:val="en-US"/>
+        </w:rPr>
+        <w:t>. It also depicts interaction patterns including real time representation state Transfer (RESTful) application programming interfaces (APIs), document based and messaging. The RESTful APIS use HTTP operations to create, read, update and search for FHIR resources to enable real time data exchange. FHIR framework is free to build commercial and open-source tools while HL7 is registered trademark that cannot be used without permission. FHIR is a necessity for the project to mimic structured clinical document exchange and be able to test it.</w:t>
+      </w:r>
+    </w:p>
+    <w:p>
+      <w:pPr>
+        <w:textAlignment w:val="baseline"/>
+        <w:rPr>
+          <w:lang w:val="en-US"/>
+        </w:rPr>
+      </w:pPr>
+      <w:r>
+        <w:rPr>
+          <w:lang w:val="en-US"/>
+        </w:rPr>
+        <w:t xml:space="preserve">Australian clinical terminology and classification is vital which include SNOMED CT-AU and ICD-10-AM. SNOMED CT-AU is the preferred clinical terminology in Australia which is an extension of the global </w:t>
+      </w:r>
+      <w:r>
+        <w:t xml:space="preserve">SNOMED </w:t>
+      </w:r>
+      <w:r>
+        <w:t>CT standard.</w:t>
+      </w:r>
+      <w:r>
+        <w:t xml:space="preserve"> It combines international core clinical data with Australian-specific terms, spellings, local reference set</w:t>
+      </w:r>
+      <w:r>
+        <w:t>s</w:t>
+      </w:r>
+      <w:r>
+        <w:t xml:space="preserve"> and the Australian Medicines Terminology (AMT</w:t>
+      </w:r>
+      <w:r>
+        <w:t xml:space="preserve">). </w:t>
+      </w:r>
+      <w:r>
+        <w:rPr>
+          <w:lang w:val="en-US"/>
+        </w:rPr>
+        <w:t xml:space="preserve">SNOMED CT-AU </w:t>
+      </w:r>
+      <w:r>
+        <w:t>c</w:t>
+      </w:r>
+      <w:r>
+        <w:t xml:space="preserve">ontains </w:t>
+      </w:r>
+      <w:r>
+        <w:t xml:space="preserve">numerous </w:t>
+      </w:r>
+      <w:r>
+        <w:t xml:space="preserve">clinical concepts organized into hierarchies </w:t>
+      </w:r>
+      <w:r>
+        <w:t>like body structures, procedures and clinical findings</w:t>
+      </w:r>
+      <w:r>
+        <w:t>.</w:t>
+      </w:r>
+      <w:r>
+        <w:t xml:space="preserve"> </w:t>
+      </w:r>
+      <w:r>
+        <w:rPr>
+          <w:lang w:val="en-US"/>
+        </w:rPr>
+        <w:t>SNOMED CT-AU is then mapped to ICD-10-AM which is classification of diseases and diagnosis</w:t>
+      </w:r>
+      <w:r>
+        <w:t xml:space="preserve"> t</w:t>
+      </w:r>
+      <w:r>
+        <w:t>ailored to match Australian clinical terminology, practice and health-tracking need</w:t>
+      </w:r>
+      <w:r>
+        <w:t xml:space="preserve">. The </w:t>
+      </w:r>
+      <w:r>
+        <w:rPr>
+          <w:lang w:val="en-US"/>
+        </w:rPr>
+        <w:t>ICD-10-AM is mapped to MBS for billing in Australia. These terms need to be coded in the synthetic patient record correctly as the test harness will validate them. These terminologies are free access to code in synthetic data.</w:t>
+      </w:r>
+    </w:p>
+    <w:p>
+      <w:pPr>
+        <w:textAlignment w:val="baseline"/>
+        <w:rPr>
+          <w:lang w:val="en-US"/>
+        </w:rPr>
+      </w:pPr>
+    </w:p>
+    <w:p>
+      <w:pPr>
+        <w:textAlignment w:val="baseline"/>
+        <w:rPr>
+          <w:lang w:val="en-US"/>
+        </w:rPr>
+      </w:pPr>
+      <w:r>
+        <w:rPr>
+          <w:lang w:val="en-US"/>
+        </w:rPr>
+        <w:t xml:space="preserve">Synthea is currently one of the most credited synthetic patient </w:t>
+      </w:r>
+      <w:proofErr w:type="gramStart"/>
+      <w:r>
+        <w:rPr>
+          <w:lang w:val="en-US"/>
+        </w:rPr>
+        <w:t>generator</w:t>
+      </w:r>
+      <w:proofErr w:type="gramEnd"/>
+      <w:r>
+        <w:rPr>
+          <w:lang w:val="en-US"/>
+        </w:rPr>
+        <w:t xml:space="preserve"> as it creates realistic </w:t>
+      </w:r>
+      <w:r>
+        <w:t>realistic mock medical histories and electronic health records</w:t>
+      </w:r>
+      <w:r>
+        <w:t xml:space="preserve"> lifespan</w:t>
+      </w:r>
+      <w:r>
+        <w:t xml:space="preserve"> from birth to death.</w:t>
+      </w:r>
+      <w:r>
+        <w:t xml:space="preserve"> Synthea is an open source but produces mock patients based on Unites States of America demographics. CSIRO have created Australian mock data using Australian demographics, but the synthea tool is not available for public. The mock data is available which would be used for this project to ensure compliance and mimics real clinical system. SMART on FHIR is the authentication and authorising </w:t>
+      </w:r>
+      <w:r>
+        <w:t>secure system that lets third-party health apps log users in</w:t>
+      </w:r>
+      <w:r>
+        <w:t xml:space="preserve">, </w:t>
+      </w:r>
+      <w:r>
+        <w:t>access electronic health record (EHR) data using standard OAuth 2.0 protocols</w:t>
+      </w:r>
+      <w:r>
+        <w:t>. This security is necessary to ensure that there is no authorised access to the Test harness.</w:t>
+      </w:r>
+    </w:p>
+    <w:p>
+      <w:pPr>
+        <w:textAlignment w:val="baseline"/>
+      </w:pPr>
+      <w:r>
+        <w:rPr>
+          <w:lang w:val="en-US"/>
+        </w:rPr>
+        <w:t>Vendor integration layers include Halo connect to be implemented in the project. Halo connect is an Australian healthcare platform that safely links local medical practice systems to cloud-based software. It has two main components Halo Link and Halo Cloud. Halo Link is used to link the database to Halo cloud and Halo Cloud would be required for sharing data using standard formats like SQL and FHIR with approved external software. This integration is necessary as when the integration (another system) requires data from the server’s database, it sends this enquiry to the</w:t>
+      </w:r>
+      <w:r>
+        <w:t xml:space="preserve"> Halo Cloud</w:t>
+      </w:r>
+      <w:r>
+        <w:t xml:space="preserve"> then forwards it</w:t>
+      </w:r>
+      <w:r>
+        <w:t xml:space="preserve"> to the Halo Link agent</w:t>
+      </w:r>
+      <w:r>
+        <w:t>. The agent sends the enquiry to the local system database and run the query and send back results.</w:t>
+      </w:r>
+    </w:p>
+    <w:p>
+      <w:pPr>
+        <w:textAlignment w:val="baseline"/>
+      </w:pPr>
+      <w:r>
         <w:lastRenderedPageBreak/>
-        <w:t>FHIR (</w:t>
-      </w:r>
-      <w:r>
-        <w:rPr>
-          <w:color w:val="000000"/>
-        </w:rPr>
-        <w:t>Fast Healthcare Interoperability Resources</w:t>
-      </w:r>
-      <w:r>
-        <w:rPr>
-          <w:lang w:val="en-US"/>
-        </w:rPr>
-        <w:t>) is the central exchange standard that defines resources meaning patient data, appointments, clinical notes and related information structure and transferred between systems (</w:t>
-      </w:r>
-      <w:proofErr w:type="spellStart"/>
-      <w:r>
-        <w:rPr>
-          <w:color w:val="000000"/>
-        </w:rPr>
-        <w:t>eCQI</w:t>
-      </w:r>
-      <w:proofErr w:type="spellEnd"/>
-      <w:r>
-        <w:rPr>
-          <w:color w:val="000000"/>
-        </w:rPr>
-        <w:t xml:space="preserve">, </w:t>
-      </w:r>
-      <w:r>
-        <w:rPr>
-          <w:color w:val="000000"/>
-        </w:rPr>
-        <w:t>2025)</w:t>
-      </w:r>
-      <w:r>
-        <w:rPr>
-          <w:lang w:val="en-US"/>
-        </w:rPr>
-        <w:t>. It also depicts interaction patterns including real time representation state Transfer (RESTful) application programming interfaces (APIs), document based and messaging. The RESTful APIS use HTTP operations to create, read, update and search for FHIR resources to enable real time data exchange. FHIR framework is free to build commercial and open-source tools while HL7 is registered trademark that cannot be used without permission. FHIR is a necessity for the project to mimic structured clinical document exchange and be able to test it.</w:t>
-      </w:r>
-    </w:p>
-    <w:p>
-      <w:pPr>
-        <w:textAlignment w:val="baseline"/>
-        <w:rPr>
-          <w:lang w:val="en-US"/>
-        </w:rPr>
-      </w:pPr>
-      <w:r>
-        <w:rPr>
-          <w:lang w:val="en-US"/>
-        </w:rPr>
-        <w:t xml:space="preserve">Australian clinical terminology and classification is vital which include SNOMED CT-AU and ICD-10-AM. SNOMED CT-AU is the preferred clinical terminology in Australia which is an extension of the global </w:t>
-      </w:r>
-      <w:r>
-        <w:t xml:space="preserve">SNOMED </w:t>
-      </w:r>
-      <w:r>
-        <w:t>CT standard.</w:t>
-      </w:r>
-      <w:r>
-        <w:t xml:space="preserve"> It combines international core clinical data with Australian-specific terms, spellings, local reference set</w:t>
-      </w:r>
-      <w:r>
-        <w:t>s</w:t>
-      </w:r>
-      <w:r>
-        <w:t xml:space="preserve"> and the Australian Medicines Terminology (AMT</w:t>
-      </w:r>
-      <w:r>
-        <w:t xml:space="preserve">). </w:t>
-      </w:r>
-      <w:r>
-        <w:rPr>
-          <w:lang w:val="en-US"/>
-        </w:rPr>
-        <w:t xml:space="preserve">SNOMED CT-AU </w:t>
-      </w:r>
-      <w:r>
-        <w:t>c</w:t>
-      </w:r>
-      <w:r>
-        <w:t xml:space="preserve">ontains </w:t>
-      </w:r>
-      <w:r>
-        <w:t xml:space="preserve">numerous </w:t>
-      </w:r>
-      <w:r>
-        <w:t xml:space="preserve">clinical concepts organized into hierarchies </w:t>
-      </w:r>
-      <w:r>
-        <w:t>like body structures, procedures and clinical findings</w:t>
-      </w:r>
-      <w:r>
-        <w:t>.</w:t>
-      </w:r>
-      <w:r>
-        <w:t xml:space="preserve"> </w:t>
-      </w:r>
-      <w:r>
-        <w:rPr>
-          <w:lang w:val="en-US"/>
-        </w:rPr>
-        <w:t>SNOMED CT-AU is then mapped to ICD-10-AM which is classification of diseases and diagnosis</w:t>
-      </w:r>
-      <w:r>
-        <w:t xml:space="preserve"> t</w:t>
-      </w:r>
-      <w:r>
-        <w:t>ailored to match Australian clinical terminology, practice and health-tracking need</w:t>
-      </w:r>
-      <w:r>
-        <w:t xml:space="preserve">. The </w:t>
-      </w:r>
-      <w:r>
-        <w:rPr>
-          <w:lang w:val="en-US"/>
-        </w:rPr>
-        <w:t>ICD-10-AM is mapped to MBS for billing in Australia. These terms need to be coded in the synthetic patient record correctly as the test harness will validate them. These terminologies are free access to code in synthetic data.</w:t>
-      </w:r>
-    </w:p>
-    <w:p>
-      <w:pPr>
-        <w:textAlignment w:val="baseline"/>
-        <w:rPr>
-          <w:lang w:val="en-US"/>
-        </w:rPr>
-      </w:pPr>
-    </w:p>
-    <w:p>
-      <w:pPr>
-        <w:textAlignment w:val="baseline"/>
-        <w:rPr>
-          <w:lang w:val="en-US"/>
-        </w:rPr>
-      </w:pPr>
-      <w:r>
-        <w:rPr>
-          <w:lang w:val="en-US"/>
-        </w:rPr>
-        <w:t xml:space="preserve">Synthea is currently one of the most credited synthetic patient </w:t>
-      </w:r>
-      <w:proofErr w:type="gramStart"/>
-      <w:r>
-        <w:rPr>
-          <w:lang w:val="en-US"/>
-        </w:rPr>
-        <w:t>generator</w:t>
-      </w:r>
-      <w:proofErr w:type="gramEnd"/>
-      <w:r>
-        <w:rPr>
-          <w:lang w:val="en-US"/>
-        </w:rPr>
-        <w:t xml:space="preserve"> as it creates realistic </w:t>
-      </w:r>
-      <w:r>
-        <w:t>realistic mock medical histories and electronic health records</w:t>
-      </w:r>
-      <w:r>
-        <w:t xml:space="preserve"> lifespan</w:t>
-      </w:r>
-      <w:r>
-        <w:t xml:space="preserve"> from birth to death.</w:t>
-      </w:r>
-      <w:r>
-        <w:t xml:space="preserve"> Synthea is an open source but produces mock patients based on Unites States of America demographics. CSIRO have created Australian mock data using Australian demographics, but the synthea tool is not available for public. The mock data is available which would be used for this project to ensure compliance and mimics real clinical system. SMART on FHIR is the authentication and authorising </w:t>
-      </w:r>
-      <w:r>
-        <w:t>secure system that lets third-party health apps log users in</w:t>
-      </w:r>
-      <w:r>
-        <w:t xml:space="preserve">, </w:t>
-      </w:r>
-      <w:r>
-        <w:t>access electronic health record (EHR) data using standard OAuth 2.0 protocols</w:t>
-      </w:r>
-      <w:r>
-        <w:t>. This security is necessary to ensure that there is no authorised access to the Test harness</w:t>
-      </w:r>
-      <w:r>
-        <w:t>.</w:t>
-      </w:r>
-    </w:p>
-    <w:p>
-      <w:pPr>
-        <w:textAlignment w:val="baseline"/>
-      </w:pPr>
-      <w:r>
-        <w:rPr>
-          <w:lang w:val="en-US"/>
-        </w:rPr>
-        <w:t>Vendor integration layers include Halo connect to be implemented in the project. Halo connect is an Australian healthcare platform that safely links local medical practice systems to cloud-based software. It has two main components Halo Link and Halo Cloud. Halo Link is used to link the database to Halo cloud and Halo Cloud would be required for sharing data using standard formats like SQL and FHIR with approved external software. This integration is necessary as when the integration (another system) requires data from the server’s database, it sends this enquiry to the</w:t>
-      </w:r>
-      <w:r>
-        <w:t xml:space="preserve"> Halo Cloud</w:t>
-      </w:r>
-      <w:r>
-        <w:t xml:space="preserve"> then forwards it</w:t>
-      </w:r>
-      <w:r>
-        <w:t xml:space="preserve"> to the Halo Link agent</w:t>
-      </w:r>
-      <w:r>
-        <w:t>. The agent sends the enquiry to the local system database and run the query and send back results.</w:t>
-      </w:r>
-    </w:p>
-    <w:p>
-      <w:pPr>
-        <w:textAlignment w:val="baseline"/>
-      </w:pPr>
-      <w:r>
         <w:t xml:space="preserve">The main gap in the current market is that existing standards and vendors solve only part of the problem. Standards define how data should be exchanged, vendor products expose endpoints and terminology systems define how meaning should be coded. This still then requires a synthetic test harness that utilises all these tools, standards and frameworks to form a repeatable automation testing, failure simulation and validation of edge cases. </w:t>
       </w:r>
     </w:p>
@@ -7687,7 +7685,6 @@
       </w:pPr>
       <w:bookmarkStart w:id="15" w:name="_Toc238803245"/>
       <w:r>
-        <w:lastRenderedPageBreak/>
         <w:t>3.3 Comparative Analysis of Existing Solutions</w:t>
       </w:r>
       <w:bookmarkEnd w:id="15"/>
@@ -7717,11 +7714,11 @@
         <w:tblLook w:val="04A0" w:firstRow="1" w:lastRow="0" w:firstColumn="1" w:lastColumn="0" w:noHBand="0" w:noVBand="1"/>
       </w:tblPr>
       <w:tblGrid>
-        <w:gridCol w:w="1469"/>
-        <w:gridCol w:w="2065"/>
-        <w:gridCol w:w="1414"/>
-        <w:gridCol w:w="2053"/>
-        <w:gridCol w:w="2917"/>
+        <w:gridCol w:w="1510"/>
+        <w:gridCol w:w="2044"/>
+        <w:gridCol w:w="1430"/>
+        <w:gridCol w:w="2050"/>
+        <w:gridCol w:w="2884"/>
       </w:tblGrid>
       <w:tr>
         <w:tc>
@@ -8050,14 +8047,14 @@
             </w:pPr>
             <w:r>
               <w:rPr>
-                <w:rFonts w:ascii="Times New Roman" w:hAnsi="Times New Roman" w:cs="Times New Roman"/>
+                <w:rFonts w:cs="Times New Roman"/>
               </w:rPr>
               <w:t>Integration can involve </w:t>
             </w:r>
             <w:r>
               <w:rPr>
                 <w:rStyle w:val="Strong"/>
-                <w:rFonts w:ascii="Times New Roman" w:hAnsi="Times New Roman" w:cs="Times New Roman"/>
+                <w:rFonts w:cs="Times New Roman"/>
                 <w:b w:val="0"/>
                 <w:bCs w:val="0"/>
               </w:rPr>
@@ -8065,7 +8062,7 @@
             </w:r>
             <w:r>
               <w:rPr>
-                <w:rFonts w:ascii="Times New Roman" w:hAnsi="Times New Roman" w:cs="Times New Roman"/>
+                <w:rFonts w:cs="Times New Roman"/>
                 <w:b/>
                 <w:bCs/>
               </w:rPr>
@@ -8075,7 +8072,7 @@
           <w:p>
             <w:pPr>
               <w:rPr>
-                <w:rFonts w:ascii="Times New Roman" w:hAnsi="Times New Roman" w:cs="Times New Roman"/>
+                <w:rFonts w:cs="Times New Roman"/>
                 <w:lang w:eastAsia="en-AU"/>
               </w:rPr>
             </w:pPr>
@@ -8245,13 +8242,14 @@
               <w:rPr>
                 <w:color w:val="000000"/>
               </w:rPr>
-              <w:t xml:space="preserve">Synapxe HealthX innovation </w:t>
+              <w:t xml:space="preserve">Synapxe HealthX </w:t>
             </w:r>
             <w:r>
               <w:rPr>
                 <w:color w:val="000000"/>
               </w:rPr>
-              <w:t>sandbox</w:t>
+              <w:lastRenderedPageBreak/>
+              <w:t>innovation sandbox</w:t>
             </w:r>
           </w:p>
         </w:tc>
@@ -8270,12 +8268,20 @@
               <w:rPr>
                 <w:color w:val="000000"/>
               </w:rPr>
-              <w:t>Provides an innovation and experimentation environment for healthcare technologies, supporting testing, prototyping and validation of digital health solutions and interoperability concepts within a healthcare ecosystem</w:t>
+              <w:lastRenderedPageBreak/>
+              <w:t xml:space="preserve">Provides an innovation and experimentation </w:t>
             </w:r>
             <w:r>
               <w:rPr>
                 <w:color w:val="000000"/>
               </w:rPr>
+              <w:lastRenderedPageBreak/>
+              <w:t>environment for healthcare technologies, supporting testing, prototyping and validation of digital health solutions and interoperability concepts within a healthcare ecosystem</w:t>
+            </w:r>
+            <w:r>
+              <w:rPr>
+                <w:color w:val="000000"/>
+              </w:rPr>
               <w:t xml:space="preserve"> (</w:t>
             </w:r>
             <w:r>
@@ -8307,7 +8313,15 @@
               <w:rPr>
                 <w:color w:val="000000"/>
               </w:rPr>
-              <w:t>Innovation sandbox/ testing environment</w:t>
+              <w:lastRenderedPageBreak/>
+              <w:t xml:space="preserve">Innovation sandbox/ </w:t>
+            </w:r>
+            <w:r>
+              <w:rPr>
+                <w:color w:val="000000"/>
+              </w:rPr>
+              <w:lastRenderedPageBreak/>
+              <w:t>testing environment</w:t>
             </w:r>
           </w:p>
         </w:tc>
@@ -8326,7 +8340,15 @@
               <w:rPr>
                 <w:color w:val="000000"/>
               </w:rPr>
-              <w:t>Primarily focused on Singapore’s healthcare ecosystem different from Australian.</w:t>
+              <w:lastRenderedPageBreak/>
+              <w:t xml:space="preserve">Primarily focused on Singapore’s healthcare </w:t>
+            </w:r>
+            <w:r>
+              <w:rPr>
+                <w:color w:val="000000"/>
+              </w:rPr>
+              <w:lastRenderedPageBreak/>
+              <w:t>ecosystem different from Australian.</w:t>
             </w:r>
           </w:p>
         </w:tc>
@@ -8345,6 +8367,7 @@
               <w:rPr>
                 <w:color w:val="000000"/>
               </w:rPr>
+              <w:lastRenderedPageBreak/>
               <w:t>Moderately relevant as a reference model for testing healthcare technologies</w:t>
             </w:r>
           </w:p>
@@ -8356,7 +8379,6 @@
         <w:textAlignment w:val="baseline"/>
       </w:pPr>
       <w:r>
-        <w:lastRenderedPageBreak/>
         <w:t xml:space="preserve">The comparison of existing healthcare sandbox platforms demonstrates that solutions such as </w:t>
       </w:r>
       <w:r>
@@ -8468,19 +8490,28 @@
         <w:rPr>
           <w:lang w:val="en-US"/>
         </w:rPr>
-        <w:t xml:space="preserve">The third gap is clinical text generation as to code clinical meaning. MedTalk does not only document doctor patient conversation, but it must also support structured output that can be coded using SNOMED CT-AU and translated where necessary into ICD-10-AM for MBS. The existing integration approach does not provide an </w:t>
+        <w:t xml:space="preserve">The third gap is clinical text generation as to code clinical meaning. MedTalk does not only document doctor patient conversation, but it must also support structured output that can be coded using SNOMED CT-AU and translated where necessary into ICD-10-AM for MBS. </w:t>
       </w:r>
       <w:r>
         <w:rPr>
           <w:lang w:val="en-US"/>
         </w:rPr>
-        <w:t>independent</w:t>
-      </w:r>
-      <w:r>
+        <w:lastRenderedPageBreak/>
+        <w:t>The existing integration approach does not provide an independent verification mechanism for consistently detecting semantics that are mismatches or dropped between the layers. The proposed dataset will close this gap by using synthetic records with known terminology mapping and checking the translation outcomes.</w:t>
+      </w:r>
+    </w:p>
+    <w:p>
+      <w:pPr>
+        <w:textAlignment w:val="baseline"/>
         <w:rPr>
           <w:lang w:val="en-US"/>
         </w:rPr>
-        <w:t xml:space="preserve"> verification mechanism for consistently detecting semantics that are mismatches or dropped between the layers. The proposed dataset will close this gap by using synthetic records with known terminology mapping and checking the translation outcomes.</w:t>
+      </w:pPr>
+      <w:r>
+        <w:rPr>
+          <w:lang w:val="en-US"/>
+        </w:rPr>
+        <w:t xml:space="preserve">The fourth gap is happy path testing as to resilience testing. In real world healthcare integrations fail because of delays, malformed payloads, dropped connections and incomplete data. If failure conditions are not tested before deployment, MedTalk may behave unpredictably when connected to external systems like failed transactions. This requires a testing environment that does repeatable error simulations. The test harness will test robustness by simulating slow systems, bad data and connection loss. </w:t>
       </w:r>
     </w:p>
     <w:p>
@@ -8490,11 +8521,19 @@
           <w:lang w:val="en-US"/>
         </w:rPr>
       </w:pPr>
-      <w:r>
+    </w:p>
+    <w:p>
+      <w:pPr>
+        <w:textAlignment w:val="baseline"/>
         <w:rPr>
           <w:lang w:val="en-US"/>
         </w:rPr>
-        <w:t xml:space="preserve">The fourth gap is happy path testing as to resilience testing. In real world healthcare integrations fail because of delays, malformed payloads, dropped connections and incomplete data. If failure conditions are not tested before deployment, MedTalk may behave unpredictably when connected to external systems like failed transactions. This requires a testing environment that does repeatable error simulations. The test harness will test robustness by simulating slow systems, bad data and connection loss. </w:t>
+      </w:pPr>
+      <w:r>
+        <w:rPr>
+          <w:lang w:val="en-US"/>
+        </w:rPr>
+        <w:t>The fifth gap is manual validation as to reusable automation testing. When there is no automation, each release requires human checks which is slow and prone to errors. The proposed solution introduces automatic test suite, making it easy to repeat scenarios, compare results and identify regression. This boosts engineering efficiency and release confidence.</w:t>
       </w:r>
     </w:p>
     <w:p>
@@ -8504,66 +8543,11 @@
           <w:lang w:val="en-US"/>
         </w:rPr>
       </w:pPr>
-    </w:p>
-    <w:p>
-      <w:pPr>
-        <w:textAlignment w:val="baseline"/>
+      <w:r>
         <w:rPr>
           <w:lang w:val="en-US"/>
         </w:rPr>
-      </w:pPr>
-      <w:r>
-        <w:rPr>
-          <w:lang w:val="en-US"/>
-        </w:rPr>
-        <w:t xml:space="preserve">The fifth gap is manual validation as to reusable automation testing. When there is no automation, each release requires human checks which </w:t>
-      </w:r>
-      <w:proofErr w:type="gramStart"/>
-      <w:r>
-        <w:rPr>
-          <w:lang w:val="en-US"/>
-        </w:rPr>
-        <w:t>is</w:t>
-      </w:r>
-      <w:proofErr w:type="gramEnd"/>
-      <w:r>
-        <w:rPr>
-          <w:lang w:val="en-US"/>
-        </w:rPr>
-        <w:t xml:space="preserve"> slow and prone to errors. The </w:t>
-      </w:r>
-      <w:r>
-        <w:rPr>
-          <w:lang w:val="en-US"/>
-        </w:rPr>
-        <w:lastRenderedPageBreak/>
-        <w:t>proposed solution introduces automatic test suite, making it easy to repeat scenarios, compare results and identify regression. This boosts engineering efficiency and release confidence.</w:t>
-      </w:r>
-    </w:p>
-    <w:p>
-      <w:pPr>
-        <w:textAlignment w:val="baseline"/>
-        <w:rPr>
-          <w:lang w:val="en-US"/>
-        </w:rPr>
-      </w:pPr>
-      <w:r>
-        <w:rPr>
-          <w:lang w:val="en-US"/>
-        </w:rPr>
-        <w:t xml:space="preserve">The final gap is fragmented tooling as to a single validation workflow. Existing standards, terminology mapping and vendor interfaces each solve a separate problem, while MedTalk requires a unified controlled environment that brings them all together. Fragmented testing increases complexity and makes it difficult to establish consistent validation </w:t>
-      </w:r>
-      <w:r>
-        <w:rPr>
-          <w:lang w:val="en-US"/>
-        </w:rPr>
-        <w:t>processes</w:t>
-      </w:r>
-      <w:r>
-        <w:rPr>
-          <w:lang w:val="en-US"/>
-        </w:rPr>
-        <w:t>. The proposed test harness closes this gap by merging standards-based messaging, terminology validation and performing automated testing.</w:t>
+        <w:t>The final gap is fragmented tooling as to a single validation workflow. Existing standards, terminology mapping and vendor interfaces each solve a separate problem, while MedTalk requires a unified controlled environment that brings them all together. Fragmented testing increases complexity and makes it difficult to establish consistent validation processes. The proposed test harness closes this gap by merging standards-based messaging, terminology validation and performing automated testing.</w:t>
       </w:r>
     </w:p>
     <w:p>
@@ -8747,33 +8731,18 @@
     </w:p>
     <w:p>
       <w:pPr>
-        <w:pStyle w:val="Heading2"/>
-        <w:jc w:val="both"/>
-        <w:rPr>
-          <w:rFonts w:ascii="Times New Roman" w:eastAsia="Times New Roman" w:hAnsi="Times New Roman" w:cs="Times New Roman"/>
-          <w:color w:val="auto"/>
-          <w:sz w:val="24"/>
-          <w:szCs w:val="24"/>
+        <w:rPr>
           <w:lang w:val="en-GB" w:eastAsia="en-GB"/>
         </w:rPr>
       </w:pPr>
       <w:r>
         <w:rPr>
-          <w:rFonts w:ascii="Times New Roman" w:eastAsia="Times New Roman" w:hAnsi="Times New Roman" w:cs="Times New Roman"/>
-          <w:color w:val="auto"/>
-          <w:sz w:val="24"/>
-          <w:szCs w:val="24"/>
           <w:lang w:val="en-GB" w:eastAsia="en-GB"/>
         </w:rPr>
-        <w:lastRenderedPageBreak/>
         <w:t>Validated data is represented using FHIR R4 objects and passed to the interoperability testing layer</w:t>
       </w:r>
       <w:r>
         <w:rPr>
-          <w:rFonts w:ascii="Times New Roman" w:eastAsia="Times New Roman" w:hAnsi="Times New Roman" w:cs="Times New Roman"/>
-          <w:color w:val="auto"/>
-          <w:sz w:val="24"/>
-          <w:szCs w:val="24"/>
           <w:lang w:val="en-GB" w:eastAsia="en-GB"/>
         </w:rPr>
         <w:t xml:space="preserve"> (</w:t>
@@ -8781,10 +8750,6 @@
       <w:proofErr w:type="spellStart"/>
       <w:r>
         <w:rPr>
-          <w:rFonts w:ascii="Times New Roman" w:eastAsia="Times New Roman" w:hAnsi="Times New Roman" w:cs="Times New Roman"/>
-          <w:color w:val="auto"/>
-          <w:sz w:val="24"/>
-          <w:szCs w:val="24"/>
           <w:lang w:val="en-GB" w:eastAsia="en-GB"/>
         </w:rPr>
         <w:t>Gruendner</w:t>
@@ -8792,30 +8757,24 @@
       <w:proofErr w:type="spellEnd"/>
       <w:r>
         <w:rPr>
-          <w:rFonts w:ascii="Times New Roman" w:eastAsia="Times New Roman" w:hAnsi="Times New Roman" w:cs="Times New Roman"/>
-          <w:color w:val="auto"/>
-          <w:sz w:val="24"/>
-          <w:szCs w:val="24"/>
           <w:lang w:val="en-GB" w:eastAsia="en-GB"/>
         </w:rPr>
-        <w:t xml:space="preserve"> et al., 2021). </w:t>
-      </w:r>
-      <w:r>
-        <w:rPr>
-          <w:rFonts w:ascii="Times New Roman" w:eastAsia="Times New Roman" w:hAnsi="Times New Roman" w:cs="Times New Roman"/>
-          <w:color w:val="auto"/>
-          <w:sz w:val="24"/>
-          <w:szCs w:val="24"/>
+        <w:t xml:space="preserve"> et al., 2021).</w:t>
+      </w:r>
+      <w:r>
+        <w:rPr>
           <w:lang w:val="en-GB" w:eastAsia="en-GB"/>
         </w:rPr>
+        <w:t xml:space="preserve"> </w:t>
+      </w:r>
+      <w:r>
+        <w:rPr>
+          <w:lang w:val="en-GB" w:eastAsia="en-GB"/>
+        </w:rPr>
         <w:t xml:space="preserve"> In addition, HL7 v2 messages can be simulated in case it is required. Data will go through the terminology mapping stage, where representative clinical concepts will be mapped on SNOMED CT-AU, ICD-10-AM and MBS</w:t>
       </w:r>
       <w:r>
         <w:rPr>
-          <w:rFonts w:ascii="Times New Roman" w:eastAsia="Times New Roman" w:hAnsi="Times New Roman" w:cs="Times New Roman"/>
-          <w:color w:val="auto"/>
-          <w:sz w:val="24"/>
-          <w:szCs w:val="24"/>
           <w:lang w:val="en-GB" w:eastAsia="en-GB"/>
         </w:rPr>
         <w:t xml:space="preserve"> (</w:t>
@@ -8823,10 +8782,6 @@
       <w:proofErr w:type="spellStart"/>
       <w:r>
         <w:rPr>
-          <w:rFonts w:ascii="Times New Roman" w:eastAsia="Times New Roman" w:hAnsi="Times New Roman" w:cs="Times New Roman"/>
-          <w:color w:val="auto"/>
-          <w:sz w:val="24"/>
-          <w:szCs w:val="24"/>
           <w:lang w:val="en-GB" w:eastAsia="en-GB"/>
         </w:rPr>
         <w:t>Giannangelo</w:t>
@@ -8834,20 +8789,12 @@
       <w:proofErr w:type="spellEnd"/>
       <w:r>
         <w:rPr>
-          <w:rFonts w:ascii="Times New Roman" w:eastAsia="Times New Roman" w:hAnsi="Times New Roman" w:cs="Times New Roman"/>
-          <w:color w:val="auto"/>
-          <w:sz w:val="24"/>
-          <w:szCs w:val="24"/>
           <w:lang w:val="en-GB" w:eastAsia="en-GB"/>
         </w:rPr>
         <w:t xml:space="preserve"> et al., 2012).</w:t>
       </w:r>
       <w:r>
         <w:rPr>
-          <w:rFonts w:ascii="Times New Roman" w:eastAsia="Times New Roman" w:hAnsi="Times New Roman" w:cs="Times New Roman"/>
-          <w:color w:val="auto"/>
-          <w:sz w:val="24"/>
-          <w:szCs w:val="24"/>
           <w:lang w:val="en-GB" w:eastAsia="en-GB"/>
         </w:rPr>
         <w:t xml:space="preserve"> Repository will provide a special terminology mapping chain that depicts this process.</w:t>
@@ -8874,6 +8821,7 @@
           <w:szCs w:val="24"/>
           <w:lang w:val="en-GB" w:eastAsia="en-GB"/>
         </w:rPr>
+        <w:lastRenderedPageBreak/>
         <w:drawing>
           <wp:inline distT="0" distB="0" distL="0" distR="0" wp14:anchorId="6B26B5B5" wp14:editId="4715E35B">
             <wp:extent cx="5943600" cy="586105"/>
@@ -8919,6 +8867,71 @@
     </w:p>
     <w:p>
       <w:pPr>
+        <w:rPr>
+          <w:lang w:val="en-GB" w:eastAsia="en-GB"/>
+        </w:rPr>
+      </w:pPr>
+      <w:r>
+        <w:rPr>
+          <w:lang w:val="en-GB" w:eastAsia="en-GB"/>
+        </w:rPr>
+        <w:t>Figure 4.1.</w:t>
+      </w:r>
+      <w:r>
+        <w:rPr>
+          <w:lang w:val="en-GB" w:eastAsia="en-GB"/>
+        </w:rPr>
+        <w:t>2</w:t>
+      </w:r>
+      <w:r>
+        <w:rPr>
+          <w:lang w:val="en-GB" w:eastAsia="en-GB"/>
+        </w:rPr>
+        <w:t xml:space="preserve"> Terminology Mapping Chain</w:t>
+      </w:r>
+    </w:p>
+    <w:p>
+      <w:pPr>
+        <w:rPr>
+          <w:lang w:val="en-GB" w:eastAsia="en-GB"/>
+        </w:rPr>
+      </w:pPr>
+      <w:r>
+        <w:rPr>
+          <w:lang w:val="en-GB" w:eastAsia="en-GB"/>
+        </w:rPr>
+        <w:t xml:space="preserve">Test execution layer performs normal, negative and degraded scenarios. These involve successful message exchange, malformed data, slow responses and dropped connections. The response from test execution layer is evaluated according to the expected outcome and stored for future analysis. Simulated connector layer provides simulated EMR integrations relevant to MedTalk Connect, which will allow testing connector </w:t>
+      </w:r>
+      <w:proofErr w:type="spellStart"/>
+      <w:r>
+        <w:rPr>
+          <w:lang w:val="en-GB" w:eastAsia="en-GB"/>
+        </w:rPr>
+        <w:t>behavior</w:t>
+      </w:r>
+      <w:proofErr w:type="spellEnd"/>
+      <w:r>
+        <w:rPr>
+          <w:lang w:val="en-GB" w:eastAsia="en-GB"/>
+        </w:rPr>
+        <w:t xml:space="preserve"> without having to connect the test harness to production clinical systems.</w:t>
+      </w:r>
+    </w:p>
+    <w:p>
+      <w:pPr>
+        <w:rPr>
+          <w:lang w:val="en-GB" w:eastAsia="en-GB"/>
+        </w:rPr>
+      </w:pPr>
+      <w:r>
+        <w:rPr>
+          <w:lang w:val="en-GB" w:eastAsia="en-GB"/>
+        </w:rPr>
+        <w:t>The primary trust boundaries are thus established between the authorized user and the test harness, between unvalidated and validated synthetic data and between internal test environment and simulated connectors. The authentication, access control, data validation, connector isolation and secure communication are proposed as a protection measure at these trust boundaries. Such design allows implementing all the necessary requirements of the project directly.</w:t>
+      </w:r>
+    </w:p>
+    <w:p>
+      <w:pPr>
         <w:pStyle w:val="Heading2"/>
         <w:jc w:val="both"/>
         <w:rPr>
@@ -8929,169 +8942,58 @@
           <w:lang w:val="en-GB" w:eastAsia="en-GB"/>
         </w:rPr>
       </w:pPr>
-      <w:r>
-        <w:rPr>
-          <w:rFonts w:ascii="Times New Roman" w:eastAsia="Times New Roman" w:hAnsi="Times New Roman" w:cs="Times New Roman"/>
-          <w:color w:val="auto"/>
-          <w:sz w:val="24"/>
-          <w:szCs w:val="24"/>
+    </w:p>
+    <w:p>
+      <w:pPr>
+        <w:pStyle w:val="Heading2"/>
+      </w:pPr>
+      <w:r>
+        <w:t>4.2 Technology Stack and Justification</w:t>
+      </w:r>
+    </w:p>
+    <w:p>
+      <w:pPr>
+        <w:jc w:val="both"/>
+        <w:rPr>
+          <w:rFonts w:eastAsia="Times New Roman" w:cs="Times New Roman"/>
           <w:lang w:val="en-GB" w:eastAsia="en-GB"/>
         </w:rPr>
-        <w:t>Figure 4.1.</w:t>
-      </w:r>
-      <w:r>
-        <w:rPr>
-          <w:rFonts w:ascii="Times New Roman" w:eastAsia="Times New Roman" w:hAnsi="Times New Roman" w:cs="Times New Roman"/>
-          <w:color w:val="auto"/>
-          <w:sz w:val="24"/>
-          <w:szCs w:val="24"/>
+      </w:pPr>
+      <w:r>
+        <w:rPr>
+          <w:rFonts w:eastAsia="Times New Roman" w:cs="Times New Roman"/>
           <w:lang w:val="en-GB" w:eastAsia="en-GB"/>
         </w:rPr>
-        <w:t>2</w:t>
-      </w:r>
-      <w:r>
-        <w:rPr>
-          <w:rFonts w:ascii="Times New Roman" w:eastAsia="Times New Roman" w:hAnsi="Times New Roman" w:cs="Times New Roman"/>
-          <w:color w:val="auto"/>
-          <w:sz w:val="24"/>
-          <w:szCs w:val="24"/>
+        <w:t>The technology stack is chosen taking into consideration interoperability standards, needs of Australian healthcare system, security and cheapness of implementation. The selected technologies will enable implementing the Stage 1 architecture, laying a foundation for the Stage 2.</w:t>
+      </w:r>
+    </w:p>
+    <w:p>
+      <w:pPr>
+        <w:jc w:val="both"/>
+        <w:rPr>
+          <w:rFonts w:eastAsia="Times New Roman" w:cs="Times New Roman"/>
           <w:lang w:val="en-GB" w:eastAsia="en-GB"/>
         </w:rPr>
-        <w:t xml:space="preserve"> Terminology Mapping Chain</w:t>
-      </w:r>
-    </w:p>
-    <w:p>
-      <w:pPr>
-        <w:pStyle w:val="Heading2"/>
-        <w:jc w:val="both"/>
-        <w:rPr>
-          <w:rFonts w:ascii="Times New Roman" w:eastAsia="Times New Roman" w:hAnsi="Times New Roman" w:cs="Times New Roman"/>
-          <w:color w:val="auto"/>
-          <w:sz w:val="24"/>
-          <w:szCs w:val="24"/>
+      </w:pPr>
+      <w:r>
+        <w:rPr>
+          <w:rFonts w:eastAsia="Times New Roman" w:cs="Times New Roman"/>
           <w:lang w:val="en-GB" w:eastAsia="en-GB"/>
         </w:rPr>
-      </w:pPr>
-      <w:r>
-        <w:rPr>
-          <w:rFonts w:ascii="Times New Roman" w:eastAsia="Times New Roman" w:hAnsi="Times New Roman" w:cs="Times New Roman"/>
-          <w:color w:val="auto"/>
-          <w:sz w:val="24"/>
-          <w:szCs w:val="24"/>
+        <w:t>React technology is used as the frontend framework because of the requirement to use the stateful and component-based interface (scenario builder, results of the live test, connector statuses) instead of several static pages; React technology, along with its ecosystem, will enable developing such an interface without paying license costs, which is possible due to the limitations of the project budget.  There are both Python (</w:t>
+      </w:r>
+      <w:proofErr w:type="spellStart"/>
+      <w:r>
+        <w:rPr>
+          <w:rFonts w:eastAsia="Times New Roman" w:cs="Times New Roman"/>
           <w:lang w:val="en-GB" w:eastAsia="en-GB"/>
         </w:rPr>
-        <w:t xml:space="preserve">Test execution layer performs normal, negative and degraded scenarios. These involve successful message exchange, malformed data, slow responses and dropped connections. The response from test execution layer is evaluated according to the expected outcome and stored for future analysis. Simulated connector layer provides simulated EMR integrations relevant to MedTalk Connect, which will allow testing connector </w:t>
-      </w:r>
-      <w:proofErr w:type="spellStart"/>
-      <w:r>
-        <w:rPr>
-          <w:rFonts w:ascii="Times New Roman" w:eastAsia="Times New Roman" w:hAnsi="Times New Roman" w:cs="Times New Roman"/>
-          <w:color w:val="auto"/>
-          <w:sz w:val="24"/>
-          <w:szCs w:val="24"/>
-          <w:lang w:val="en-GB" w:eastAsia="en-GB"/>
-        </w:rPr>
-        <w:t>behavior</w:t>
+        <w:t>FastAPI</w:t>
       </w:r>
       <w:proofErr w:type="spellEnd"/>
       <w:r>
         <w:rPr>
-          <w:rFonts w:ascii="Times New Roman" w:eastAsia="Times New Roman" w:hAnsi="Times New Roman" w:cs="Times New Roman"/>
-          <w:color w:val="auto"/>
-          <w:sz w:val="24"/>
-          <w:szCs w:val="24"/>
-          <w:lang w:val="en-GB" w:eastAsia="en-GB"/>
-        </w:rPr>
-        <w:t xml:space="preserve"> without having to connect the test harness to production clinical systems.</w:t>
-      </w:r>
-    </w:p>
-    <w:p>
-      <w:pPr>
-        <w:pStyle w:val="Heading2"/>
-        <w:jc w:val="both"/>
-        <w:rPr>
-          <w:rFonts w:ascii="Times New Roman" w:eastAsia="Times New Roman" w:hAnsi="Times New Roman" w:cs="Times New Roman"/>
-          <w:color w:val="auto"/>
-          <w:sz w:val="24"/>
-          <w:szCs w:val="24"/>
-          <w:lang w:val="en-GB" w:eastAsia="en-GB"/>
-        </w:rPr>
-      </w:pPr>
-      <w:r>
-        <w:rPr>
-          <w:rFonts w:ascii="Times New Roman" w:eastAsia="Times New Roman" w:hAnsi="Times New Roman" w:cs="Times New Roman"/>
-          <w:color w:val="auto"/>
-          <w:sz w:val="24"/>
-          <w:szCs w:val="24"/>
-          <w:lang w:val="en-GB" w:eastAsia="en-GB"/>
-        </w:rPr>
-        <w:t>The primary trust boundaries are thus established between the authorized user and the test harness, between unvalidated and validated synthetic data and between internal test environment and simulated connectors. The authentication, access control, data validation, connector isolation and secure communication are proposed as a protection measure at these trust boundaries. Such design allows implementing all the necessary requirements of the project directly.</w:t>
-      </w:r>
-    </w:p>
-    <w:p>
-      <w:pPr>
-        <w:pStyle w:val="Heading2"/>
-        <w:jc w:val="both"/>
-        <w:rPr>
-          <w:rFonts w:ascii="Times New Roman" w:eastAsia="Times New Roman" w:hAnsi="Times New Roman" w:cs="Times New Roman"/>
-          <w:color w:val="auto"/>
-          <w:sz w:val="24"/>
-          <w:szCs w:val="24"/>
-          <w:lang w:val="en-GB" w:eastAsia="en-GB"/>
-        </w:rPr>
-      </w:pPr>
-    </w:p>
-    <w:p>
-      <w:pPr>
-        <w:pStyle w:val="Heading2"/>
-      </w:pPr>
-      <w:r>
-        <w:t>4.2 Technology Stack and Justification</w:t>
-      </w:r>
-    </w:p>
-    <w:p>
-      <w:pPr>
-        <w:jc w:val="both"/>
-        <w:rPr>
-          <w:rFonts w:ascii="Times New Roman" w:eastAsia="Times New Roman" w:hAnsi="Times New Roman" w:cs="Times New Roman"/>
-          <w:lang w:val="en-GB" w:eastAsia="en-GB"/>
-        </w:rPr>
-      </w:pPr>
-      <w:r>
-        <w:rPr>
-          <w:rFonts w:ascii="Times New Roman" w:eastAsia="Times New Roman" w:hAnsi="Times New Roman" w:cs="Times New Roman"/>
-          <w:lang w:val="en-GB" w:eastAsia="en-GB"/>
-        </w:rPr>
-        <w:t>The technology stack is chosen taking into consideration interoperability standards, needs of Australian healthcare system, security and cheapness of implementation. The selected technologies will enable implementing the Stage 1 architecture, laying a foundation for the Stage 2.</w:t>
-      </w:r>
-    </w:p>
-    <w:p>
-      <w:pPr>
-        <w:jc w:val="both"/>
-        <w:rPr>
-          <w:rFonts w:ascii="Times New Roman" w:eastAsia="Times New Roman" w:hAnsi="Times New Roman" w:cs="Times New Roman"/>
-          <w:lang w:val="en-GB" w:eastAsia="en-GB"/>
-        </w:rPr>
-      </w:pPr>
-      <w:r>
-        <w:rPr>
-          <w:rFonts w:ascii="Times New Roman" w:eastAsia="Times New Roman" w:hAnsi="Times New Roman" w:cs="Times New Roman"/>
-          <w:lang w:val="en-GB" w:eastAsia="en-GB"/>
-        </w:rPr>
-        <w:t>React technology is used as the frontend framework because of the requirement to use the stateful and component-based interface (scenario builder, results of the live test, connector statuses) instead of several static pages; React technology, along with its ecosystem, will enable developing such an interface without paying license costs, which is possible due to the limitations of the project budget.  There are both Python (</w:t>
-      </w:r>
-      <w:proofErr w:type="spellStart"/>
-      <w:r>
-        <w:rPr>
-          <w:rFonts w:ascii="Times New Roman" w:eastAsia="Times New Roman" w:hAnsi="Times New Roman" w:cs="Times New Roman"/>
-          <w:lang w:val="en-GB" w:eastAsia="en-GB"/>
-        </w:rPr>
-        <w:t>FastAPI</w:t>
-      </w:r>
-      <w:proofErr w:type="spellEnd"/>
-      <w:r>
-        <w:rPr>
-          <w:rFonts w:ascii="Times New Roman" w:eastAsia="Times New Roman" w:hAnsi="Times New Roman" w:cs="Times New Roman"/>
+          <w:rFonts w:eastAsia="Times New Roman" w:cs="Times New Roman"/>
           <w:lang w:val="en-GB" w:eastAsia="en-GB"/>
         </w:rPr>
         <w:t>) and Node.js (Express) suggested as the backend languages, not as the single option, because any of these frameworks will be able to implement the sandbox FHIR API with equal level of efficiency and community; the actual choice will be decided by the knowledge of the team, not by any technological requirement.</w:t>
@@ -9125,9 +9027,9 @@
         <w:tblLook w:val="04A0" w:firstRow="1" w:lastRow="0" w:firstColumn="1" w:lastColumn="0" w:noHBand="0" w:noVBand="1"/>
       </w:tblPr>
       <w:tblGrid>
-        <w:gridCol w:w="1865"/>
-        <w:gridCol w:w="1784"/>
-        <w:gridCol w:w="2889"/>
+        <w:gridCol w:w="1843"/>
+        <w:gridCol w:w="1935"/>
+        <w:gridCol w:w="2760"/>
         <w:gridCol w:w="3635"/>
       </w:tblGrid>
       <w:tr>
@@ -9804,22 +9706,33 @@
     </w:tbl>
     <w:p>
       <w:pPr>
-        <w:pStyle w:val="Heading2"/>
+        <w:rPr>
+          <w:lang w:val="en-GB" w:eastAsia="en-GB"/>
+        </w:rPr>
+      </w:pPr>
+    </w:p>
+    <w:p>
+      <w:pPr>
+        <w:rPr>
+          <w:lang w:val="en-GB" w:eastAsia="en-GB"/>
+        </w:rPr>
+      </w:pPr>
+      <w:r>
+        <w:rPr>
+          <w:lang w:val="en-GB" w:eastAsia="en-GB"/>
+        </w:rPr>
+        <w:br w:type="page"/>
+      </w:r>
+    </w:p>
+    <w:p>
+      <w:pPr>
         <w:jc w:val="both"/>
         <w:rPr>
-          <w:rFonts w:ascii="Times New Roman" w:eastAsia="Times New Roman" w:hAnsi="Times New Roman" w:cs="Times New Roman"/>
-          <w:color w:val="auto"/>
-          <w:sz w:val="24"/>
-          <w:szCs w:val="24"/>
           <w:lang w:val="en-GB" w:eastAsia="en-GB"/>
         </w:rPr>
       </w:pPr>
       <w:r>
         <w:rPr>
-          <w:rFonts w:ascii="Times New Roman" w:eastAsia="Times New Roman" w:hAnsi="Times New Roman" w:cs="Times New Roman"/>
-          <w:color w:val="auto"/>
-          <w:sz w:val="24"/>
-          <w:szCs w:val="24"/>
           <w:lang w:val="en-GB" w:eastAsia="en-GB"/>
         </w:rPr>
         <w:lastRenderedPageBreak/>
@@ -9827,50 +9740,30 @@
       </w:r>
       <w:r>
         <w:rPr>
-          <w:rFonts w:ascii="Times New Roman" w:eastAsia="Times New Roman" w:hAnsi="Times New Roman" w:cs="Times New Roman"/>
-          <w:color w:val="auto"/>
-          <w:sz w:val="24"/>
-          <w:szCs w:val="24"/>
           <w:lang w:val="en-GB" w:eastAsia="en-GB"/>
         </w:rPr>
         <w:t xml:space="preserve"> (HL7 Australia, n.d.). </w:t>
       </w:r>
       <w:r>
         <w:rPr>
-          <w:rFonts w:ascii="Times New Roman" w:eastAsia="Times New Roman" w:hAnsi="Times New Roman" w:cs="Times New Roman"/>
-          <w:color w:val="auto"/>
-          <w:sz w:val="24"/>
-          <w:szCs w:val="24"/>
           <w:lang w:val="en-GB" w:eastAsia="en-GB"/>
         </w:rPr>
         <w:t xml:space="preserve"> HL7 v2 remains part of the complementary simulation capabilities but not a substitute for FHIR. The terminology standards (SNOMED CT-AU, ICD-10-AM, MBS) serve as the foundation for clinical and billing mapping testing, whereas SMART on FHIR and OAuth 2.0 become the proposed authentication </w:t>
       </w:r>
       <w:r>
         <w:rPr>
-          <w:rFonts w:ascii="Times New Roman" w:eastAsia="Times New Roman" w:hAnsi="Times New Roman" w:cs="Times New Roman"/>
-          <w:color w:val="auto"/>
-          <w:sz w:val="24"/>
-          <w:szCs w:val="24"/>
           <w:lang w:val="en-GB" w:eastAsia="en-GB"/>
         </w:rPr>
         <w:t xml:space="preserve">approach (SMART Health IT, n.d.). </w:t>
       </w:r>
       <w:r>
         <w:rPr>
-          <w:rFonts w:ascii="Times New Roman" w:eastAsia="Times New Roman" w:hAnsi="Times New Roman" w:cs="Times New Roman"/>
-          <w:color w:val="auto"/>
-          <w:sz w:val="24"/>
-          <w:szCs w:val="24"/>
           <w:lang w:val="en-GB" w:eastAsia="en-GB"/>
         </w:rPr>
         <w:t>Docker becomes a Stage 2 implementation technology and not the pre-existing solution due to the scope of work, where no test harness implementation takes place in Stage 1. Postman/Newman becomes part of the solution besides the unit-testing platform since the API validation comes from an external protocol level that the unit testing cannot handle</w:t>
       </w:r>
       <w:r>
         <w:rPr>
-          <w:rFonts w:ascii="Times New Roman" w:eastAsia="Times New Roman" w:hAnsi="Times New Roman" w:cs="Times New Roman"/>
-          <w:color w:val="auto"/>
-          <w:sz w:val="24"/>
-          <w:szCs w:val="24"/>
           <w:lang w:val="en-GB" w:eastAsia="en-GB"/>
         </w:rPr>
         <w:t xml:space="preserve"> (</w:t>
@@ -9878,10 +9771,6 @@
       <w:proofErr w:type="spellStart"/>
       <w:r>
         <w:rPr>
-          <w:rFonts w:ascii="Times New Roman" w:eastAsia="Times New Roman" w:hAnsi="Times New Roman" w:cs="Times New Roman"/>
-          <w:color w:val="auto"/>
-          <w:sz w:val="24"/>
-          <w:szCs w:val="24"/>
           <w:lang w:val="en-GB" w:eastAsia="en-GB"/>
         </w:rPr>
         <w:t>Gruendner</w:t>
@@ -9889,10 +9778,6 @@
       <w:proofErr w:type="spellEnd"/>
       <w:r>
         <w:rPr>
-          <w:rFonts w:ascii="Times New Roman" w:eastAsia="Times New Roman" w:hAnsi="Times New Roman" w:cs="Times New Roman"/>
-          <w:color w:val="auto"/>
-          <w:sz w:val="24"/>
-          <w:szCs w:val="24"/>
           <w:lang w:val="en-GB" w:eastAsia="en-GB"/>
         </w:rPr>
         <w:t xml:space="preserve"> et al., 2021).</w:t>
@@ -9987,10 +9872,10 @@
         <w:tblLook w:val="04A0" w:firstRow="1" w:lastRow="0" w:firstColumn="1" w:lastColumn="0" w:noHBand="0" w:noVBand="1"/>
       </w:tblPr>
       <w:tblGrid>
-        <w:gridCol w:w="2374"/>
-        <w:gridCol w:w="3268"/>
-        <w:gridCol w:w="1186"/>
-        <w:gridCol w:w="2188"/>
+        <w:gridCol w:w="2405"/>
+        <w:gridCol w:w="3223"/>
+        <w:gridCol w:w="1220"/>
+        <w:gridCol w:w="2168"/>
       </w:tblGrid>
       <w:tr>
         <w:trPr>
@@ -10768,10 +10653,109 @@
     </w:p>
     <w:p>
       <w:pPr>
-        <w:rPr>
-          <w:rFonts w:ascii="Times New Roman" w:eastAsia="Times New Roman" w:hAnsi="Times New Roman" w:cs="Times New Roman"/>
+        <w:pStyle w:val="NormalWeb"/>
+        <w:jc w:val="both"/>
+      </w:pPr>
+      <w:r>
+        <w:rPr>
+          <w:noProof/>
+          <w14:ligatures w14:val="standardContextual"/>
+        </w:rPr>
+        <w:lastRenderedPageBreak/>
+        <w:drawing>
+          <wp:inline distT="0" distB="0" distL="0" distR="0" wp14:anchorId="0426236E" wp14:editId="020FE4F1">
+            <wp:extent cx="5731510" cy="3783330"/>
+            <wp:effectExtent l="0" t="0" r="0" b="1270"/>
+            <wp:docPr id="976933799" name="Picture 2"/>
+            <wp:cNvGraphicFramePr>
+              <a:graphicFrameLocks xmlns:a="http://schemas.openxmlformats.org/drawingml/2006/main" noChangeAspect="1"/>
+            </wp:cNvGraphicFramePr>
+            <a:graphic xmlns:a="http://schemas.openxmlformats.org/drawingml/2006/main">
+              <a:graphicData uri="http://schemas.openxmlformats.org/drawingml/2006/picture">
+                <pic:pic xmlns:pic="http://schemas.openxmlformats.org/drawingml/2006/picture">
+                  <pic:nvPicPr>
+                    <pic:cNvPr id="976933799" name="Picture 976933799"/>
+                    <pic:cNvPicPr/>
+                  </pic:nvPicPr>
+                  <pic:blipFill>
+                    <a:blip r:embed="rId13" cstate="print">
+                      <a:extLst>
+                        <a:ext uri="{28A0092B-C50C-407E-A947-70E740481C1C}">
+                          <a14:useLocalDpi xmlns:a14="http://schemas.microsoft.com/office/drawing/2010/main" val="0"/>
+                        </a:ext>
+                      </a:extLst>
+                    </a:blip>
+                    <a:stretch>
+                      <a:fillRect/>
+                    </a:stretch>
+                  </pic:blipFill>
+                  <pic:spPr>
+                    <a:xfrm>
+                      <a:off x="0" y="0"/>
+                      <a:ext cx="5731510" cy="3783330"/>
+                    </a:xfrm>
+                    <a:prstGeom prst="rect">
+                      <a:avLst/>
+                    </a:prstGeom>
+                  </pic:spPr>
+                </pic:pic>
+              </a:graphicData>
+            </a:graphic>
+          </wp:inline>
+        </w:drawing>
+      </w:r>
+    </w:p>
+    <w:p>
+      <w:pPr>
+        <w:pStyle w:val="NormalWeb"/>
+        <w:jc w:val="both"/>
+        <w:rPr>
+          <w:b/>
+          <w:bCs/>
+        </w:rPr>
+      </w:pPr>
+      <w:r>
+        <w:rPr>
+          <w:b/>
+          <w:bCs/>
+        </w:rPr>
+        <w:t>Figure 4.3.0:</w:t>
+      </w:r>
+      <w:r>
+        <w:rPr>
+          <w:b/>
+          <w:bCs/>
+        </w:rPr>
+        <w:t xml:space="preserve"> </w:t>
+      </w:r>
+      <w:r>
+        <w:rPr>
+          <w:b/>
+          <w:bCs/>
+        </w:rPr>
+        <w:t>Threat model</w:t>
+      </w:r>
+    </w:p>
+    <w:p>
+      <w:pPr>
+        <w:pStyle w:val="NormalWeb"/>
+        <w:jc w:val="both"/>
+      </w:pPr>
+      <w:r>
+        <w:t>This figure extends the design presented in Section 4.1 by assigning the STRIDE threats across the three trust boundaries that have been defined previously. Clinicians and testers access the design via two separate but authenticated methods: a federated SMART on FHIR launch and a sandbox token login, both traversing Trust Boundary 1 via the identity gateway. The data travels through the scenario building, validating synthetic data (Boundary 2), terminology mapping, and tests, finally arriving at simulated EMR connectors (Boundary 3). The two threat actors used for analysis in the design — an external attacker testing credentials and a malicious insider posing a risk of configuration drift — are represented with vectors pointing at the threatened boundaries. A panel showing asset categorisation lists data at rest, data in transit, and credentials/secrets, and STRIDE matrix (R-01-R-05) is included linking risks with their assets and mitigations</w:t>
+      </w:r>
+      <w:r>
+        <w:t xml:space="preserve"> as shown in the table below</w:t>
+      </w:r>
+      <w:r>
+        <w:t>.</w:t>
+      </w:r>
+    </w:p>
+    <w:p>
+      <w:pPr>
+        <w:rPr>
+          <w:rFonts w:eastAsia="Times New Roman" w:cs="Times New Roman"/>
           <w:kern w:val="0"/>
-          <w:sz w:val="24"/>
           <w:szCs w:val="24"/>
           <w:lang w:val="en-GB" w:eastAsia="en-GB"/>
           <w14:ligatures w14:val="none"/>
@@ -10783,10 +10767,1199 @@
     </w:p>
     <w:p>
       <w:pPr>
+        <w:pStyle w:val="NormalWeb"/>
+        <w:rPr>
+          <w:b/>
+          <w:bCs/>
+        </w:rPr>
+      </w:pPr>
+      <w:r>
+        <w:rPr>
+          <w:b/>
+          <w:bCs/>
+        </w:rPr>
+        <w:lastRenderedPageBreak/>
+        <w:t>Table 4.3.2 Stride Table</w:t>
+      </w:r>
+    </w:p>
+    <w:tbl>
+      <w:tblPr>
+        <w:tblStyle w:val="TableGridLight"/>
+        <w:tblW w:w="10207" w:type="dxa"/>
+        <w:tblInd w:w="-431" w:type="dxa"/>
+        <w:tblLook w:val="04A0" w:firstRow="1" w:lastRow="0" w:firstColumn="1" w:lastColumn="0" w:noHBand="0" w:noVBand="1"/>
+      </w:tblPr>
+      <w:tblGrid>
+        <w:gridCol w:w="912"/>
+        <w:gridCol w:w="2349"/>
+        <w:gridCol w:w="1276"/>
+        <w:gridCol w:w="1197"/>
+        <w:gridCol w:w="2347"/>
+        <w:gridCol w:w="2126"/>
+      </w:tblGrid>
+      <w:tr>
+        <w:tc>
+          <w:tcPr>
+            <w:tcW w:w="912" w:type="dxa"/>
+            <w:hideMark/>
+          </w:tcPr>
+          <w:p>
+            <w:pPr>
+              <w:jc w:val="center"/>
+              <w:rPr>
+                <w:rFonts w:ascii="Arial" w:eastAsia="Times New Roman" w:hAnsi="Arial" w:cs="Arial"/>
+                <w:b/>
+                <w:bCs/>
+                <w:kern w:val="0"/>
+                <w:sz w:val="21"/>
+                <w:szCs w:val="21"/>
+                <w:lang w:val="en-GB" w:eastAsia="en-GB"/>
+                <w14:ligatures w14:val="none"/>
+              </w:rPr>
+            </w:pPr>
+            <w:r>
+              <w:rPr>
+                <w:rFonts w:ascii="Arial" w:eastAsia="Times New Roman" w:hAnsi="Arial" w:cs="Arial"/>
+                <w:b/>
+                <w:bCs/>
+                <w:kern w:val="0"/>
+                <w:sz w:val="21"/>
+                <w:szCs w:val="21"/>
+                <w:lang w:val="en-GB" w:eastAsia="en-GB"/>
+                <w14:ligatures w14:val="none"/>
+              </w:rPr>
+              <w:t>ID</w:t>
+            </w:r>
+          </w:p>
+        </w:tc>
+        <w:tc>
+          <w:tcPr>
+            <w:tcW w:w="2349" w:type="dxa"/>
+            <w:hideMark/>
+          </w:tcPr>
+          <w:p>
+            <w:pPr>
+              <w:jc w:val="center"/>
+              <w:rPr>
+                <w:rFonts w:ascii="Arial" w:eastAsia="Times New Roman" w:hAnsi="Arial" w:cs="Arial"/>
+                <w:b/>
+                <w:bCs/>
+                <w:kern w:val="0"/>
+                <w:sz w:val="21"/>
+                <w:szCs w:val="21"/>
+                <w:lang w:val="en-GB" w:eastAsia="en-GB"/>
+                <w14:ligatures w14:val="none"/>
+              </w:rPr>
+            </w:pPr>
+            <w:r>
+              <w:rPr>
+                <w:rFonts w:ascii="Arial" w:eastAsia="Times New Roman" w:hAnsi="Arial" w:cs="Arial"/>
+                <w:b/>
+                <w:bCs/>
+                <w:kern w:val="0"/>
+                <w:sz w:val="21"/>
+                <w:szCs w:val="21"/>
+                <w:lang w:val="en-GB" w:eastAsia="en-GB"/>
+                <w14:ligatures w14:val="none"/>
+              </w:rPr>
+              <w:t>Risk Description</w:t>
+            </w:r>
+          </w:p>
+        </w:tc>
+        <w:tc>
+          <w:tcPr>
+            <w:tcW w:w="1276" w:type="dxa"/>
+            <w:hideMark/>
+          </w:tcPr>
+          <w:p>
+            <w:pPr>
+              <w:jc w:val="center"/>
+              <w:rPr>
+                <w:rFonts w:ascii="Arial" w:eastAsia="Times New Roman" w:hAnsi="Arial" w:cs="Arial"/>
+                <w:b/>
+                <w:bCs/>
+                <w:kern w:val="0"/>
+                <w:sz w:val="21"/>
+                <w:szCs w:val="21"/>
+                <w:lang w:val="en-GB" w:eastAsia="en-GB"/>
+                <w14:ligatures w14:val="none"/>
+              </w:rPr>
+            </w:pPr>
+            <w:r>
+              <w:rPr>
+                <w:rFonts w:ascii="Arial" w:eastAsia="Times New Roman" w:hAnsi="Arial" w:cs="Arial"/>
+                <w:b/>
+                <w:bCs/>
+                <w:kern w:val="0"/>
+                <w:sz w:val="21"/>
+                <w:szCs w:val="21"/>
+                <w:lang w:val="en-GB" w:eastAsia="en-GB"/>
+                <w14:ligatures w14:val="none"/>
+              </w:rPr>
+              <w:t>STRIDE Category</w:t>
+            </w:r>
+          </w:p>
+        </w:tc>
+        <w:tc>
+          <w:tcPr>
+            <w:tcW w:w="1197" w:type="dxa"/>
+            <w:hideMark/>
+          </w:tcPr>
+          <w:p>
+            <w:pPr>
+              <w:jc w:val="center"/>
+              <w:rPr>
+                <w:rFonts w:ascii="Arial" w:eastAsia="Times New Roman" w:hAnsi="Arial" w:cs="Arial"/>
+                <w:b/>
+                <w:bCs/>
+                <w:kern w:val="0"/>
+                <w:sz w:val="21"/>
+                <w:szCs w:val="21"/>
+                <w:lang w:val="en-GB" w:eastAsia="en-GB"/>
+                <w14:ligatures w14:val="none"/>
+              </w:rPr>
+            </w:pPr>
+            <w:r>
+              <w:rPr>
+                <w:rFonts w:ascii="Arial" w:eastAsia="Times New Roman" w:hAnsi="Arial" w:cs="Arial"/>
+                <w:b/>
+                <w:bCs/>
+                <w:kern w:val="0"/>
+                <w:sz w:val="21"/>
+                <w:szCs w:val="21"/>
+                <w:lang w:val="en-GB" w:eastAsia="en-GB"/>
+                <w14:ligatures w14:val="none"/>
+              </w:rPr>
+              <w:t>Boundary</w:t>
+            </w:r>
+          </w:p>
+        </w:tc>
+        <w:tc>
+          <w:tcPr>
+            <w:tcW w:w="2347" w:type="dxa"/>
+            <w:hideMark/>
+          </w:tcPr>
+          <w:p>
+            <w:pPr>
+              <w:jc w:val="center"/>
+              <w:rPr>
+                <w:rFonts w:ascii="Arial" w:eastAsia="Times New Roman" w:hAnsi="Arial" w:cs="Arial"/>
+                <w:b/>
+                <w:bCs/>
+                <w:kern w:val="0"/>
+                <w:sz w:val="21"/>
+                <w:szCs w:val="21"/>
+                <w:lang w:val="en-GB" w:eastAsia="en-GB"/>
+                <w14:ligatures w14:val="none"/>
+              </w:rPr>
+            </w:pPr>
+            <w:r>
+              <w:rPr>
+                <w:rFonts w:ascii="Arial" w:eastAsia="Times New Roman" w:hAnsi="Arial" w:cs="Arial"/>
+                <w:b/>
+                <w:bCs/>
+                <w:kern w:val="0"/>
+                <w:sz w:val="21"/>
+                <w:szCs w:val="21"/>
+                <w:lang w:val="en-GB" w:eastAsia="en-GB"/>
+                <w14:ligatures w14:val="none"/>
+              </w:rPr>
+              <w:t>Asset(s) Affected</w:t>
+            </w:r>
+          </w:p>
+        </w:tc>
+        <w:tc>
+          <w:tcPr>
+            <w:tcW w:w="2126" w:type="dxa"/>
+            <w:hideMark/>
+          </w:tcPr>
+          <w:p>
+            <w:pPr>
+              <w:jc w:val="center"/>
+              <w:rPr>
+                <w:rFonts w:ascii="Arial" w:eastAsia="Times New Roman" w:hAnsi="Arial" w:cs="Arial"/>
+                <w:b/>
+                <w:bCs/>
+                <w:kern w:val="0"/>
+                <w:sz w:val="21"/>
+                <w:szCs w:val="21"/>
+                <w:lang w:val="en-GB" w:eastAsia="en-GB"/>
+                <w14:ligatures w14:val="none"/>
+              </w:rPr>
+            </w:pPr>
+            <w:r>
+              <w:rPr>
+                <w:rFonts w:ascii="Arial" w:eastAsia="Times New Roman" w:hAnsi="Arial" w:cs="Arial"/>
+                <w:b/>
+                <w:bCs/>
+                <w:kern w:val="0"/>
+                <w:sz w:val="21"/>
+                <w:szCs w:val="21"/>
+                <w:lang w:val="en-GB" w:eastAsia="en-GB"/>
+                <w14:ligatures w14:val="none"/>
+              </w:rPr>
+              <w:t>Mitigation</w:t>
+            </w:r>
+          </w:p>
+        </w:tc>
+      </w:tr>
+      <w:tr>
+        <w:tc>
+          <w:tcPr>
+            <w:tcW w:w="912" w:type="dxa"/>
+            <w:hideMark/>
+          </w:tcPr>
+          <w:p>
+            <w:pPr>
+              <w:rPr>
+                <w:rFonts w:ascii="Arial" w:eastAsia="Times New Roman" w:hAnsi="Arial" w:cs="Arial"/>
+                <w:kern w:val="0"/>
+                <w:sz w:val="21"/>
+                <w:szCs w:val="21"/>
+                <w:lang w:val="en-GB" w:eastAsia="en-GB"/>
+                <w14:ligatures w14:val="none"/>
+              </w:rPr>
+            </w:pPr>
+            <w:r>
+              <w:rPr>
+                <w:rFonts w:ascii="Arial" w:eastAsia="Times New Roman" w:hAnsi="Arial" w:cs="Arial"/>
+                <w:b/>
+                <w:bCs/>
+                <w:kern w:val="0"/>
+                <w:sz w:val="21"/>
+                <w:szCs w:val="21"/>
+                <w:lang w:val="en-GB" w:eastAsia="en-GB"/>
+                <w14:ligatures w14:val="none"/>
+              </w:rPr>
+              <w:t>R-01</w:t>
+            </w:r>
+          </w:p>
+        </w:tc>
+        <w:tc>
+          <w:tcPr>
+            <w:tcW w:w="2349" w:type="dxa"/>
+            <w:hideMark/>
+          </w:tcPr>
+          <w:p>
+            <w:pPr>
+              <w:rPr>
+                <w:rFonts w:ascii="Arial" w:eastAsia="Times New Roman" w:hAnsi="Arial" w:cs="Arial"/>
+                <w:kern w:val="0"/>
+                <w:sz w:val="21"/>
+                <w:szCs w:val="21"/>
+                <w:lang w:val="en-GB" w:eastAsia="en-GB"/>
+                <w14:ligatures w14:val="none"/>
+              </w:rPr>
+            </w:pPr>
+            <w:r>
+              <w:rPr>
+                <w:rFonts w:ascii="Arial" w:eastAsia="Times New Roman" w:hAnsi="Arial" w:cs="Arial"/>
+                <w:kern w:val="0"/>
+                <w:sz w:val="21"/>
+                <w:szCs w:val="21"/>
+                <w:lang w:val="en-GB" w:eastAsia="en-GB"/>
+                <w14:ligatures w14:val="none"/>
+              </w:rPr>
+              <w:t>Fake or replayed credential reaches the identity gateway</w:t>
+            </w:r>
+          </w:p>
+        </w:tc>
+        <w:tc>
+          <w:tcPr>
+            <w:tcW w:w="1276" w:type="dxa"/>
+            <w:hideMark/>
+          </w:tcPr>
+          <w:p>
+            <w:pPr>
+              <w:rPr>
+                <w:rFonts w:ascii="Arial" w:eastAsia="Times New Roman" w:hAnsi="Arial" w:cs="Arial"/>
+                <w:kern w:val="0"/>
+                <w:sz w:val="21"/>
+                <w:szCs w:val="21"/>
+                <w:lang w:val="en-GB" w:eastAsia="en-GB"/>
+                <w14:ligatures w14:val="none"/>
+              </w:rPr>
+            </w:pPr>
+            <w:r>
+              <w:rPr>
+                <w:rFonts w:ascii="Arial" w:eastAsia="Times New Roman" w:hAnsi="Arial" w:cs="Arial"/>
+                <w:kern w:val="0"/>
+                <w:sz w:val="21"/>
+                <w:szCs w:val="21"/>
+                <w:lang w:val="en-GB" w:eastAsia="en-GB"/>
+                <w14:ligatures w14:val="none"/>
+              </w:rPr>
+              <w:t>Spoofing</w:t>
+            </w:r>
+          </w:p>
+        </w:tc>
+        <w:tc>
+          <w:tcPr>
+            <w:tcW w:w="1197" w:type="dxa"/>
+            <w:hideMark/>
+          </w:tcPr>
+          <w:p>
+            <w:pPr>
+              <w:rPr>
+                <w:rFonts w:ascii="Arial" w:eastAsia="Times New Roman" w:hAnsi="Arial" w:cs="Arial"/>
+                <w:kern w:val="0"/>
+                <w:sz w:val="21"/>
+                <w:szCs w:val="21"/>
+                <w:lang w:val="en-GB" w:eastAsia="en-GB"/>
+                <w14:ligatures w14:val="none"/>
+              </w:rPr>
+            </w:pPr>
+            <w:r>
+              <w:rPr>
+                <w:rFonts w:ascii="Arial" w:eastAsia="Times New Roman" w:hAnsi="Arial" w:cs="Arial"/>
+                <w:kern w:val="0"/>
+                <w:sz w:val="21"/>
+                <w:szCs w:val="21"/>
+                <w:lang w:val="en-GB" w:eastAsia="en-GB"/>
+                <w14:ligatures w14:val="none"/>
+              </w:rPr>
+              <w:t>B1</w:t>
+            </w:r>
+          </w:p>
+        </w:tc>
+        <w:tc>
+          <w:tcPr>
+            <w:tcW w:w="2347" w:type="dxa"/>
+            <w:hideMark/>
+          </w:tcPr>
+          <w:p>
+            <w:pPr>
+              <w:rPr>
+                <w:rFonts w:ascii="Arial" w:eastAsia="Times New Roman" w:hAnsi="Arial" w:cs="Arial"/>
+                <w:kern w:val="0"/>
+                <w:sz w:val="21"/>
+                <w:szCs w:val="21"/>
+                <w:lang w:val="en-GB" w:eastAsia="en-GB"/>
+                <w14:ligatures w14:val="none"/>
+              </w:rPr>
+            </w:pPr>
+            <w:r>
+              <w:rPr>
+                <w:rFonts w:ascii="Arial" w:eastAsia="Times New Roman" w:hAnsi="Arial" w:cs="Arial"/>
+                <w:kern w:val="0"/>
+                <w:sz w:val="21"/>
+                <w:szCs w:val="21"/>
+                <w:lang w:val="en-GB" w:eastAsia="en-GB"/>
+                <w14:ligatures w14:val="none"/>
+              </w:rPr>
+              <w:t>Credentials &amp; Secrets</w:t>
+            </w:r>
+            <w:r>
+              <w:rPr>
+                <w:rFonts w:ascii="Arial" w:eastAsia="Times New Roman" w:hAnsi="Arial" w:cs="Arial"/>
+                <w:kern w:val="0"/>
+                <w:sz w:val="21"/>
+                <w:szCs w:val="21"/>
+                <w:lang w:val="en-GB" w:eastAsia="en-GB"/>
+                <w14:ligatures w14:val="none"/>
+              </w:rPr>
+              <w:br/>
+              <w:t>(OAuth token)</w:t>
+            </w:r>
+          </w:p>
+        </w:tc>
+        <w:tc>
+          <w:tcPr>
+            <w:tcW w:w="2126" w:type="dxa"/>
+            <w:hideMark/>
+          </w:tcPr>
+          <w:p>
+            <w:pPr>
+              <w:rPr>
+                <w:rFonts w:ascii="Arial" w:eastAsia="Times New Roman" w:hAnsi="Arial" w:cs="Arial"/>
+                <w:kern w:val="0"/>
+                <w:sz w:val="21"/>
+                <w:szCs w:val="21"/>
+                <w:lang w:val="en-GB" w:eastAsia="en-GB"/>
+                <w14:ligatures w14:val="none"/>
+              </w:rPr>
+            </w:pPr>
+            <w:r>
+              <w:rPr>
+                <w:rFonts w:ascii="Arial" w:eastAsia="Times New Roman" w:hAnsi="Arial" w:cs="Arial"/>
+                <w:kern w:val="0"/>
+                <w:sz w:val="21"/>
+                <w:szCs w:val="21"/>
+                <w:lang w:val="en-GB" w:eastAsia="en-GB"/>
+                <w14:ligatures w14:val="none"/>
+              </w:rPr>
+              <w:t>SMART on FHIR + OAuth 2.0; short-lived tokens</w:t>
+            </w:r>
+          </w:p>
+        </w:tc>
+      </w:tr>
+      <w:tr>
+        <w:tc>
+          <w:tcPr>
+            <w:tcW w:w="912" w:type="dxa"/>
+            <w:hideMark/>
+          </w:tcPr>
+          <w:p>
+            <w:pPr>
+              <w:rPr>
+                <w:rFonts w:ascii="Arial" w:eastAsia="Times New Roman" w:hAnsi="Arial" w:cs="Arial"/>
+                <w:kern w:val="0"/>
+                <w:sz w:val="21"/>
+                <w:szCs w:val="21"/>
+                <w:lang w:val="en-GB" w:eastAsia="en-GB"/>
+                <w14:ligatures w14:val="none"/>
+              </w:rPr>
+            </w:pPr>
+            <w:r>
+              <w:rPr>
+                <w:rFonts w:ascii="Arial" w:eastAsia="Times New Roman" w:hAnsi="Arial" w:cs="Arial"/>
+                <w:b/>
+                <w:bCs/>
+                <w:kern w:val="0"/>
+                <w:sz w:val="21"/>
+                <w:szCs w:val="21"/>
+                <w:lang w:val="en-GB" w:eastAsia="en-GB"/>
+                <w14:ligatures w14:val="none"/>
+              </w:rPr>
+              <w:t>R-02</w:t>
+            </w:r>
+          </w:p>
+        </w:tc>
+        <w:tc>
+          <w:tcPr>
+            <w:tcW w:w="2349" w:type="dxa"/>
+            <w:hideMark/>
+          </w:tcPr>
+          <w:p>
+            <w:pPr>
+              <w:rPr>
+                <w:rFonts w:ascii="Arial" w:eastAsia="Times New Roman" w:hAnsi="Arial" w:cs="Arial"/>
+                <w:kern w:val="0"/>
+                <w:sz w:val="21"/>
+                <w:szCs w:val="21"/>
+                <w:lang w:val="en-GB" w:eastAsia="en-GB"/>
+                <w14:ligatures w14:val="none"/>
+              </w:rPr>
+            </w:pPr>
+            <w:r>
+              <w:rPr>
+                <w:rFonts w:ascii="Arial" w:eastAsia="Times New Roman" w:hAnsi="Arial" w:cs="Arial"/>
+                <w:kern w:val="0"/>
+                <w:sz w:val="21"/>
+                <w:szCs w:val="21"/>
+                <w:lang w:val="en-GB" w:eastAsia="en-GB"/>
+                <w14:ligatures w14:val="none"/>
+              </w:rPr>
+              <w:t>Tester's sandbox token reused to perform clinician-only actions</w:t>
+            </w:r>
+          </w:p>
+        </w:tc>
+        <w:tc>
+          <w:tcPr>
+            <w:tcW w:w="1276" w:type="dxa"/>
+            <w:hideMark/>
+          </w:tcPr>
+          <w:p>
+            <w:pPr>
+              <w:rPr>
+                <w:rFonts w:ascii="Arial" w:eastAsia="Times New Roman" w:hAnsi="Arial" w:cs="Arial"/>
+                <w:kern w:val="0"/>
+                <w:sz w:val="21"/>
+                <w:szCs w:val="21"/>
+                <w:lang w:val="en-GB" w:eastAsia="en-GB"/>
+                <w14:ligatures w14:val="none"/>
+              </w:rPr>
+            </w:pPr>
+            <w:r>
+              <w:rPr>
+                <w:rFonts w:ascii="Arial" w:eastAsia="Times New Roman" w:hAnsi="Arial" w:cs="Arial"/>
+                <w:kern w:val="0"/>
+                <w:sz w:val="21"/>
+                <w:szCs w:val="21"/>
+                <w:lang w:val="en-GB" w:eastAsia="en-GB"/>
+                <w14:ligatures w14:val="none"/>
+              </w:rPr>
+              <w:t>Elevation of Privilege</w:t>
+            </w:r>
+          </w:p>
+        </w:tc>
+        <w:tc>
+          <w:tcPr>
+            <w:tcW w:w="1197" w:type="dxa"/>
+            <w:hideMark/>
+          </w:tcPr>
+          <w:p>
+            <w:pPr>
+              <w:rPr>
+                <w:rFonts w:ascii="Arial" w:eastAsia="Times New Roman" w:hAnsi="Arial" w:cs="Arial"/>
+                <w:kern w:val="0"/>
+                <w:sz w:val="21"/>
+                <w:szCs w:val="21"/>
+                <w:lang w:val="en-GB" w:eastAsia="en-GB"/>
+                <w14:ligatures w14:val="none"/>
+              </w:rPr>
+            </w:pPr>
+            <w:r>
+              <w:rPr>
+                <w:rFonts w:ascii="Arial" w:eastAsia="Times New Roman" w:hAnsi="Arial" w:cs="Arial"/>
+                <w:kern w:val="0"/>
+                <w:sz w:val="21"/>
+                <w:szCs w:val="21"/>
+                <w:lang w:val="en-GB" w:eastAsia="en-GB"/>
+                <w14:ligatures w14:val="none"/>
+              </w:rPr>
+              <w:t>B1</w:t>
+            </w:r>
+          </w:p>
+        </w:tc>
+        <w:tc>
+          <w:tcPr>
+            <w:tcW w:w="2347" w:type="dxa"/>
+            <w:hideMark/>
+          </w:tcPr>
+          <w:p>
+            <w:pPr>
+              <w:rPr>
+                <w:rFonts w:ascii="Arial" w:eastAsia="Times New Roman" w:hAnsi="Arial" w:cs="Arial"/>
+                <w:kern w:val="0"/>
+                <w:sz w:val="21"/>
+                <w:szCs w:val="21"/>
+                <w:lang w:val="en-GB" w:eastAsia="en-GB"/>
+                <w14:ligatures w14:val="none"/>
+              </w:rPr>
+            </w:pPr>
+            <w:r>
+              <w:rPr>
+                <w:rFonts w:ascii="Arial" w:eastAsia="Times New Roman" w:hAnsi="Arial" w:cs="Arial"/>
+                <w:kern w:val="0"/>
+                <w:sz w:val="21"/>
+                <w:szCs w:val="21"/>
+                <w:lang w:val="en-GB" w:eastAsia="en-GB"/>
+                <w14:ligatures w14:val="none"/>
+              </w:rPr>
+              <w:t>Credentials &amp; Secrets</w:t>
+            </w:r>
+            <w:r>
+              <w:rPr>
+                <w:rFonts w:ascii="Arial" w:eastAsia="Times New Roman" w:hAnsi="Arial" w:cs="Arial"/>
+                <w:kern w:val="0"/>
+                <w:sz w:val="21"/>
+                <w:szCs w:val="21"/>
+                <w:lang w:val="en-GB" w:eastAsia="en-GB"/>
+                <w14:ligatures w14:val="none"/>
+              </w:rPr>
+              <w:br/>
+              <w:t>(sandbox client secret)</w:t>
+            </w:r>
+          </w:p>
+        </w:tc>
+        <w:tc>
+          <w:tcPr>
+            <w:tcW w:w="2126" w:type="dxa"/>
+            <w:hideMark/>
+          </w:tcPr>
+          <w:p>
+            <w:pPr>
+              <w:rPr>
+                <w:rFonts w:ascii="Arial" w:eastAsia="Times New Roman" w:hAnsi="Arial" w:cs="Arial"/>
+                <w:kern w:val="0"/>
+                <w:sz w:val="21"/>
+                <w:szCs w:val="21"/>
+                <w:lang w:val="en-GB" w:eastAsia="en-GB"/>
+                <w14:ligatures w14:val="none"/>
+              </w:rPr>
+            </w:pPr>
+            <w:r>
+              <w:rPr>
+                <w:rFonts w:ascii="Arial" w:eastAsia="Times New Roman" w:hAnsi="Arial" w:cs="Arial"/>
+                <w:kern w:val="0"/>
+                <w:sz w:val="21"/>
+                <w:szCs w:val="21"/>
+                <w:lang w:val="en-GB" w:eastAsia="en-GB"/>
+                <w14:ligatures w14:val="none"/>
+              </w:rPr>
+              <w:t>Role-based access control; tenant isolation</w:t>
+            </w:r>
+          </w:p>
+        </w:tc>
+      </w:tr>
+      <w:tr>
+        <w:tc>
+          <w:tcPr>
+            <w:tcW w:w="912" w:type="dxa"/>
+            <w:hideMark/>
+          </w:tcPr>
+          <w:p>
+            <w:pPr>
+              <w:rPr>
+                <w:rFonts w:ascii="Arial" w:eastAsia="Times New Roman" w:hAnsi="Arial" w:cs="Arial"/>
+                <w:kern w:val="0"/>
+                <w:sz w:val="21"/>
+                <w:szCs w:val="21"/>
+                <w:lang w:val="en-GB" w:eastAsia="en-GB"/>
+                <w14:ligatures w14:val="none"/>
+              </w:rPr>
+            </w:pPr>
+            <w:r>
+              <w:rPr>
+                <w:rFonts w:ascii="Arial" w:eastAsia="Times New Roman" w:hAnsi="Arial" w:cs="Arial"/>
+                <w:b/>
+                <w:bCs/>
+                <w:kern w:val="0"/>
+                <w:sz w:val="21"/>
+                <w:szCs w:val="21"/>
+                <w:lang w:val="en-GB" w:eastAsia="en-GB"/>
+                <w14:ligatures w14:val="none"/>
+              </w:rPr>
+              <w:t>R-03</w:t>
+            </w:r>
+          </w:p>
+        </w:tc>
+        <w:tc>
+          <w:tcPr>
+            <w:tcW w:w="2349" w:type="dxa"/>
+            <w:hideMark/>
+          </w:tcPr>
+          <w:p>
+            <w:pPr>
+              <w:rPr>
+                <w:rFonts w:ascii="Arial" w:eastAsia="Times New Roman" w:hAnsi="Arial" w:cs="Arial"/>
+                <w:kern w:val="0"/>
+                <w:sz w:val="21"/>
+                <w:szCs w:val="21"/>
+                <w:lang w:val="en-GB" w:eastAsia="en-GB"/>
+                <w14:ligatures w14:val="none"/>
+              </w:rPr>
+            </w:pPr>
+            <w:r>
+              <w:rPr>
+                <w:rFonts w:ascii="Arial" w:eastAsia="Times New Roman" w:hAnsi="Arial" w:cs="Arial"/>
+                <w:kern w:val="0"/>
+                <w:sz w:val="21"/>
+                <w:szCs w:val="21"/>
+                <w:lang w:val="en-GB" w:eastAsia="en-GB"/>
+                <w14:ligatures w14:val="none"/>
+              </w:rPr>
+              <w:t>Untrusted or drifted scenario/mapping configuration passed downstream</w:t>
+            </w:r>
+          </w:p>
+        </w:tc>
+        <w:tc>
+          <w:tcPr>
+            <w:tcW w:w="1276" w:type="dxa"/>
+            <w:hideMark/>
+          </w:tcPr>
+          <w:p>
+            <w:pPr>
+              <w:rPr>
+                <w:rFonts w:ascii="Arial" w:eastAsia="Times New Roman" w:hAnsi="Arial" w:cs="Arial"/>
+                <w:kern w:val="0"/>
+                <w:sz w:val="21"/>
+                <w:szCs w:val="21"/>
+                <w:lang w:val="en-GB" w:eastAsia="en-GB"/>
+                <w14:ligatures w14:val="none"/>
+              </w:rPr>
+            </w:pPr>
+            <w:r>
+              <w:rPr>
+                <w:rFonts w:ascii="Arial" w:eastAsia="Times New Roman" w:hAnsi="Arial" w:cs="Arial"/>
+                <w:kern w:val="0"/>
+                <w:sz w:val="21"/>
+                <w:szCs w:val="21"/>
+                <w:lang w:val="en-GB" w:eastAsia="en-GB"/>
+                <w14:ligatures w14:val="none"/>
+              </w:rPr>
+              <w:t>Tampering</w:t>
+            </w:r>
+          </w:p>
+        </w:tc>
+        <w:tc>
+          <w:tcPr>
+            <w:tcW w:w="1197" w:type="dxa"/>
+            <w:hideMark/>
+          </w:tcPr>
+          <w:p>
+            <w:pPr>
+              <w:rPr>
+                <w:rFonts w:ascii="Arial" w:eastAsia="Times New Roman" w:hAnsi="Arial" w:cs="Arial"/>
+                <w:kern w:val="0"/>
+                <w:sz w:val="21"/>
+                <w:szCs w:val="21"/>
+                <w:lang w:val="en-GB" w:eastAsia="en-GB"/>
+                <w14:ligatures w14:val="none"/>
+              </w:rPr>
+            </w:pPr>
+            <w:r>
+              <w:rPr>
+                <w:rFonts w:ascii="Arial" w:eastAsia="Times New Roman" w:hAnsi="Arial" w:cs="Arial"/>
+                <w:kern w:val="0"/>
+                <w:sz w:val="21"/>
+                <w:szCs w:val="21"/>
+                <w:lang w:val="en-GB" w:eastAsia="en-GB"/>
+                <w14:ligatures w14:val="none"/>
+              </w:rPr>
+              <w:t>B2</w:t>
+            </w:r>
+          </w:p>
+        </w:tc>
+        <w:tc>
+          <w:tcPr>
+            <w:tcW w:w="2347" w:type="dxa"/>
+            <w:hideMark/>
+          </w:tcPr>
+          <w:p>
+            <w:pPr>
+              <w:rPr>
+                <w:rFonts w:ascii="Arial" w:eastAsia="Times New Roman" w:hAnsi="Arial" w:cs="Arial"/>
+                <w:kern w:val="0"/>
+                <w:sz w:val="21"/>
+                <w:szCs w:val="21"/>
+                <w:lang w:val="en-GB" w:eastAsia="en-GB"/>
+                <w14:ligatures w14:val="none"/>
+              </w:rPr>
+            </w:pPr>
+            <w:r>
+              <w:rPr>
+                <w:rFonts w:ascii="Arial" w:eastAsia="Times New Roman" w:hAnsi="Arial" w:cs="Arial"/>
+                <w:kern w:val="0"/>
+                <w:sz w:val="21"/>
+                <w:szCs w:val="21"/>
+                <w:lang w:val="en-GB" w:eastAsia="en-GB"/>
+                <w14:ligatures w14:val="none"/>
+              </w:rPr>
+              <w:t>Data in Motion</w:t>
+            </w:r>
+            <w:r>
+              <w:rPr>
+                <w:rFonts w:ascii="Arial" w:eastAsia="Times New Roman" w:hAnsi="Arial" w:cs="Arial"/>
+                <w:kern w:val="0"/>
+                <w:sz w:val="21"/>
+                <w:szCs w:val="21"/>
+                <w:lang w:val="en-GB" w:eastAsia="en-GB"/>
+                <w14:ligatures w14:val="none"/>
+              </w:rPr>
+              <w:br/>
+              <w:t>(FHIR scenario payload)</w:t>
+            </w:r>
+          </w:p>
+        </w:tc>
+        <w:tc>
+          <w:tcPr>
+            <w:tcW w:w="2126" w:type="dxa"/>
+            <w:hideMark/>
+          </w:tcPr>
+          <w:p>
+            <w:pPr>
+              <w:rPr>
+                <w:rFonts w:ascii="Arial" w:eastAsia="Times New Roman" w:hAnsi="Arial" w:cs="Arial"/>
+                <w:kern w:val="0"/>
+                <w:sz w:val="21"/>
+                <w:szCs w:val="21"/>
+                <w:lang w:val="en-GB" w:eastAsia="en-GB"/>
+                <w14:ligatures w14:val="none"/>
+              </w:rPr>
+            </w:pPr>
+            <w:r>
+              <w:rPr>
+                <w:rFonts w:ascii="Arial" w:eastAsia="Times New Roman" w:hAnsi="Arial" w:cs="Arial"/>
+                <w:kern w:val="0"/>
+                <w:sz w:val="21"/>
+                <w:szCs w:val="21"/>
+                <w:lang w:val="en-GB" w:eastAsia="en-GB"/>
+                <w14:ligatures w14:val="none"/>
+              </w:rPr>
+              <w:t>Input validation on FHIR resources before execution</w:t>
+            </w:r>
+          </w:p>
+        </w:tc>
+      </w:tr>
+      <w:tr>
+        <w:tc>
+          <w:tcPr>
+            <w:tcW w:w="912" w:type="dxa"/>
+            <w:hideMark/>
+          </w:tcPr>
+          <w:p>
+            <w:pPr>
+              <w:rPr>
+                <w:rFonts w:ascii="Arial" w:eastAsia="Times New Roman" w:hAnsi="Arial" w:cs="Arial"/>
+                <w:kern w:val="0"/>
+                <w:sz w:val="21"/>
+                <w:szCs w:val="21"/>
+                <w:lang w:val="en-GB" w:eastAsia="en-GB"/>
+                <w14:ligatures w14:val="none"/>
+              </w:rPr>
+            </w:pPr>
+            <w:r>
+              <w:rPr>
+                <w:rFonts w:ascii="Arial" w:eastAsia="Times New Roman" w:hAnsi="Arial" w:cs="Arial"/>
+                <w:b/>
+                <w:bCs/>
+                <w:kern w:val="0"/>
+                <w:sz w:val="21"/>
+                <w:szCs w:val="21"/>
+                <w:lang w:val="en-GB" w:eastAsia="en-GB"/>
+                <w14:ligatures w14:val="none"/>
+              </w:rPr>
+              <w:t>R-04</w:t>
+            </w:r>
+          </w:p>
+        </w:tc>
+        <w:tc>
+          <w:tcPr>
+            <w:tcW w:w="2349" w:type="dxa"/>
+            <w:hideMark/>
+          </w:tcPr>
+          <w:p>
+            <w:pPr>
+              <w:rPr>
+                <w:rFonts w:ascii="Arial" w:eastAsia="Times New Roman" w:hAnsi="Arial" w:cs="Arial"/>
+                <w:kern w:val="0"/>
+                <w:sz w:val="21"/>
+                <w:szCs w:val="21"/>
+                <w:lang w:val="en-GB" w:eastAsia="en-GB"/>
+                <w14:ligatures w14:val="none"/>
+              </w:rPr>
+            </w:pPr>
+            <w:r>
+              <w:rPr>
+                <w:rFonts w:ascii="Arial" w:eastAsia="Times New Roman" w:hAnsi="Arial" w:cs="Arial"/>
+                <w:kern w:val="0"/>
+                <w:sz w:val="21"/>
+                <w:szCs w:val="21"/>
+                <w:lang w:val="en-GB" w:eastAsia="en-GB"/>
+                <w14:ligatures w14:val="none"/>
+              </w:rPr>
+              <w:t>Real-world identifier pattern slips into the synthetic data set</w:t>
+            </w:r>
+          </w:p>
+        </w:tc>
+        <w:tc>
+          <w:tcPr>
+            <w:tcW w:w="1276" w:type="dxa"/>
+            <w:hideMark/>
+          </w:tcPr>
+          <w:p>
+            <w:pPr>
+              <w:rPr>
+                <w:rFonts w:ascii="Arial" w:eastAsia="Times New Roman" w:hAnsi="Arial" w:cs="Arial"/>
+                <w:kern w:val="0"/>
+                <w:sz w:val="21"/>
+                <w:szCs w:val="21"/>
+                <w:lang w:val="en-GB" w:eastAsia="en-GB"/>
+                <w14:ligatures w14:val="none"/>
+              </w:rPr>
+            </w:pPr>
+            <w:r>
+              <w:rPr>
+                <w:rFonts w:ascii="Arial" w:eastAsia="Times New Roman" w:hAnsi="Arial" w:cs="Arial"/>
+                <w:kern w:val="0"/>
+                <w:sz w:val="21"/>
+                <w:szCs w:val="21"/>
+                <w:lang w:val="en-GB" w:eastAsia="en-GB"/>
+                <w14:ligatures w14:val="none"/>
+              </w:rPr>
+              <w:t>Information Disclosure</w:t>
+            </w:r>
+          </w:p>
+        </w:tc>
+        <w:tc>
+          <w:tcPr>
+            <w:tcW w:w="1197" w:type="dxa"/>
+            <w:hideMark/>
+          </w:tcPr>
+          <w:p>
+            <w:pPr>
+              <w:rPr>
+                <w:rFonts w:ascii="Arial" w:eastAsia="Times New Roman" w:hAnsi="Arial" w:cs="Arial"/>
+                <w:kern w:val="0"/>
+                <w:sz w:val="21"/>
+                <w:szCs w:val="21"/>
+                <w:lang w:val="en-GB" w:eastAsia="en-GB"/>
+                <w14:ligatures w14:val="none"/>
+              </w:rPr>
+            </w:pPr>
+            <w:r>
+              <w:rPr>
+                <w:rFonts w:ascii="Arial" w:eastAsia="Times New Roman" w:hAnsi="Arial" w:cs="Arial"/>
+                <w:kern w:val="0"/>
+                <w:sz w:val="21"/>
+                <w:szCs w:val="21"/>
+                <w:lang w:val="en-GB" w:eastAsia="en-GB"/>
+                <w14:ligatures w14:val="none"/>
+              </w:rPr>
+              <w:t>B2</w:t>
+            </w:r>
+          </w:p>
+        </w:tc>
+        <w:tc>
+          <w:tcPr>
+            <w:tcW w:w="2347" w:type="dxa"/>
+            <w:hideMark/>
+          </w:tcPr>
+          <w:p>
+            <w:pPr>
+              <w:rPr>
+                <w:rFonts w:ascii="Arial" w:eastAsia="Times New Roman" w:hAnsi="Arial" w:cs="Arial"/>
+                <w:kern w:val="0"/>
+                <w:sz w:val="21"/>
+                <w:szCs w:val="21"/>
+                <w:lang w:val="en-GB" w:eastAsia="en-GB"/>
+                <w14:ligatures w14:val="none"/>
+              </w:rPr>
+            </w:pPr>
+            <w:r>
+              <w:rPr>
+                <w:rFonts w:ascii="Arial" w:eastAsia="Times New Roman" w:hAnsi="Arial" w:cs="Arial"/>
+                <w:kern w:val="0"/>
+                <w:sz w:val="21"/>
+                <w:szCs w:val="21"/>
+                <w:lang w:val="en-GB" w:eastAsia="en-GB"/>
+                <w14:ligatures w14:val="none"/>
+              </w:rPr>
+              <w:t>Data at Rest</w:t>
+            </w:r>
+            <w:r>
+              <w:rPr>
+                <w:rFonts w:ascii="Arial" w:eastAsia="Times New Roman" w:hAnsi="Arial" w:cs="Arial"/>
+                <w:kern w:val="0"/>
+                <w:sz w:val="21"/>
+                <w:szCs w:val="21"/>
+                <w:lang w:val="en-GB" w:eastAsia="en-GB"/>
+                <w14:ligatures w14:val="none"/>
+              </w:rPr>
+              <w:br/>
+              <w:t>(synthetic patient records)</w:t>
+            </w:r>
+          </w:p>
+        </w:tc>
+        <w:tc>
+          <w:tcPr>
+            <w:tcW w:w="2126" w:type="dxa"/>
+            <w:hideMark/>
+          </w:tcPr>
+          <w:p>
+            <w:pPr>
+              <w:rPr>
+                <w:rFonts w:ascii="Arial" w:eastAsia="Times New Roman" w:hAnsi="Arial" w:cs="Arial"/>
+                <w:kern w:val="0"/>
+                <w:sz w:val="21"/>
+                <w:szCs w:val="21"/>
+                <w:lang w:val="en-GB" w:eastAsia="en-GB"/>
+                <w14:ligatures w14:val="none"/>
+              </w:rPr>
+            </w:pPr>
+            <w:r>
+              <w:rPr>
+                <w:rFonts w:ascii="Arial" w:eastAsia="Times New Roman" w:hAnsi="Arial" w:cs="Arial"/>
+                <w:kern w:val="0"/>
+                <w:sz w:val="21"/>
+                <w:szCs w:val="21"/>
+                <w:lang w:val="en-GB" w:eastAsia="en-GB"/>
+                <w14:ligatures w14:val="none"/>
+              </w:rPr>
+              <w:t>Luhn-check rejection of real AU IHI ranges (e.g. 800360 prefix)</w:t>
+            </w:r>
+          </w:p>
+        </w:tc>
+      </w:tr>
+      <w:tr>
+        <w:tc>
+          <w:tcPr>
+            <w:tcW w:w="912" w:type="dxa"/>
+            <w:hideMark/>
+          </w:tcPr>
+          <w:p>
+            <w:pPr>
+              <w:rPr>
+                <w:rFonts w:ascii="Arial" w:eastAsia="Times New Roman" w:hAnsi="Arial" w:cs="Arial"/>
+                <w:kern w:val="0"/>
+                <w:sz w:val="21"/>
+                <w:szCs w:val="21"/>
+                <w:lang w:val="en-GB" w:eastAsia="en-GB"/>
+                <w14:ligatures w14:val="none"/>
+              </w:rPr>
+            </w:pPr>
+            <w:r>
+              <w:rPr>
+                <w:rFonts w:ascii="Arial" w:eastAsia="Times New Roman" w:hAnsi="Arial" w:cs="Arial"/>
+                <w:b/>
+                <w:bCs/>
+                <w:kern w:val="0"/>
+                <w:sz w:val="21"/>
+                <w:szCs w:val="21"/>
+                <w:lang w:val="en-GB" w:eastAsia="en-GB"/>
+                <w14:ligatures w14:val="none"/>
+              </w:rPr>
+              <w:t>R-05</w:t>
+            </w:r>
+          </w:p>
+        </w:tc>
+        <w:tc>
+          <w:tcPr>
+            <w:tcW w:w="2349" w:type="dxa"/>
+            <w:hideMark/>
+          </w:tcPr>
+          <w:p>
+            <w:pPr>
+              <w:rPr>
+                <w:rFonts w:ascii="Arial" w:eastAsia="Times New Roman" w:hAnsi="Arial" w:cs="Arial"/>
+                <w:kern w:val="0"/>
+                <w:sz w:val="21"/>
+                <w:szCs w:val="21"/>
+                <w:lang w:val="en-GB" w:eastAsia="en-GB"/>
+                <w14:ligatures w14:val="none"/>
+              </w:rPr>
+            </w:pPr>
+            <w:r>
+              <w:rPr>
+                <w:rFonts w:ascii="Arial" w:eastAsia="Times New Roman" w:hAnsi="Arial" w:cs="Arial"/>
+                <w:kern w:val="0"/>
+                <w:sz w:val="21"/>
+                <w:szCs w:val="21"/>
+                <w:lang w:val="en-GB" w:eastAsia="en-GB"/>
+                <w14:ligatures w14:val="none"/>
+              </w:rPr>
+              <w:t>Malformed or flooded response from a simulated connector</w:t>
+            </w:r>
+          </w:p>
+        </w:tc>
+        <w:tc>
+          <w:tcPr>
+            <w:tcW w:w="1276" w:type="dxa"/>
+            <w:hideMark/>
+          </w:tcPr>
+          <w:p>
+            <w:pPr>
+              <w:rPr>
+                <w:rFonts w:ascii="Arial" w:eastAsia="Times New Roman" w:hAnsi="Arial" w:cs="Arial"/>
+                <w:kern w:val="0"/>
+                <w:sz w:val="21"/>
+                <w:szCs w:val="21"/>
+                <w:lang w:val="en-GB" w:eastAsia="en-GB"/>
+                <w14:ligatures w14:val="none"/>
+              </w:rPr>
+            </w:pPr>
+            <w:r>
+              <w:rPr>
+                <w:rFonts w:ascii="Arial" w:eastAsia="Times New Roman" w:hAnsi="Arial" w:cs="Arial"/>
+                <w:kern w:val="0"/>
+                <w:sz w:val="21"/>
+                <w:szCs w:val="21"/>
+                <w:lang w:val="en-GB" w:eastAsia="en-GB"/>
+                <w14:ligatures w14:val="none"/>
+              </w:rPr>
+              <w:t>Denial of Service</w:t>
+            </w:r>
+          </w:p>
+        </w:tc>
+        <w:tc>
+          <w:tcPr>
+            <w:tcW w:w="1197" w:type="dxa"/>
+            <w:hideMark/>
+          </w:tcPr>
+          <w:p>
+            <w:pPr>
+              <w:rPr>
+                <w:rFonts w:ascii="Arial" w:eastAsia="Times New Roman" w:hAnsi="Arial" w:cs="Arial"/>
+                <w:kern w:val="0"/>
+                <w:sz w:val="21"/>
+                <w:szCs w:val="21"/>
+                <w:lang w:val="en-GB" w:eastAsia="en-GB"/>
+                <w14:ligatures w14:val="none"/>
+              </w:rPr>
+            </w:pPr>
+            <w:r>
+              <w:rPr>
+                <w:rFonts w:ascii="Arial" w:eastAsia="Times New Roman" w:hAnsi="Arial" w:cs="Arial"/>
+                <w:kern w:val="0"/>
+                <w:sz w:val="21"/>
+                <w:szCs w:val="21"/>
+                <w:lang w:val="en-GB" w:eastAsia="en-GB"/>
+                <w14:ligatures w14:val="none"/>
+              </w:rPr>
+              <w:t>B3</w:t>
+            </w:r>
+          </w:p>
+        </w:tc>
+        <w:tc>
+          <w:tcPr>
+            <w:tcW w:w="2347" w:type="dxa"/>
+            <w:hideMark/>
+          </w:tcPr>
+          <w:p>
+            <w:pPr>
+              <w:rPr>
+                <w:rFonts w:ascii="Arial" w:eastAsia="Times New Roman" w:hAnsi="Arial" w:cs="Arial"/>
+                <w:kern w:val="0"/>
+                <w:sz w:val="21"/>
+                <w:szCs w:val="21"/>
+                <w:lang w:val="en-GB" w:eastAsia="en-GB"/>
+                <w14:ligatures w14:val="none"/>
+              </w:rPr>
+            </w:pPr>
+            <w:r>
+              <w:rPr>
+                <w:rFonts w:ascii="Arial" w:eastAsia="Times New Roman" w:hAnsi="Arial" w:cs="Arial"/>
+                <w:kern w:val="0"/>
+                <w:sz w:val="21"/>
+                <w:szCs w:val="21"/>
+                <w:lang w:val="en-GB" w:eastAsia="en-GB"/>
+                <w14:ligatures w14:val="none"/>
+              </w:rPr>
+              <w:t>Data in Motion</w:t>
+            </w:r>
+            <w:r>
+              <w:rPr>
+                <w:rFonts w:ascii="Arial" w:eastAsia="Times New Roman" w:hAnsi="Arial" w:cs="Arial"/>
+                <w:kern w:val="0"/>
+                <w:sz w:val="21"/>
+                <w:szCs w:val="21"/>
+                <w:lang w:val="en-GB" w:eastAsia="en-GB"/>
+                <w14:ligatures w14:val="none"/>
+              </w:rPr>
+              <w:br/>
+              <w:t>(FHIR / HL7v2 messages)</w:t>
+            </w:r>
+          </w:p>
+        </w:tc>
+        <w:tc>
+          <w:tcPr>
+            <w:tcW w:w="2126" w:type="dxa"/>
+            <w:hideMark/>
+          </w:tcPr>
+          <w:p>
+            <w:pPr>
+              <w:rPr>
+                <w:rFonts w:ascii="Arial" w:eastAsia="Times New Roman" w:hAnsi="Arial" w:cs="Arial"/>
+                <w:kern w:val="0"/>
+                <w:sz w:val="21"/>
+                <w:szCs w:val="21"/>
+                <w:lang w:val="en-GB" w:eastAsia="en-GB"/>
+                <w14:ligatures w14:val="none"/>
+              </w:rPr>
+            </w:pPr>
+            <w:r>
+              <w:rPr>
+                <w:rFonts w:ascii="Arial" w:eastAsia="Times New Roman" w:hAnsi="Arial" w:cs="Arial"/>
+                <w:kern w:val="0"/>
+                <w:sz w:val="21"/>
+                <w:szCs w:val="21"/>
+                <w:lang w:val="en-GB" w:eastAsia="en-GB"/>
+                <w14:ligatures w14:val="none"/>
+              </w:rPr>
+              <w:t>Structured error handling; rate limiting; connector isolation</w:t>
+            </w:r>
+          </w:p>
+        </w:tc>
+      </w:tr>
+    </w:tbl>
+    <w:p/>
+    <w:p>
+      <w:pPr>
         <w:pStyle w:val="Heading2"/>
       </w:pPr>
       <w:r>
-        <w:lastRenderedPageBreak/>
         <w:t>4.4 Capital and Non-Capital Cost Estimation</w:t>
       </w:r>
     </w:p>
@@ -10794,13 +11967,13 @@
       <w:pPr>
         <w:jc w:val="both"/>
         <w:rPr>
-          <w:rFonts w:ascii="Times New Roman" w:eastAsia="Times New Roman" w:hAnsi="Times New Roman" w:cs="Times New Roman"/>
+          <w:rFonts w:eastAsia="Times New Roman" w:cs="Times New Roman"/>
           <w:lang w:val="en-GB" w:eastAsia="en-GB"/>
         </w:rPr>
       </w:pPr>
       <w:r>
         <w:rPr>
-          <w:rFonts w:ascii="Times New Roman" w:eastAsia="Times New Roman" w:hAnsi="Times New Roman" w:cs="Times New Roman"/>
+          <w:rFonts w:eastAsia="Times New Roman" w:cs="Times New Roman"/>
           <w:lang w:val="en-GB" w:eastAsia="en-GB"/>
         </w:rPr>
         <w:t>The solution suggested has an indirect financial impact as stage 1 is related to design, and it can be implemented using only free-tier and open-source tools, according to the report. As stated in the report, there is no budget allocated for any client or College, and there is also no allocation of cloud services, so students must use free-tier and open-source software.</w:t>
@@ -10810,7 +11983,7 @@
       <w:pPr>
         <w:jc w:val="both"/>
         <w:rPr>
-          <w:rFonts w:ascii="Times New Roman" w:eastAsia="Times New Roman" w:hAnsi="Times New Roman" w:cs="Times New Roman"/>
+          <w:rFonts w:eastAsia="Times New Roman" w:cs="Times New Roman"/>
           <w:b/>
           <w:bCs/>
           <w:lang w:val="en-GB" w:eastAsia="en-GB"/>
@@ -10818,7 +11991,7 @@
       </w:pPr>
       <w:r>
         <w:rPr>
-          <w:rFonts w:ascii="Times New Roman" w:eastAsia="Times New Roman" w:hAnsi="Times New Roman" w:cs="Times New Roman"/>
+          <w:rFonts w:eastAsia="Times New Roman" w:cs="Times New Roman"/>
           <w:b/>
           <w:bCs/>
           <w:lang w:val="en-GB" w:eastAsia="en-GB"/>
@@ -10829,14 +12002,14 @@
     <w:tbl>
       <w:tblPr>
         <w:tblStyle w:val="PlainTable1"/>
-        <w:tblW w:w="0" w:type="auto"/>
+        <w:tblW w:w="9776" w:type="dxa"/>
         <w:tblLook w:val="04A0" w:firstRow="1" w:lastRow="0" w:firstColumn="1" w:lastColumn="0" w:noHBand="0" w:noVBand="1"/>
       </w:tblPr>
       <w:tblGrid>
-        <w:gridCol w:w="2890"/>
-        <w:gridCol w:w="1348"/>
-        <w:gridCol w:w="2251"/>
-        <w:gridCol w:w="2527"/>
+        <w:gridCol w:w="2877"/>
+        <w:gridCol w:w="1375"/>
+        <w:gridCol w:w="2831"/>
+        <w:gridCol w:w="2693"/>
       </w:tblGrid>
       <w:tr>
         <w:trPr>
@@ -10886,7 +12059,7 @@
         </w:tc>
         <w:tc>
           <w:tcPr>
-            <w:tcW w:w="0" w:type="auto"/>
+            <w:tcW w:w="2831" w:type="dxa"/>
             <w:hideMark/>
           </w:tcPr>
           <w:p>
@@ -10909,7 +12082,7 @@
         </w:tc>
         <w:tc>
           <w:tcPr>
-            <w:tcW w:w="0" w:type="auto"/>
+            <w:tcW w:w="2693" w:type="dxa"/>
             <w:hideMark/>
           </w:tcPr>
           <w:p>
@@ -10969,7 +12142,7 @@
         </w:tc>
         <w:tc>
           <w:tcPr>
-            <w:tcW w:w="0" w:type="auto"/>
+            <w:tcW w:w="2831" w:type="dxa"/>
             <w:hideMark/>
           </w:tcPr>
           <w:p>
@@ -10983,7 +12156,7 @@
         </w:tc>
         <w:tc>
           <w:tcPr>
-            <w:tcW w:w="0" w:type="auto"/>
+            <w:tcW w:w="2693" w:type="dxa"/>
             <w:hideMark/>
           </w:tcPr>
           <w:p>
@@ -11025,7 +12198,7 @@
         </w:tc>
         <w:tc>
           <w:tcPr>
-            <w:tcW w:w="0" w:type="auto"/>
+            <w:tcW w:w="2831" w:type="dxa"/>
             <w:hideMark/>
           </w:tcPr>
           <w:p>
@@ -11039,7 +12212,7 @@
         </w:tc>
         <w:tc>
           <w:tcPr>
-            <w:tcW w:w="0" w:type="auto"/>
+            <w:tcW w:w="2693" w:type="dxa"/>
             <w:hideMark/>
           </w:tcPr>
           <w:p>
@@ -11084,7 +12257,7 @@
         </w:tc>
         <w:tc>
           <w:tcPr>
-            <w:tcW w:w="0" w:type="auto"/>
+            <w:tcW w:w="2831" w:type="dxa"/>
             <w:hideMark/>
           </w:tcPr>
           <w:p>
@@ -11098,7 +12271,7 @@
         </w:tc>
         <w:tc>
           <w:tcPr>
-            <w:tcW w:w="0" w:type="auto"/>
+            <w:tcW w:w="2693" w:type="dxa"/>
             <w:hideMark/>
           </w:tcPr>
           <w:p>
@@ -11140,7 +12313,7 @@
         </w:tc>
         <w:tc>
           <w:tcPr>
-            <w:tcW w:w="0" w:type="auto"/>
+            <w:tcW w:w="2831" w:type="dxa"/>
             <w:hideMark/>
           </w:tcPr>
           <w:p>
@@ -11154,7 +12327,7 @@
         </w:tc>
         <w:tc>
           <w:tcPr>
-            <w:tcW w:w="0" w:type="auto"/>
+            <w:tcW w:w="2693" w:type="dxa"/>
             <w:hideMark/>
           </w:tcPr>
           <w:p>
@@ -11199,7 +12372,7 @@
         </w:tc>
         <w:tc>
           <w:tcPr>
-            <w:tcW w:w="0" w:type="auto"/>
+            <w:tcW w:w="2831" w:type="dxa"/>
             <w:hideMark/>
           </w:tcPr>
           <w:p>
@@ -11213,7 +12386,7 @@
         </w:tc>
         <w:tc>
           <w:tcPr>
-            <w:tcW w:w="0" w:type="auto"/>
+            <w:tcW w:w="2693" w:type="dxa"/>
             <w:hideMark/>
           </w:tcPr>
           <w:p>
@@ -11231,34 +12404,26 @@
       <w:pPr>
         <w:jc w:val="both"/>
         <w:rPr>
-          <w:rFonts w:ascii="Times New Roman" w:eastAsia="Times New Roman" w:hAnsi="Times New Roman" w:cs="Times New Roman"/>
+          <w:rFonts w:eastAsia="Times New Roman" w:cs="Times New Roman"/>
           <w:lang w:val="en-GB" w:eastAsia="en-GB"/>
         </w:rPr>
       </w:pPr>
+      <w:r>
+        <w:rPr>
+          <w:rFonts w:eastAsia="Times New Roman" w:cs="Times New Roman"/>
+          <w:lang w:val="en-GB" w:eastAsia="en-GB"/>
+        </w:rPr>
+        <w:lastRenderedPageBreak/>
+        <w:t>Labour is not considered as part of the expense for the student project; an organisational implementation will require accounting for labour associated with engineering and support.</w:t>
+      </w:r>
     </w:p>
     <w:p>
       <w:pPr>
         <w:jc w:val="both"/>
-        <w:rPr>
-          <w:rFonts w:ascii="Times New Roman" w:eastAsia="Times New Roman" w:hAnsi="Times New Roman" w:cs="Times New Roman"/>
-          <w:lang w:val="en-GB" w:eastAsia="en-GB"/>
-        </w:rPr>
-      </w:pPr>
-      <w:r>
-        <w:rPr>
-          <w:rFonts w:ascii="Times New Roman" w:eastAsia="Times New Roman" w:hAnsi="Times New Roman" w:cs="Times New Roman"/>
-          <w:lang w:val="en-GB" w:eastAsia="en-GB"/>
-        </w:rPr>
-        <w:t>Labour is not considered as part of the expense for the student project; an organisational implementation will require accounting for labour associated with engineering and support.</w:t>
-      </w:r>
-    </w:p>
-    <w:p>
-      <w:pPr>
-        <w:jc w:val="both"/>
-      </w:pPr>
-      <w:r>
-        <w:rPr>
-          <w:rFonts w:ascii="Times New Roman" w:eastAsia="Times New Roman" w:hAnsi="Times New Roman" w:cs="Times New Roman"/>
+      </w:pPr>
+      <w:r>
+        <w:rPr>
+          <w:rFonts w:eastAsia="Times New Roman" w:cs="Times New Roman"/>
           <w:lang w:val="en-GB" w:eastAsia="en-GB"/>
         </w:rPr>
         <w:t>The solution will have a number of cost advantages beyond its low cost to implement. For instance, the creation of a synthetic reusable testing environment can limit testing near production and make repeat testing of the connectors possible, while reducing risks of privacy incidents or unknown issues of interoperability. It might also help to decrease testing efforts with the addition of new connectors. But it is not possible to determine a reliable financial return on investment or break-even point, as there is no information about the costs related to testing or incidents in the available project data, labour rates or expected savings of the implementation – the invention of such a number would be inappropriate.</w:t>
@@ -11274,7 +12439,6 @@
         </w:rPr>
       </w:pPr>
       <w:r>
-        <w:lastRenderedPageBreak/>
         <w:t>5. Proof of Concept, and Evaluation</w:t>
       </w:r>
       <w:bookmarkEnd w:id="17"/>
@@ -11357,7 +12521,7 @@
       <w:r>
         <w:t xml:space="preserve">Attorney-General's Department. (n.d.). Document Verification Service (DVS). Australian Government. </w:t>
       </w:r>
-      <w:hyperlink r:id="rId13" w:history="1">
+      <w:hyperlink r:id="rId14" w:history="1">
         <w:r>
           <w:rPr>
             <w:rStyle w:val="Hyperlink"/>
@@ -11381,7 +12545,7 @@
       <w:r>
         <w:t xml:space="preserve">). </w:t>
       </w:r>
-      <w:hyperlink r:id="rId14" w:history="1">
+      <w:hyperlink r:id="rId15" w:history="1">
         <w:r>
           <w:rPr>
             <w:rStyle w:val="Hyperlink"/>
@@ -11405,7 +12569,7 @@
       <w:r>
         <w:t xml:space="preserve">). </w:t>
       </w:r>
-      <w:hyperlink r:id="rId15" w:history="1">
+      <w:hyperlink r:id="rId16" w:history="1">
         <w:r>
           <w:rPr>
             <w:rStyle w:val="Hyperlink"/>
@@ -11441,7 +12605,7 @@
         </w:rPr>
         <w:t xml:space="preserve">. Bonami Software. </w:t>
       </w:r>
-      <w:hyperlink r:id="rId16" w:history="1">
+      <w:hyperlink r:id="rId17" w:history="1">
         <w:r>
           <w:rPr>
             <w:rStyle w:val="Hyperlink"/>
@@ -11506,7 +12670,7 @@
         </w:rPr>
         <w:t xml:space="preserve">. </w:t>
       </w:r>
-      <w:hyperlink r:id="rId17" w:history="1">
+      <w:hyperlink r:id="rId18" w:history="1">
         <w:r>
           <w:rPr>
             <w:rStyle w:val="Hyperlink"/>
@@ -11560,15 +12724,25 @@
           <w:iCs/>
           <w:color w:val="000000"/>
         </w:rPr>
-        <w:t xml:space="preserve"> Resource Center</w:t>
-      </w:r>
-      <w:r>
-        <w:rPr>
+        <w:t xml:space="preserve"> Resource </w:t>
+      </w:r>
+      <w:proofErr w:type="spellStart"/>
+      <w:r>
+        <w:rPr>
+          <w:i/>
+          <w:iCs/>
           <w:color w:val="000000"/>
         </w:rPr>
+        <w:t>Center</w:t>
+      </w:r>
+      <w:proofErr w:type="spellEnd"/>
+      <w:r>
+        <w:rPr>
+          <w:color w:val="000000"/>
+        </w:rPr>
         <w:t xml:space="preserve">. Healthit.Gov. </w:t>
       </w:r>
-      <w:hyperlink r:id="rId18" w:history="1">
+      <w:hyperlink r:id="rId19" w:history="1">
         <w:r>
           <w:rPr>
             <w:rStyle w:val="Hyperlink"/>
@@ -11599,6 +12773,7 @@
           <w:iCs/>
           <w:color w:val="000000"/>
         </w:rPr>
+        <w:lastRenderedPageBreak/>
         <w:t>For practices - Halo Connect Documentation</w:t>
       </w:r>
       <w:r>
@@ -11642,7 +12817,7 @@
       <w:r>
         <w:t xml:space="preserve"> </w:t>
       </w:r>
-      <w:hyperlink r:id="rId19" w:history="1">
+      <w:hyperlink r:id="rId20" w:history="1">
         <w:r>
           <w:rPr>
             <w:rStyle w:val="Hyperlink"/>
@@ -11663,7 +12838,7 @@
       <w:r>
         <w:t xml:space="preserve">, J., Gulden, C., Kampf, M., Mate, S., Prokosch, H.-U., &amp; Zierk, J. (2021). A framework for criteria-based selection and processing of Fast Healthcare Interoperability Resources (FHIR) data for statistical analysis: Design and implementation study. JMIR Medical Informatics, 9(4), e25645. </w:t>
       </w:r>
-      <w:hyperlink r:id="rId20" w:history="1">
+      <w:hyperlink r:id="rId21" w:history="1">
         <w:r>
           <w:rPr>
             <w:rStyle w:val="Hyperlink"/>
@@ -11679,7 +12854,7 @@
       <w:r>
         <w:t xml:space="preserve">HL7 Australia. (n.d.). AU Core Implementation Guide (v1.0.0). HL7 International. </w:t>
       </w:r>
-      <w:hyperlink r:id="rId21" w:history="1">
+      <w:hyperlink r:id="rId22" w:history="1">
         <w:r>
           <w:rPr>
             <w:rStyle w:val="Hyperlink"/>
@@ -11693,10 +12868,9 @@
         <w:ind w:left="720" w:hanging="720"/>
       </w:pPr>
       <w:r>
-        <w:lastRenderedPageBreak/>
         <w:t xml:space="preserve">HL7 International. (2019). HL7 FHIR Release 4 (R4). </w:t>
       </w:r>
-      <w:hyperlink r:id="rId22" w:history="1">
+      <w:hyperlink r:id="rId23" w:history="1">
         <w:r>
           <w:rPr>
             <w:rStyle w:val="Hyperlink"/>
@@ -11754,7 +12928,7 @@
         </w:rPr>
         <w:t xml:space="preserve">. </w:t>
       </w:r>
-      <w:hyperlink r:id="rId23" w:history="1">
+      <w:hyperlink r:id="rId24" w:history="1">
         <w:r>
           <w:rPr>
             <w:rStyle w:val="Hyperlink"/>
@@ -11809,7 +12983,7 @@
         </w:rPr>
         <w:t xml:space="preserve">. </w:t>
       </w:r>
-      <w:hyperlink r:id="rId24" w:history="1">
+      <w:hyperlink r:id="rId25" w:history="1">
         <w:r>
           <w:rPr>
             <w:rStyle w:val="Hyperlink"/>
@@ -11839,7 +13013,7 @@
         </w:rPr>
         <w:t xml:space="preserve">. (2026). Knowledge Base. </w:t>
       </w:r>
-      <w:hyperlink r:id="rId25" w:history="1">
+      <w:hyperlink r:id="rId26" w:history="1">
         <w:r>
           <w:rPr>
             <w:rStyle w:val="Hyperlink"/>
@@ -11915,7 +13089,7 @@
       <w:r>
         <w:t xml:space="preserve">National Institute of Standards and Technology. (2024). The NIST Cybersecurity Framework (CSF) 2.0 (NIST CSWP 29). U.S. Department of Commerce. </w:t>
       </w:r>
-      <w:hyperlink r:id="rId26" w:history="1">
+      <w:hyperlink r:id="rId27" w:history="1">
         <w:r>
           <w:rPr>
             <w:rStyle w:val="Hyperlink"/>
@@ -11931,7 +13105,7 @@
       <w:r>
         <w:t xml:space="preserve">SMART Health IT. (n.d.). SMART App Launch Framework. HL7 International. </w:t>
       </w:r>
-      <w:hyperlink r:id="rId27" w:history="1">
+      <w:hyperlink r:id="rId28" w:history="1">
         <w:r>
           <w:rPr>
             <w:rStyle w:val="Hyperlink"/>
@@ -11961,7 +13135,7 @@
         </w:rPr>
         <w:t xml:space="preserve">. (n.d.). Docs.Smarthealthit.Org. Retrieved September 11, 2026, from </w:t>
       </w:r>
-      <w:hyperlink r:id="rId28" w:history="1">
+      <w:hyperlink r:id="rId29" w:history="1">
         <w:r>
           <w:rPr>
             <w:rStyle w:val="Hyperlink"/>
@@ -11992,7 +13166,7 @@
         </w:rPr>
         <w:t xml:space="preserve">. (2022). Digitalhealth.Gov.Au. </w:t>
       </w:r>
-      <w:hyperlink r:id="rId29" w:history="1">
+      <w:hyperlink r:id="rId30" w:history="1">
         <w:r>
           <w:rPr>
             <w:rStyle w:val="Hyperlink"/>
@@ -12043,6 +13217,7 @@
         <w:ind w:left="720" w:hanging="720"/>
       </w:pPr>
       <w:r>
+        <w:lastRenderedPageBreak/>
         <w:t xml:space="preserve">Walonoski, J., Kramer, M., Nichols, J., Quina, A., </w:t>
       </w:r>
       <w:proofErr w:type="spellStart"/>
@@ -12053,7 +13228,7 @@
       <w:r>
         <w:t xml:space="preserve">, C., Hall, D., Duffett, C., Dube, K., Gallagher, T., &amp; McLachlan, S. (2018). Synthea: An approach, method, and software mechanism for generating synthetic patients and the synthetic electronic health care record. Journal of the American Medical Informatics Association, 25(3), 230–238. </w:t>
       </w:r>
-      <w:hyperlink r:id="rId30" w:history="1">
+      <w:hyperlink r:id="rId31" w:history="1">
         <w:r>
           <w:rPr>
             <w:rStyle w:val="Hyperlink"/>
@@ -12088,7 +13263,7 @@
 </file>
 
 <file path=word/endnotes.xml><?xml version="1.0" encoding="utf-8"?>
-<w:endnotes xmlns:wpc="http://schemas.microsoft.com/office/word/2010/wordprocessingCanvas" xmlns:cx="http://schemas.microsoft.com/office/drawing/2014/chartex" xmlns:cx1="http://schemas.microsoft.com/office/drawing/2015/9/8/chartex" xmlns:cx2="http://schemas.microsoft.com/office/drawing/2015/10/21/chartex" xmlns:cx3="http://schemas.microsoft.com/office/drawing/2016/5/9/chartex" xmlns:cx4="http://schemas.microsoft.com/office/drawing/2016/5/10/chartex" xmlns:cx5="http://schemas.microsoft.com/office/drawing/2016/5/11/chartex" xmlns:cx6="http://schemas.microsoft.com/office/drawing/2016/5/12/chartex" xmlns:cx7="http://schemas.microsoft.com/office/drawing/2016/5/13/chartex" xmlns:cx8="http://schemas.microsoft.com/office/drawing/2016/5/14/chartex" xmlns:mc="http://schemas.openxmlformats.org/markup-compatibility/2006" xmlns:aink="http://schemas.microsoft.com/office/drawing/2016/ink" xmlns:am3d="http://schemas.microsoft.com/office/drawing/2017/model3d" xmlns:o="urn:schemas-microsoft-com:office:office" xmlns:oel="http://schemas.microsoft.com/office/2019/extlst" xmlns:r="http://schemas.openxmlformats.org/officeDocument/2006/relationships" xmlns:m="http://schemas.openxmlformats.org/officeDocument/2006/math" xmlns:v="urn:schemas-microsoft-com:vml" xmlns:wp14="http://schemas.microsoft.com/office/word/2010/wordprocessingDrawing" xmlns:wp="http://schemas.openxmlformats.org/drawingml/2006/wordprocessingDrawing" xmlns:w10="urn:schemas-microsoft-com:office:word" xmlns:w="http://schemas.openxmlformats.org/wordprocessingml/2006/main" xmlns:w14="http://schemas.microsoft.com/office/word/2010/wordml" xmlns:w15="http://schemas.microsoft.com/office/word/2012/wordml" xmlns:w16cex="http://schemas.microsoft.com/office/word/2018/wordml/cex" xmlns:w16cid="http://schemas.microsoft.com/office/word/2016/wordml/cid" xmlns:w16="http://schemas.microsoft.com/office/word/2018/wordml" xmlns:w16du="http://schemas.microsoft.com/office/word/2023/wordml/word16du" xmlns:w16sdtdh="http://schemas.microsoft.com/office/word/2020/wordml/sdtdatahash" xmlns:w16sdtfl="http://schemas.microsoft.com/office/word/2024/wordml/sdtformatlock" xmlns:w16se="http://schemas.microsoft.com/office/word/2015/wordml/symex" xmlns:wpg="http://schemas.microsoft.com/office/word/2010/wordprocessingGroup" xmlns:wpi="http://schemas.microsoft.com/office/word/2010/wordprocessingInk" xmlns:wne="http://schemas.microsoft.com/office/word/2006/wordml" xmlns:wps="http://schemas.microsoft.com/office/word/2010/wordprocessingShape" mc:Ignorable="w14 w15 w16se w16cid w16 w16cex w16sdtdh w16sdtfl w16du wp14">
+<w:endnotes xmlns:wpc="http://schemas.microsoft.com/office/word/2010/wordprocessingCanvas" xmlns:cx="http://schemas.microsoft.com/office/drawing/2014/chartex" xmlns:cx1="http://schemas.microsoft.com/office/drawing/2015/9/8/chartex" xmlns:cx2="http://schemas.microsoft.com/office/drawing/2015/10/21/chartex" xmlns:cx3="http://schemas.microsoft.com/office/drawing/2016/5/9/chartex" xmlns:cx4="http://schemas.microsoft.com/office/drawing/2016/5/10/chartex" xmlns:cx5="http://schemas.microsoft.com/office/drawing/2016/5/11/chartex" xmlns:cx6="http://schemas.microsoft.com/office/drawing/2016/5/12/chartex" xmlns:cx7="http://schemas.microsoft.com/office/drawing/2016/5/13/chartex" xmlns:cx8="http://schemas.microsoft.com/office/drawing/2016/5/14/chartex" xmlns:mc="http://schemas.openxmlformats.org/markup-compatibility/2006" xmlns:m="http://schemas.openxmlformats.org/officeDocument/2006/math" xmlns:aink="http://schemas.microsoft.com/office/drawing/2016/ink" xmlns:am3d="http://schemas.microsoft.com/office/drawing/2017/model3d" xmlns:oel="http://schemas.microsoft.com/office/2019/extlst" xmlns:r="http://schemas.openxmlformats.org/officeDocument/2006/relationships" xmlns:wp14="http://schemas.microsoft.com/office/word/2010/wordprocessingDrawing" xmlns:wp="http://schemas.openxmlformats.org/drawingml/2006/wordprocessingDrawing" xmlns:wpg="http://schemas.microsoft.com/office/word/2010/wordprocessingGroup" xmlns:wpi="http://schemas.microsoft.com/office/word/2010/wordprocessingInk" xmlns:wps="http://schemas.microsoft.com/office/word/2010/wordprocessingShape" xmlns:o="urn:schemas-microsoft-com:office:office" xmlns:v="urn:schemas-microsoft-com:vml" xmlns:w10="urn:schemas-microsoft-com:office:word" xmlns:w="http://schemas.openxmlformats.org/wordprocessingml/2006/main" xmlns:w14="http://schemas.microsoft.com/office/word/2010/wordml" xmlns:w15="http://schemas.microsoft.com/office/word/2012/wordml" xmlns:w16cex="http://schemas.microsoft.com/office/word/2018/wordml/cex" xmlns:w16cid="http://schemas.microsoft.com/office/word/2016/wordml/cid" xmlns:w16="http://schemas.microsoft.com/office/word/2018/wordml" xmlns:w16sdtdh="http://schemas.microsoft.com/office/word/2020/wordml/sdtdatahash" xmlns:w16sdtfl="http://schemas.microsoft.com/office/word/2024/wordml/sdtformatlock" xmlns:w16se="http://schemas.microsoft.com/office/word/2015/wordml/symex" xmlns:w16du="http://schemas.microsoft.com/office/word/2023/wordml/word16du" xmlns:wne="http://schemas.microsoft.com/office/word/2006/wordml" mc:Ignorable="w14 w15 w16se w16cid w16 w16cex w16sdtdh w16sdtfl w16du wp14">
   <w:endnote w:type="separator" w:id="-1">
     <w:p>
       <w:r>
@@ -12107,7 +13282,7 @@
 </file>
 
 <file path=word/footer1.xml><?xml version="1.0" encoding="utf-8"?>
-<w:ftr xmlns:wpc="http://schemas.microsoft.com/office/word/2010/wordprocessingCanvas" xmlns:cx="http://schemas.microsoft.com/office/drawing/2014/chartex" xmlns:cx1="http://schemas.microsoft.com/office/drawing/2015/9/8/chartex" xmlns:cx2="http://schemas.microsoft.com/office/drawing/2015/10/21/chartex" xmlns:cx3="http://schemas.microsoft.com/office/drawing/2016/5/9/chartex" xmlns:cx4="http://schemas.microsoft.com/office/drawing/2016/5/10/chartex" xmlns:cx5="http://schemas.microsoft.com/office/drawing/2016/5/11/chartex" xmlns:cx6="http://schemas.microsoft.com/office/drawing/2016/5/12/chartex" xmlns:cx7="http://schemas.microsoft.com/office/drawing/2016/5/13/chartex" xmlns:cx8="http://schemas.microsoft.com/office/drawing/2016/5/14/chartex" xmlns:mc="http://schemas.openxmlformats.org/markup-compatibility/2006" xmlns:aink="http://schemas.microsoft.com/office/drawing/2016/ink" xmlns:am3d="http://schemas.microsoft.com/office/drawing/2017/model3d" xmlns:o="urn:schemas-microsoft-com:office:office" xmlns:oel="http://schemas.microsoft.com/office/2019/extlst" xmlns:r="http://schemas.openxmlformats.org/officeDocument/2006/relationships" xmlns:m="http://schemas.openxmlformats.org/officeDocument/2006/math" xmlns:v="urn:schemas-microsoft-com:vml" xmlns:wp14="http://schemas.microsoft.com/office/word/2010/wordprocessingDrawing" xmlns:wp="http://schemas.openxmlformats.org/drawingml/2006/wordprocessingDrawing" xmlns:w10="urn:schemas-microsoft-com:office:word" xmlns:w="http://schemas.openxmlformats.org/wordprocessingml/2006/main" xmlns:w14="http://schemas.microsoft.com/office/word/2010/wordml" xmlns:w15="http://schemas.microsoft.com/office/word/2012/wordml" xmlns:w16cex="http://schemas.microsoft.com/office/word/2018/wordml/cex" xmlns:w16cid="http://schemas.microsoft.com/office/word/2016/wordml/cid" xmlns:w16="http://schemas.microsoft.com/office/word/2018/wordml" xmlns:w16du="http://schemas.microsoft.com/office/word/2023/wordml/word16du" xmlns:w16sdtdh="http://schemas.microsoft.com/office/word/2020/wordml/sdtdatahash" xmlns:w16sdtfl="http://schemas.microsoft.com/office/word/2024/wordml/sdtformatlock" xmlns:w16se="http://schemas.microsoft.com/office/word/2015/wordml/symex" xmlns:wpg="http://schemas.microsoft.com/office/word/2010/wordprocessingGroup" xmlns:wpi="http://schemas.microsoft.com/office/word/2010/wordprocessingInk" xmlns:wne="http://schemas.microsoft.com/office/word/2006/wordml" xmlns:wps="http://schemas.microsoft.com/office/word/2010/wordprocessingShape" mc:Ignorable="w14 w15 w16se w16cid w16 w16cex w16sdtdh w16sdtfl w16du wp14">
+<w:ftr xmlns:wpc="http://schemas.microsoft.com/office/word/2010/wordprocessingCanvas" xmlns:cx="http://schemas.microsoft.com/office/drawing/2014/chartex" xmlns:cx1="http://schemas.microsoft.com/office/drawing/2015/9/8/chartex" xmlns:cx2="http://schemas.microsoft.com/office/drawing/2015/10/21/chartex" xmlns:cx3="http://schemas.microsoft.com/office/drawing/2016/5/9/chartex" xmlns:cx4="http://schemas.microsoft.com/office/drawing/2016/5/10/chartex" xmlns:cx5="http://schemas.microsoft.com/office/drawing/2016/5/11/chartex" xmlns:cx6="http://schemas.microsoft.com/office/drawing/2016/5/12/chartex" xmlns:cx7="http://schemas.microsoft.com/office/drawing/2016/5/13/chartex" xmlns:cx8="http://schemas.microsoft.com/office/drawing/2016/5/14/chartex" xmlns:mc="http://schemas.openxmlformats.org/markup-compatibility/2006" xmlns:m="http://schemas.openxmlformats.org/officeDocument/2006/math" xmlns:aink="http://schemas.microsoft.com/office/drawing/2016/ink" xmlns:am3d="http://schemas.microsoft.com/office/drawing/2017/model3d" xmlns:oel="http://schemas.microsoft.com/office/2019/extlst" xmlns:r="http://schemas.openxmlformats.org/officeDocument/2006/relationships" xmlns:wp14="http://schemas.microsoft.com/office/word/2010/wordprocessingDrawing" xmlns:wp="http://schemas.openxmlformats.org/drawingml/2006/wordprocessingDrawing" xmlns:wpg="http://schemas.microsoft.com/office/word/2010/wordprocessingGroup" xmlns:wpi="http://schemas.microsoft.com/office/word/2010/wordprocessingInk" xmlns:wps="http://schemas.microsoft.com/office/word/2010/wordprocessingShape" xmlns:o="urn:schemas-microsoft-com:office:office" xmlns:v="urn:schemas-microsoft-com:vml" xmlns:w10="urn:schemas-microsoft-com:office:word" xmlns:w="http://schemas.openxmlformats.org/wordprocessingml/2006/main" xmlns:w14="http://schemas.microsoft.com/office/word/2010/wordml" xmlns:w15="http://schemas.microsoft.com/office/word/2012/wordml" xmlns:w16cex="http://schemas.microsoft.com/office/word/2018/wordml/cex" xmlns:w16cid="http://schemas.microsoft.com/office/word/2016/wordml/cid" xmlns:w16="http://schemas.microsoft.com/office/word/2018/wordml" xmlns:w16sdtdh="http://schemas.microsoft.com/office/word/2020/wordml/sdtdatahash" xmlns:w16sdtfl="http://schemas.microsoft.com/office/word/2024/wordml/sdtformatlock" xmlns:w16se="http://schemas.microsoft.com/office/word/2015/wordml/symex" xmlns:w16du="http://schemas.microsoft.com/office/word/2023/wordml/word16du" xmlns:wne="http://schemas.microsoft.com/office/word/2006/wordml" mc:Ignorable="w14 w15 w16se w16cid w16 w16cex w16sdtdh w16sdtfl w16du wp14">
   <w:p>
     <w:pPr>
       <w:pStyle w:val="Footer"/>
@@ -12122,7 +13297,7 @@
 </file>
 
 <file path=word/footnotes.xml><?xml version="1.0" encoding="utf-8"?>
-<w:footnotes xmlns:wpc="http://schemas.microsoft.com/office/word/2010/wordprocessingCanvas" xmlns:cx="http://schemas.microsoft.com/office/drawing/2014/chartex" xmlns:cx1="http://schemas.microsoft.com/office/drawing/2015/9/8/chartex" xmlns:cx2="http://schemas.microsoft.com/office/drawing/2015/10/21/chartex" xmlns:cx3="http://schemas.microsoft.com/office/drawing/2016/5/9/chartex" xmlns:cx4="http://schemas.microsoft.com/office/drawing/2016/5/10/chartex" xmlns:cx5="http://schemas.microsoft.com/office/drawing/2016/5/11/chartex" xmlns:cx6="http://schemas.microsoft.com/office/drawing/2016/5/12/chartex" xmlns:cx7="http://schemas.microsoft.com/office/drawing/2016/5/13/chartex" xmlns:cx8="http://schemas.microsoft.com/office/drawing/2016/5/14/chartex" xmlns:mc="http://schemas.openxmlformats.org/markup-compatibility/2006" xmlns:aink="http://schemas.microsoft.com/office/drawing/2016/ink" xmlns:am3d="http://schemas.microsoft.com/office/drawing/2017/model3d" xmlns:o="urn:schemas-microsoft-com:office:office" xmlns:oel="http://schemas.microsoft.com/office/2019/extlst" xmlns:r="http://schemas.openxmlformats.org/officeDocument/2006/relationships" xmlns:m="http://schemas.openxmlformats.org/officeDocument/2006/math" xmlns:v="urn:schemas-microsoft-com:vml" xmlns:wp14="http://schemas.microsoft.com/office/word/2010/wordprocessingDrawing" xmlns:wp="http://schemas.openxmlformats.org/drawingml/2006/wordprocessingDrawing" xmlns:w10="urn:schemas-microsoft-com:office:word" xmlns:w="http://schemas.openxmlformats.org/wordprocessingml/2006/main" xmlns:w14="http://schemas.microsoft.com/office/word/2010/wordml" xmlns:w15="http://schemas.microsoft.com/office/word/2012/wordml" xmlns:w16cex="http://schemas.microsoft.com/office/word/2018/wordml/cex" xmlns:w16cid="http://schemas.microsoft.com/office/word/2016/wordml/cid" xmlns:w16="http://schemas.microsoft.com/office/word/2018/wordml" xmlns:w16du="http://schemas.microsoft.com/office/word/2023/wordml/word16du" xmlns:w16sdtdh="http://schemas.microsoft.com/office/word/2020/wordml/sdtdatahash" xmlns:w16sdtfl="http://schemas.microsoft.com/office/word/2024/wordml/sdtformatlock" xmlns:w16se="http://schemas.microsoft.com/office/word/2015/wordml/symex" xmlns:wpg="http://schemas.microsoft.com/office/word/2010/wordprocessingGroup" xmlns:wpi="http://schemas.microsoft.com/office/word/2010/wordprocessingInk" xmlns:wne="http://schemas.microsoft.com/office/word/2006/wordml" xmlns:wps="http://schemas.microsoft.com/office/word/2010/wordprocessingShape" mc:Ignorable="w14 w15 w16se w16cid w16 w16cex w16sdtdh w16sdtfl w16du wp14">
+<w:footnotes xmlns:wpc="http://schemas.microsoft.com/office/word/2010/wordprocessingCanvas" xmlns:cx="http://schemas.microsoft.com/office/drawing/2014/chartex" xmlns:cx1="http://schemas.microsoft.com/office/drawing/2015/9/8/chartex" xmlns:cx2="http://schemas.microsoft.com/office/drawing/2015/10/21/chartex" xmlns:cx3="http://schemas.microsoft.com/office/drawing/2016/5/9/chartex" xmlns:cx4="http://schemas.microsoft.com/office/drawing/2016/5/10/chartex" xmlns:cx5="http://schemas.microsoft.com/office/drawing/2016/5/11/chartex" xmlns:cx6="http://schemas.microsoft.com/office/drawing/2016/5/12/chartex" xmlns:cx7="http://schemas.microsoft.com/office/drawing/2016/5/13/chartex" xmlns:cx8="http://schemas.microsoft.com/office/drawing/2016/5/14/chartex" xmlns:mc="http://schemas.openxmlformats.org/markup-compatibility/2006" xmlns:m="http://schemas.openxmlformats.org/officeDocument/2006/math" xmlns:aink="http://schemas.microsoft.com/office/drawing/2016/ink" xmlns:am3d="http://schemas.microsoft.com/office/drawing/2017/model3d" xmlns:oel="http://schemas.microsoft.com/office/2019/extlst" xmlns:r="http://schemas.openxmlformats.org/officeDocument/2006/relationships" xmlns:wp14="http://schemas.microsoft.com/office/word/2010/wordprocessingDrawing" xmlns:wp="http://schemas.openxmlformats.org/drawingml/2006/wordprocessingDrawing" xmlns:wpg="http://schemas.microsoft.com/office/word/2010/wordprocessingGroup" xmlns:wpi="http://schemas.microsoft.com/office/word/2010/wordprocessingInk" xmlns:wps="http://schemas.microsoft.com/office/word/2010/wordprocessingShape" xmlns:o="urn:schemas-microsoft-com:office:office" xmlns:v="urn:schemas-microsoft-com:vml" xmlns:w10="urn:schemas-microsoft-com:office:word" xmlns:w="http://schemas.openxmlformats.org/wordprocessingml/2006/main" xmlns:w14="http://schemas.microsoft.com/office/word/2010/wordml" xmlns:w15="http://schemas.microsoft.com/office/word/2012/wordml" xmlns:w16cex="http://schemas.microsoft.com/office/word/2018/wordml/cex" xmlns:w16cid="http://schemas.microsoft.com/office/word/2016/wordml/cid" xmlns:w16="http://schemas.microsoft.com/office/word/2018/wordml" xmlns:w16sdtdh="http://schemas.microsoft.com/office/word/2020/wordml/sdtdatahash" xmlns:w16sdtfl="http://schemas.microsoft.com/office/word/2024/wordml/sdtformatlock" xmlns:w16se="http://schemas.microsoft.com/office/word/2015/wordml/symex" xmlns:w16du="http://schemas.microsoft.com/office/word/2023/wordml/word16du" xmlns:wne="http://schemas.microsoft.com/office/word/2006/wordml" mc:Ignorable="w14 w15 w16se w16cid w16 w16cex w16sdtdh w16sdtfl w16du wp14">
   <w:footnote w:type="separator" w:id="-1">
     <w:p>
       <w:r>
@@ -12141,7 +13316,7 @@
 </file>
 
 <file path=word/numbering.xml><?xml version="1.0" encoding="utf-8"?>
-<w:numbering xmlns:wpc="http://schemas.microsoft.com/office/word/2010/wordprocessingCanvas" xmlns:cx="http://schemas.microsoft.com/office/drawing/2014/chartex" xmlns:cx1="http://schemas.microsoft.com/office/drawing/2015/9/8/chartex" xmlns:cx2="http://schemas.microsoft.com/office/drawing/2015/10/21/chartex" xmlns:cx3="http://schemas.microsoft.com/office/drawing/2016/5/9/chartex" xmlns:cx4="http://schemas.microsoft.com/office/drawing/2016/5/10/chartex" xmlns:cx5="http://schemas.microsoft.com/office/drawing/2016/5/11/chartex" xmlns:cx6="http://schemas.microsoft.com/office/drawing/2016/5/12/chartex" xmlns:cx7="http://schemas.microsoft.com/office/drawing/2016/5/13/chartex" xmlns:cx8="http://schemas.microsoft.com/office/drawing/2016/5/14/chartex" xmlns:mc="http://schemas.openxmlformats.org/markup-compatibility/2006" xmlns:aink="http://schemas.microsoft.com/office/drawing/2016/ink" xmlns:am3d="http://schemas.microsoft.com/office/drawing/2017/model3d" xmlns:o="urn:schemas-microsoft-com:office:office" xmlns:oel="http://schemas.microsoft.com/office/2019/extlst" xmlns:r="http://schemas.openxmlformats.org/officeDocument/2006/relationships" xmlns:m="http://schemas.openxmlformats.org/officeDocument/2006/math" xmlns:v="urn:schemas-microsoft-com:vml" xmlns:wp14="http://schemas.microsoft.com/office/word/2010/wordprocessingDrawing" xmlns:wp="http://schemas.openxmlformats.org/drawingml/2006/wordprocessingDrawing" xmlns:w10="urn:schemas-microsoft-com:office:word" xmlns:w="http://schemas.openxmlformats.org/wordprocessingml/2006/main" xmlns:w14="http://schemas.microsoft.com/office/word/2010/wordml" xmlns:w15="http://schemas.microsoft.com/office/word/2012/wordml" xmlns:w16cex="http://schemas.microsoft.com/office/word/2018/wordml/cex" xmlns:w16cid="http://schemas.microsoft.com/office/word/2016/wordml/cid" xmlns:w16="http://schemas.microsoft.com/office/word/2018/wordml" xmlns:w16du="http://schemas.microsoft.com/office/word/2023/wordml/word16du" xmlns:w16sdtdh="http://schemas.microsoft.com/office/word/2020/wordml/sdtdatahash" xmlns:w16sdtfl="http://schemas.microsoft.com/office/word/2024/wordml/sdtformatlock" xmlns:w16se="http://schemas.microsoft.com/office/word/2015/wordml/symex" xmlns:wpg="http://schemas.microsoft.com/office/word/2010/wordprocessingGroup" xmlns:wpi="http://schemas.microsoft.com/office/word/2010/wordprocessingInk" xmlns:wne="http://schemas.microsoft.com/office/word/2006/wordml" xmlns:wps="http://schemas.microsoft.com/office/word/2010/wordprocessingShape" mc:Ignorable="w14 w15 w16se w16cid w16 w16cex w16sdtdh w16sdtfl w16du wp14">
+<w:numbering xmlns:wpc="http://schemas.microsoft.com/office/word/2010/wordprocessingCanvas" xmlns:cx="http://schemas.microsoft.com/office/drawing/2014/chartex" xmlns:cx1="http://schemas.microsoft.com/office/drawing/2015/9/8/chartex" xmlns:cx2="http://schemas.microsoft.com/office/drawing/2015/10/21/chartex" xmlns:cx3="http://schemas.microsoft.com/office/drawing/2016/5/9/chartex" xmlns:cx4="http://schemas.microsoft.com/office/drawing/2016/5/10/chartex" xmlns:cx5="http://schemas.microsoft.com/office/drawing/2016/5/11/chartex" xmlns:cx6="http://schemas.microsoft.com/office/drawing/2016/5/12/chartex" xmlns:cx7="http://schemas.microsoft.com/office/drawing/2016/5/13/chartex" xmlns:cx8="http://schemas.microsoft.com/office/drawing/2016/5/14/chartex" xmlns:mc="http://schemas.openxmlformats.org/markup-compatibility/2006" xmlns:m="http://schemas.openxmlformats.org/officeDocument/2006/math" xmlns:aink="http://schemas.microsoft.com/office/drawing/2016/ink" xmlns:am3d="http://schemas.microsoft.com/office/drawing/2017/model3d" xmlns:oel="http://schemas.microsoft.com/office/2019/extlst" xmlns:r="http://schemas.openxmlformats.org/officeDocument/2006/relationships" xmlns:wp14="http://schemas.microsoft.com/office/word/2010/wordprocessingDrawing" xmlns:wp="http://schemas.openxmlformats.org/drawingml/2006/wordprocessingDrawing" xmlns:wpg="http://schemas.microsoft.com/office/word/2010/wordprocessingGroup" xmlns:wpi="http://schemas.microsoft.com/office/word/2010/wordprocessingInk" xmlns:wps="http://schemas.microsoft.com/office/word/2010/wordprocessingShape" xmlns:o="urn:schemas-microsoft-com:office:office" xmlns:v="urn:schemas-microsoft-com:vml" xmlns:w10="urn:schemas-microsoft-com:office:word" xmlns:w="http://schemas.openxmlformats.org/wordprocessingml/2006/main" xmlns:w14="http://schemas.microsoft.com/office/word/2010/wordml" xmlns:w15="http://schemas.microsoft.com/office/word/2012/wordml" xmlns:w16cex="http://schemas.microsoft.com/office/word/2018/wordml/cex" xmlns:w16cid="http://schemas.microsoft.com/office/word/2016/wordml/cid" xmlns:w16="http://schemas.microsoft.com/office/word/2018/wordml" xmlns:w16sdtdh="http://schemas.microsoft.com/office/word/2020/wordml/sdtdatahash" xmlns:w16sdtfl="http://schemas.microsoft.com/office/word/2024/wordml/sdtformatlock" xmlns:w16se="http://schemas.microsoft.com/office/word/2015/wordml/symex" xmlns:w16du="http://schemas.microsoft.com/office/word/2023/wordml/word16du" xmlns:wne="http://schemas.microsoft.com/office/word/2006/wordml" mc:Ignorable="w14 w15 w16se w16cid w16 w16cex w16sdtdh w16sdtfl w16du wp14">
   <w:abstractNum w:abstractNumId="0" w15:restartNumberingAfterBreak="0">
     <w:nsid w:val="01E30731"/>
     <w:multiLevelType w:val="hybridMultilevel"/>
@@ -14976,7 +16151,7 @@
 </file>
 
 <file path=word/styles.xml><?xml version="1.0" encoding="utf-8"?>
-<w:styles xmlns:mc="http://schemas.openxmlformats.org/markup-compatibility/2006" xmlns:r="http://schemas.openxmlformats.org/officeDocument/2006/relationships" xmlns:w="http://schemas.openxmlformats.org/wordprocessingml/2006/main" xmlns:w14="http://schemas.microsoft.com/office/word/2010/wordml" xmlns:w15="http://schemas.microsoft.com/office/word/2012/wordml" xmlns:w16cex="http://schemas.microsoft.com/office/word/2018/wordml/cex" xmlns:w16cid="http://schemas.microsoft.com/office/word/2016/wordml/cid" xmlns:w16="http://schemas.microsoft.com/office/word/2018/wordml" xmlns:w16du="http://schemas.microsoft.com/office/word/2023/wordml/word16du" xmlns:w16sdtdh="http://schemas.microsoft.com/office/word/2020/wordml/sdtdatahash" xmlns:w16sdtfl="http://schemas.microsoft.com/office/word/2024/wordml/sdtformatlock" xmlns:w16se="http://schemas.microsoft.com/office/word/2015/wordml/symex" mc:Ignorable="w14 w15 w16se w16cid w16 w16cex w16sdtdh w16sdtfl w16du">
+<w:styles xmlns:mc="http://schemas.openxmlformats.org/markup-compatibility/2006" xmlns:r="http://schemas.openxmlformats.org/officeDocument/2006/relationships" xmlns:w="http://schemas.openxmlformats.org/wordprocessingml/2006/main" xmlns:w14="http://schemas.microsoft.com/office/word/2010/wordml" xmlns:w15="http://schemas.microsoft.com/office/word/2012/wordml" xmlns:w16cex="http://schemas.microsoft.com/office/word/2018/wordml/cex" xmlns:w16cid="http://schemas.microsoft.com/office/word/2016/wordml/cid" xmlns:w16="http://schemas.microsoft.com/office/word/2018/wordml" xmlns:w16sdtdh="http://schemas.microsoft.com/office/word/2020/wordml/sdtdatahash" xmlns:w16sdtfl="http://schemas.microsoft.com/office/word/2024/wordml/sdtformatlock" xmlns:w16se="http://schemas.microsoft.com/office/word/2015/wordml/symex" xmlns:w16du="http://schemas.microsoft.com/office/word/2023/wordml/word16du" mc:Ignorable="w14 w15 w16se w16cid w16 w16cex w16sdtdh w16sdtfl w16du">
   <w:docDefaults>
     <w:rPrDefault>
       <w:rPr>
@@ -15375,7 +16550,11 @@
   <w:style w:type="paragraph" w:default="1" w:styleId="Normal">
     <w:name w:val="Normal"/>
     <w:qFormat/>
-    <w:rsid w:val="000F16A6"/>
+    <w:rsid w:val="009A43F4"/>
+    <w:rPr>
+      <w:rFonts w:ascii="Times New Roman" w:hAnsi="Times New Roman"/>
+      <w:sz w:val="24"/>
+    </w:rPr>
   </w:style>
   <w:style w:type="paragraph" w:styleId="Heading1">
     <w:name w:val="heading 1"/>
@@ -15579,7 +16758,6 @@
   <w:style w:type="character" w:default="1" w:styleId="DefaultParagraphFont">
     <w:name w:val="Default Paragraph Font"/>
     <w:uiPriority w:val="1"/>
-    <w:semiHidden/>
     <w:unhideWhenUsed/>
   </w:style>
   <w:style w:type="table" w:default="1" w:styleId="TableNormal">
@@ -16709,9 +17887,8 @@
       <w:spacing w:before="100" w:beforeAutospacing="1" w:after="100" w:afterAutospacing="1" w:line="240" w:lineRule="auto"/>
     </w:pPr>
     <w:rPr>
-      <w:rFonts w:ascii="Times New Roman" w:eastAsia="Times New Roman" w:hAnsi="Times New Roman" w:cs="Times New Roman"/>
+      <w:rFonts w:eastAsia="Times New Roman" w:cs="Times New Roman"/>
       <w:kern w:val="0"/>
-      <w:sz w:val="24"/>
       <w:szCs w:val="24"/>
       <w:lang w:val="en-GB" w:eastAsia="en-GB"/>
       <w14:ligatures w14:val="none"/>
@@ -16728,6 +17905,16 @@
       <w:color w:val="96607D" w:themeColor="followedHyperlink"/>
       <w:u w:val="single"/>
     </w:rPr>
+  </w:style>
+  <w:style w:type="paragraph" w:styleId="Revision">
+    <w:name w:val="Revision"/>
+    <w:hidden/>
+    <w:uiPriority w:val="99"/>
+    <w:semiHidden/>
+    <w:rsid w:val="009A43F4"/>
+    <w:pPr>
+      <w:spacing w:after="0" w:line="240" w:lineRule="auto"/>
+    </w:pPr>
   </w:style>
 </w:styles>
 </file>

</xml_diff>